<commit_message>
:pencil2: Añadiendo puntos 3 y 4
</commit_message>
<xml_diff>
--- a/DOC_FINAL/DOCUMENTACION_FINAL.docx
+++ b/DOC_FINAL/DOCUMENTACION_FINAL.docx
@@ -4413,6 +4413,8 @@
         </w:sectPr>
       </w:pPr>
     </w:p>
+    <w:bookmarkStart w:id="1" w:name="_Toc228737340"/>
+    <w:bookmarkStart w:id="2" w:name="_Toc229479460"/>
     <w:p>
       <w:pPr>
         <w:pStyle w:val="Ttulo0"/>
@@ -4427,8 +4429,6 @@
           <w:color w:val="FFFFFF" w:themeColor="background1"/>
         </w:rPr>
       </w:pPr>
-      <w:bookmarkStart w:id="1" w:name="_Toc229479460"/>
-      <w:bookmarkStart w:id="2" w:name="_Toc228737340"/>
       <w:r>
         <w:rPr>
           <w:noProof/>
@@ -4516,15 +4516,15 @@
           </mc:Fallback>
         </mc:AlternateContent>
       </w:r>
+      <w:bookmarkEnd w:id="1"/>
+      <w:r>
+        <w:rPr>
+          <w:rFonts w:ascii="Aptos" w:hAnsi="Aptos"/>
+          <w:color w:val="FFFFFF" w:themeColor="background1"/>
+        </w:rPr>
+        <w:t>Resumen Ejecutivo</w:t>
+      </w:r>
       <w:bookmarkEnd w:id="2"/>
-      <w:r>
-        <w:rPr>
-          <w:rFonts w:ascii="Aptos" w:hAnsi="Aptos"/>
-          <w:color w:val="FFFFFF" w:themeColor="background1"/>
-        </w:rPr>
-        <w:t>Resumen Ejecutivo</w:t>
-      </w:r>
-      <w:bookmarkEnd w:id="1"/>
     </w:p>
     <w:p>
       <w:pPr>
@@ -4634,6 +4634,9 @@
     <w:p>
       <w:pPr>
         <w:ind w:left="360"/>
+        <w:rPr>
+          <w:lang w:val="es-MX"/>
+        </w:rPr>
       </w:pPr>
     </w:p>
     <w:p>
@@ -4689,6 +4692,9 @@
     <w:p>
       <w:pPr>
         <w:ind w:left="360"/>
+        <w:rPr>
+          <w:lang w:val="es-MX"/>
+        </w:rPr>
       </w:pPr>
     </w:p>
     <w:p>
@@ -5078,15 +5084,7 @@
           <w:bCs/>
           <w:lang w:val="es-MX" w:eastAsia="zh-CN"/>
         </w:rPr>
-        <w:t>Lo que incluye el proyecto</w:t>
-      </w:r>
-      <w:r>
-        <w:rPr>
-          <w:b/>
-          <w:bCs/>
-          <w:lang w:val="es-MX" w:eastAsia="zh-CN"/>
-        </w:rPr>
-        <w:t>:</w:t>
+        <w:t>Lo que incluye el proyecto:</w:t>
       </w:r>
     </w:p>
     <w:p>
@@ -5734,15 +5732,116 @@
         <w:ind w:left="360"/>
         <w:jc w:val="both"/>
         <w:rPr>
-          <w:rFonts w:ascii="Aptos" w:hAnsi="Aptos"/>
-          <w:lang w:val="es-MX"/>
-        </w:rPr>
-      </w:pPr>
-      <w:r>
-        <w:rPr>
           <w:lang w:val="es-MX" w:eastAsia="zh-CN"/>
         </w:rPr>
-        <w:t>..</w:t>
+      </w:pPr>
+      <w:r>
+        <w:rPr>
+          <w:b/>
+          <w:bCs/>
+          <w:lang w:val="es-MX" w:eastAsia="zh-CN"/>
+        </w:rPr>
+        <w:t>Plan Reforma:</w:t>
+      </w:r>
+      <w:r>
+        <w:rPr>
+          <w:lang w:val="es-MX" w:eastAsia="zh-CN"/>
+        </w:rPr>
+        <w:t xml:space="preserve"> Directorio de arquitectos y decoradores con un diseño simple. En las múltiples búsquedas realizadas no arrojó resultados para Aguascalientes. Es un buscador, no un portafolio individual.</w:t>
+      </w:r>
+    </w:p>
+    <w:p>
+      <w:pPr>
+        <w:ind w:left="360"/>
+        <w:jc w:val="both"/>
+        <w:rPr>
+          <w:lang w:val="es-MX" w:eastAsia="zh-CN"/>
+        </w:rPr>
+      </w:pPr>
+    </w:p>
+    <w:p>
+      <w:pPr>
+        <w:ind w:left="360"/>
+        <w:jc w:val="both"/>
+        <w:rPr>
+          <w:lang w:val="es-MX" w:eastAsia="zh-CN"/>
+        </w:rPr>
+      </w:pPr>
+      <w:r>
+        <w:rPr>
+          <w:b/>
+          <w:bCs/>
+          <w:lang w:val="es-MX" w:eastAsia="zh-CN"/>
+        </w:rPr>
+        <w:t>La Construcción Aguascalientes:</w:t>
+      </w:r>
+      <w:r>
+        <w:rPr>
+          <w:lang w:val="es-MX" w:eastAsia="zh-CN"/>
+        </w:rPr>
+        <w:t xml:space="preserve"> Catálogo de arquitectos que al seleccionar un profesional solo muestra información de contacto y calificación, pero ninguna muestra de su trabajo.</w:t>
+      </w:r>
+    </w:p>
+    <w:p>
+      <w:pPr>
+        <w:ind w:left="360"/>
+        <w:jc w:val="both"/>
+        <w:rPr>
+          <w:b/>
+          <w:bCs/>
+          <w:lang w:val="es-MX" w:eastAsia="zh-CN"/>
+        </w:rPr>
+      </w:pPr>
+    </w:p>
+    <w:p>
+      <w:pPr>
+        <w:ind w:left="360"/>
+        <w:jc w:val="both"/>
+        <w:rPr>
+          <w:lang w:val="es-MX" w:eastAsia="zh-CN"/>
+        </w:rPr>
+      </w:pPr>
+      <w:r>
+        <w:rPr>
+          <w:b/>
+          <w:bCs/>
+          <w:lang w:val="es-MX" w:eastAsia="zh-CN"/>
+        </w:rPr>
+        <w:t>STVX Arquitectos:</w:t>
+      </w:r>
+      <w:r>
+        <w:rPr>
+          <w:lang w:val="es-MX" w:eastAsia="zh-CN"/>
+        </w:rPr>
+        <w:t xml:space="preserve"> Página que muestra proyectos </w:t>
+      </w:r>
+      <w:proofErr w:type="gramStart"/>
+      <w:r>
+        <w:rPr>
+          <w:lang w:val="es-MX" w:eastAsia="zh-CN"/>
+        </w:rPr>
+        <w:t>arquitectónicos</w:t>
+      </w:r>
+      <w:proofErr w:type="gramEnd"/>
+      <w:r>
+        <w:rPr>
+          <w:lang w:val="es-MX" w:eastAsia="zh-CN"/>
+        </w:rPr>
+        <w:t xml:space="preserve"> pero no identifica al arquitecto que los realizó ni ofrece su contacto directo. Es más cercana a lo </w:t>
+      </w:r>
+      <w:proofErr w:type="gramStart"/>
+      <w:r>
+        <w:rPr>
+          <w:lang w:val="es-MX" w:eastAsia="zh-CN"/>
+        </w:rPr>
+        <w:t>propuesto</w:t>
+      </w:r>
+      <w:proofErr w:type="gramEnd"/>
+      <w:r>
+        <w:rPr>
+          <w:lang w:val="es-MX" w:eastAsia="zh-CN"/>
+        </w:rPr>
+        <w:t xml:space="preserve"> pero sigue sin ser un portafolio individual.</w:t>
       </w:r>
     </w:p>
     <w:p>
@@ -5779,6 +5878,7 @@
     <w:p>
       <w:pPr>
         <w:ind w:left="360"/>
+        <w:jc w:val="both"/>
         <w:rPr>
           <w:lang w:val="es-MX" w:eastAsia="zh-CN"/>
         </w:rPr>
@@ -5787,8 +5887,24 @@
         <w:rPr>
           <w:lang w:val="es-MX" w:eastAsia="zh-CN"/>
         </w:rPr>
-        <w:t>--</w:t>
-      </w:r>
+        <w:t>Todos los productos encontrados en el mercado local son catálogos de arquitectos sin muestras de trabajo, lo que representa una gran oportunidad para el proyecto. El desarrollo de un portafolio digital individual con exhibición optimizada de renders 3D permite al arquitecto diferenciarse significativamente de la competencia, proyectar una imagen profesional sólida y ampliar su alcance más allá de las recomendaciones personales.</w:t>
+      </w:r>
+    </w:p>
+    <w:p>
+      <w:pPr>
+        <w:ind w:left="360"/>
+        <w:rPr>
+          <w:lang w:val="es-MX" w:eastAsia="zh-CN"/>
+        </w:rPr>
+      </w:pPr>
+    </w:p>
+    <w:p>
+      <w:pPr>
+        <w:ind w:left="360"/>
+        <w:rPr>
+          <w:lang w:val="es-MX" w:eastAsia="zh-CN"/>
+        </w:rPr>
+      </w:pPr>
     </w:p>
     <w:p>
       <w:pPr>
@@ -5943,7 +6059,63 @@
           <w:rFonts w:ascii="Aptos" w:hAnsi="Aptos"/>
           <w:lang w:val="es-MX"/>
         </w:rPr>
-        <w:t>…</w:t>
+        <w:t xml:space="preserve">El proyecto se considera técnicamente factible. Se utilizarán tecnologías web estándar (HTML, CSS, JavaScript </w:t>
+      </w:r>
+      <w:proofErr w:type="spellStart"/>
+      <w:r>
+        <w:rPr>
+          <w:rFonts w:ascii="Aptos" w:hAnsi="Aptos"/>
+          <w:lang w:val="es-MX"/>
+        </w:rPr>
+        <w:t>vanilla</w:t>
+      </w:r>
+      <w:proofErr w:type="spellEnd"/>
+      <w:r>
+        <w:rPr>
+          <w:rFonts w:ascii="Aptos" w:hAnsi="Aptos"/>
+          <w:lang w:val="es-MX"/>
+        </w:rPr>
+        <w:t xml:space="preserve">) que son ampliamente accesibles y bien documentadas. El equipo de desarrollo cuenta con las competencias requeridas como estudiantes de Ingeniería en Computación Inteligente. Las herramientas de desarrollo son gratuitas (Visual Studio Code, </w:t>
+      </w:r>
+      <w:r>
+        <w:rPr>
+          <w:rFonts w:ascii="Aptos" w:hAnsi="Aptos"/>
+          <w:lang w:val="es-MX"/>
+        </w:rPr>
+        <w:lastRenderedPageBreak/>
+        <w:t xml:space="preserve">GitHub). El sistema será desplegado en un Hostinger VPS utilizando </w:t>
+      </w:r>
+      <w:proofErr w:type="spellStart"/>
+      <w:r>
+        <w:rPr>
+          <w:rFonts w:ascii="Aptos" w:hAnsi="Aptos"/>
+          <w:lang w:val="es-MX"/>
+        </w:rPr>
+        <w:t>Nginx</w:t>
+      </w:r>
+      <w:proofErr w:type="spellEnd"/>
+      <w:r>
+        <w:rPr>
+          <w:rFonts w:ascii="Aptos" w:hAnsi="Aptos"/>
+          <w:lang w:val="es-MX"/>
+        </w:rPr>
+        <w:t xml:space="preserve"> y Flask + </w:t>
+      </w:r>
+      <w:proofErr w:type="spellStart"/>
+      <w:r>
+        <w:rPr>
+          <w:rFonts w:ascii="Aptos" w:hAnsi="Aptos"/>
+          <w:lang w:val="es-MX"/>
+        </w:rPr>
+        <w:t>Gunicorn</w:t>
+      </w:r>
+      <w:proofErr w:type="spellEnd"/>
+      <w:r>
+        <w:rPr>
+          <w:rFonts w:ascii="Aptos" w:hAnsi="Aptos"/>
+          <w:lang w:val="es-MX"/>
+        </w:rPr>
+        <w:t xml:space="preserve"> para servir los archivos estáticos, lo que ofrece rendimiento estable y capacidad de escalar. El diseño responsivo garantiza compatibilidad multiplataforma. Al tratarse de un sitio informativo sin datos sensibles, los requerimientos de seguridad se cubren con configuraciones estándar de hosting y certificados SSL.</w:t>
       </w:r>
     </w:p>
     <w:p>
@@ -5977,6 +6149,1354 @@
       </w:r>
       <w:bookmarkEnd w:id="18"/>
     </w:p>
+    <w:tbl>
+      <w:tblPr>
+        <w:tblW w:w="6794" w:type="dxa"/>
+        <w:jc w:val="center"/>
+        <w:tblCellMar>
+          <w:top w:w="68" w:type="dxa"/>
+          <w:left w:w="70" w:type="dxa"/>
+          <w:bottom w:w="68" w:type="dxa"/>
+          <w:right w:w="70" w:type="dxa"/>
+        </w:tblCellMar>
+        <w:tblLook w:val="04A0" w:firstRow="1" w:lastRow="0" w:firstColumn="1" w:lastColumn="0" w:noHBand="0" w:noVBand="1"/>
+      </w:tblPr>
+      <w:tblGrid>
+        <w:gridCol w:w="4952"/>
+        <w:gridCol w:w="1842"/>
+      </w:tblGrid>
+      <w:tr>
+        <w:trPr>
+          <w:trHeight w:val="596"/>
+          <w:jc w:val="center"/>
+        </w:trPr>
+        <w:tc>
+          <w:tcPr>
+            <w:tcW w:w="4952" w:type="dxa"/>
+            <w:tcBorders>
+              <w:top w:val="single" w:sz="8" w:space="0" w:color="BFBFBF"/>
+              <w:left w:val="single" w:sz="8" w:space="0" w:color="BFBFBF"/>
+              <w:bottom w:val="single" w:sz="8" w:space="0" w:color="BFBFBF"/>
+              <w:right w:val="single" w:sz="8" w:space="0" w:color="BFBFBF"/>
+            </w:tcBorders>
+            <w:shd w:val="clear" w:color="000000" w:fill="262626"/>
+            <w:vAlign w:val="center"/>
+            <w:hideMark/>
+          </w:tcPr>
+          <w:p>
+            <w:pPr>
+              <w:spacing w:line="240" w:lineRule="auto"/>
+              <w:jc w:val="center"/>
+              <w:rPr>
+                <w:rFonts w:eastAsia="Times New Roman"/>
+                <w:b/>
+                <w:bCs/>
+                <w:color w:val="FFFFFF"/>
+                <w:lang w:val="es-MX"/>
+              </w:rPr>
+            </w:pPr>
+            <w:r>
+              <w:rPr>
+                <w:rFonts w:eastAsia="Times New Roman"/>
+                <w:b/>
+                <w:bCs/>
+                <w:lang w:val="es-MX" w:eastAsia="zh-CN"/>
+              </w:rPr>
+              <w:t>Concepto</w:t>
+            </w:r>
+          </w:p>
+        </w:tc>
+        <w:tc>
+          <w:tcPr>
+            <w:tcW w:w="1842" w:type="dxa"/>
+            <w:tcBorders>
+              <w:top w:val="single" w:sz="8" w:space="0" w:color="BFBFBF"/>
+              <w:left w:val="nil"/>
+              <w:bottom w:val="single" w:sz="8" w:space="0" w:color="BFBFBF"/>
+              <w:right w:val="single" w:sz="8" w:space="0" w:color="BFBFBF"/>
+            </w:tcBorders>
+            <w:shd w:val="clear" w:color="000000" w:fill="262626"/>
+            <w:vAlign w:val="center"/>
+            <w:hideMark/>
+          </w:tcPr>
+          <w:p>
+            <w:pPr>
+              <w:spacing w:line="240" w:lineRule="auto"/>
+              <w:jc w:val="center"/>
+              <w:rPr>
+                <w:rFonts w:eastAsia="Times New Roman"/>
+                <w:b/>
+                <w:bCs/>
+                <w:color w:val="FFFFFF"/>
+                <w:lang w:val="es-MX"/>
+              </w:rPr>
+            </w:pPr>
+            <w:r>
+              <w:rPr>
+                <w:rFonts w:eastAsia="Times New Roman"/>
+                <w:b/>
+                <w:bCs/>
+                <w:lang w:val="es-MX" w:eastAsia="zh-CN"/>
+              </w:rPr>
+              <w:t>Monto (MXN)</w:t>
+            </w:r>
+          </w:p>
+        </w:tc>
+      </w:tr>
+      <w:tr>
+        <w:trPr>
+          <w:trHeight w:val="20"/>
+          <w:jc w:val="center"/>
+        </w:trPr>
+        <w:tc>
+          <w:tcPr>
+            <w:tcW w:w="6794" w:type="dxa"/>
+            <w:gridSpan w:val="2"/>
+            <w:tcBorders>
+              <w:top w:val="nil"/>
+              <w:left w:val="single" w:sz="8" w:space="0" w:color="BFBFBF"/>
+              <w:bottom w:val="single" w:sz="8" w:space="0" w:color="BFBFBF"/>
+              <w:right w:val="single" w:sz="8" w:space="0" w:color="BFBFBF"/>
+            </w:tcBorders>
+            <w:shd w:val="clear" w:color="000000" w:fill="D9D9D9"/>
+            <w:vAlign w:val="center"/>
+            <w:hideMark/>
+          </w:tcPr>
+          <w:p>
+            <w:pPr>
+              <w:spacing w:line="240" w:lineRule="auto"/>
+              <w:jc w:val="both"/>
+              <w:rPr>
+                <w:rFonts w:eastAsia="Times New Roman"/>
+                <w:b/>
+                <w:bCs/>
+                <w:color w:val="000000"/>
+                <w:lang w:val="es-MX"/>
+              </w:rPr>
+            </w:pPr>
+            <w:r>
+              <w:rPr>
+                <w:rFonts w:eastAsia="Times New Roman"/>
+                <w:b/>
+                <w:bCs/>
+                <w:lang w:val="es-MX" w:eastAsia="zh-CN"/>
+              </w:rPr>
+              <w:t>Costos Iniciales de Inversión</w:t>
+            </w:r>
+          </w:p>
+        </w:tc>
+      </w:tr>
+      <w:tr>
+        <w:trPr>
+          <w:trHeight w:val="20"/>
+          <w:jc w:val="center"/>
+        </w:trPr>
+        <w:tc>
+          <w:tcPr>
+            <w:tcW w:w="4952" w:type="dxa"/>
+            <w:tcBorders>
+              <w:top w:val="nil"/>
+              <w:left w:val="single" w:sz="8" w:space="0" w:color="BFBFBF"/>
+              <w:bottom w:val="single" w:sz="8" w:space="0" w:color="BFBFBF"/>
+              <w:right w:val="single" w:sz="8" w:space="0" w:color="BFBFBF"/>
+            </w:tcBorders>
+            <w:vAlign w:val="center"/>
+            <w:hideMark/>
+          </w:tcPr>
+          <w:p>
+            <w:pPr>
+              <w:spacing w:line="240" w:lineRule="auto"/>
+              <w:jc w:val="both"/>
+              <w:rPr>
+                <w:rFonts w:eastAsia="Times New Roman"/>
+                <w:color w:val="000000"/>
+                <w:lang w:val="es-MX"/>
+              </w:rPr>
+            </w:pPr>
+            <w:r>
+              <w:rPr>
+                <w:rFonts w:eastAsia="Times New Roman"/>
+                <w:color w:val="000000"/>
+                <w:lang w:val="es-MX" w:eastAsia="zh-CN"/>
+              </w:rPr>
+              <w:t>Servidor / Hosting (primer año)</w:t>
+            </w:r>
+          </w:p>
+        </w:tc>
+        <w:tc>
+          <w:tcPr>
+            <w:tcW w:w="1842" w:type="dxa"/>
+            <w:tcBorders>
+              <w:top w:val="nil"/>
+              <w:left w:val="nil"/>
+              <w:bottom w:val="single" w:sz="8" w:space="0" w:color="BFBFBF"/>
+              <w:right w:val="single" w:sz="8" w:space="0" w:color="BFBFBF"/>
+            </w:tcBorders>
+            <w:vAlign w:val="center"/>
+            <w:hideMark/>
+          </w:tcPr>
+          <w:p>
+            <w:pPr>
+              <w:spacing w:line="240" w:lineRule="auto"/>
+              <w:jc w:val="both"/>
+              <w:rPr>
+                <w:rFonts w:eastAsia="Times New Roman"/>
+                <w:color w:val="000000"/>
+                <w:lang w:val="es-MX"/>
+              </w:rPr>
+            </w:pPr>
+            <w:r>
+              <w:rPr>
+                <w:rFonts w:eastAsia="Times New Roman"/>
+                <w:color w:val="000000"/>
+                <w:lang w:val="es-MX" w:eastAsia="zh-CN"/>
+              </w:rPr>
+              <w:t>$1,000</w:t>
+            </w:r>
+          </w:p>
+        </w:tc>
+      </w:tr>
+      <w:tr>
+        <w:trPr>
+          <w:trHeight w:val="20"/>
+          <w:jc w:val="center"/>
+        </w:trPr>
+        <w:tc>
+          <w:tcPr>
+            <w:tcW w:w="4952" w:type="dxa"/>
+            <w:tcBorders>
+              <w:top w:val="nil"/>
+              <w:left w:val="single" w:sz="8" w:space="0" w:color="BFBFBF"/>
+              <w:bottom w:val="single" w:sz="8" w:space="0" w:color="BFBFBF"/>
+              <w:right w:val="single" w:sz="8" w:space="0" w:color="BFBFBF"/>
+            </w:tcBorders>
+            <w:vAlign w:val="center"/>
+            <w:hideMark/>
+          </w:tcPr>
+          <w:p>
+            <w:pPr>
+              <w:spacing w:line="240" w:lineRule="auto"/>
+              <w:jc w:val="both"/>
+              <w:rPr>
+                <w:rFonts w:eastAsia="Times New Roman"/>
+                <w:color w:val="000000"/>
+                <w:lang w:val="es-MX"/>
+              </w:rPr>
+            </w:pPr>
+            <w:r>
+              <w:rPr>
+                <w:rFonts w:eastAsia="Times New Roman"/>
+                <w:color w:val="000000"/>
+                <w:lang w:val="es-MX" w:eastAsia="zh-CN"/>
+              </w:rPr>
+              <w:t>Dominio web (primer año)</w:t>
+            </w:r>
+          </w:p>
+        </w:tc>
+        <w:tc>
+          <w:tcPr>
+            <w:tcW w:w="1842" w:type="dxa"/>
+            <w:tcBorders>
+              <w:top w:val="nil"/>
+              <w:left w:val="nil"/>
+              <w:bottom w:val="single" w:sz="8" w:space="0" w:color="BFBFBF"/>
+              <w:right w:val="single" w:sz="8" w:space="0" w:color="BFBFBF"/>
+            </w:tcBorders>
+            <w:vAlign w:val="center"/>
+            <w:hideMark/>
+          </w:tcPr>
+          <w:p>
+            <w:pPr>
+              <w:spacing w:line="240" w:lineRule="auto"/>
+              <w:jc w:val="both"/>
+              <w:rPr>
+                <w:rFonts w:eastAsia="Times New Roman"/>
+                <w:color w:val="000000"/>
+                <w:lang w:val="es-MX"/>
+              </w:rPr>
+            </w:pPr>
+            <w:r>
+              <w:rPr>
+                <w:rFonts w:eastAsia="Times New Roman"/>
+                <w:color w:val="000000"/>
+                <w:lang w:val="es-MX" w:eastAsia="zh-CN"/>
+              </w:rPr>
+              <w:t>$500</w:t>
+            </w:r>
+          </w:p>
+        </w:tc>
+      </w:tr>
+      <w:tr>
+        <w:trPr>
+          <w:trHeight w:val="20"/>
+          <w:jc w:val="center"/>
+        </w:trPr>
+        <w:tc>
+          <w:tcPr>
+            <w:tcW w:w="4952" w:type="dxa"/>
+            <w:tcBorders>
+              <w:top w:val="nil"/>
+              <w:left w:val="single" w:sz="8" w:space="0" w:color="BFBFBF"/>
+              <w:bottom w:val="single" w:sz="8" w:space="0" w:color="BFBFBF"/>
+              <w:right w:val="single" w:sz="8" w:space="0" w:color="BFBFBF"/>
+            </w:tcBorders>
+            <w:vAlign w:val="center"/>
+            <w:hideMark/>
+          </w:tcPr>
+          <w:p>
+            <w:pPr>
+              <w:spacing w:line="240" w:lineRule="auto"/>
+              <w:jc w:val="both"/>
+              <w:rPr>
+                <w:rFonts w:eastAsia="Times New Roman"/>
+                <w:color w:val="000000"/>
+                <w:lang w:val="es-MX"/>
+              </w:rPr>
+            </w:pPr>
+            <w:r>
+              <w:rPr>
+                <w:rFonts w:eastAsia="Times New Roman"/>
+                <w:color w:val="000000"/>
+                <w:lang w:val="es-MX" w:eastAsia="zh-CN"/>
+              </w:rPr>
+              <w:t>Desarrollo del sistema</w:t>
+            </w:r>
+          </w:p>
+        </w:tc>
+        <w:tc>
+          <w:tcPr>
+            <w:tcW w:w="1842" w:type="dxa"/>
+            <w:tcBorders>
+              <w:top w:val="nil"/>
+              <w:left w:val="nil"/>
+              <w:bottom w:val="single" w:sz="8" w:space="0" w:color="BFBFBF"/>
+              <w:right w:val="single" w:sz="8" w:space="0" w:color="BFBFBF"/>
+            </w:tcBorders>
+            <w:vAlign w:val="center"/>
+            <w:hideMark/>
+          </w:tcPr>
+          <w:p>
+            <w:pPr>
+              <w:spacing w:line="240" w:lineRule="auto"/>
+              <w:jc w:val="both"/>
+              <w:rPr>
+                <w:rFonts w:eastAsia="Times New Roman"/>
+                <w:color w:val="000000"/>
+                <w:lang w:val="es-MX"/>
+              </w:rPr>
+            </w:pPr>
+            <w:r>
+              <w:rPr>
+                <w:rFonts w:eastAsia="Times New Roman"/>
+                <w:color w:val="000000"/>
+                <w:lang w:val="es-MX" w:eastAsia="zh-CN"/>
+              </w:rPr>
+              <w:t>$1,500</w:t>
+            </w:r>
+          </w:p>
+        </w:tc>
+      </w:tr>
+      <w:tr>
+        <w:trPr>
+          <w:trHeight w:val="20"/>
+          <w:jc w:val="center"/>
+        </w:trPr>
+        <w:tc>
+          <w:tcPr>
+            <w:tcW w:w="4952" w:type="dxa"/>
+            <w:tcBorders>
+              <w:top w:val="nil"/>
+              <w:left w:val="single" w:sz="8" w:space="0" w:color="BFBFBF"/>
+              <w:bottom w:val="single" w:sz="8" w:space="0" w:color="BFBFBF"/>
+              <w:right w:val="single" w:sz="8" w:space="0" w:color="BFBFBF"/>
+            </w:tcBorders>
+            <w:vAlign w:val="center"/>
+            <w:hideMark/>
+          </w:tcPr>
+          <w:p>
+            <w:pPr>
+              <w:spacing w:line="240" w:lineRule="auto"/>
+              <w:jc w:val="both"/>
+              <w:rPr>
+                <w:rFonts w:eastAsia="Times New Roman"/>
+                <w:color w:val="000000"/>
+                <w:lang w:val="es-MX"/>
+              </w:rPr>
+            </w:pPr>
+            <w:r>
+              <w:rPr>
+                <w:rFonts w:eastAsia="Times New Roman"/>
+                <w:color w:val="000000"/>
+                <w:lang w:val="es-MX" w:eastAsia="zh-CN"/>
+              </w:rPr>
+              <w:t>Herramientas de desarrollo (software libre)</w:t>
+            </w:r>
+          </w:p>
+        </w:tc>
+        <w:tc>
+          <w:tcPr>
+            <w:tcW w:w="1842" w:type="dxa"/>
+            <w:tcBorders>
+              <w:top w:val="nil"/>
+              <w:left w:val="nil"/>
+              <w:bottom w:val="single" w:sz="8" w:space="0" w:color="BFBFBF"/>
+              <w:right w:val="single" w:sz="8" w:space="0" w:color="BFBFBF"/>
+            </w:tcBorders>
+            <w:vAlign w:val="center"/>
+            <w:hideMark/>
+          </w:tcPr>
+          <w:p>
+            <w:pPr>
+              <w:spacing w:line="240" w:lineRule="auto"/>
+              <w:jc w:val="both"/>
+              <w:rPr>
+                <w:rFonts w:eastAsia="Times New Roman"/>
+                <w:color w:val="000000"/>
+                <w:lang w:val="es-MX"/>
+              </w:rPr>
+            </w:pPr>
+            <w:r>
+              <w:rPr>
+                <w:rFonts w:eastAsia="Times New Roman"/>
+                <w:color w:val="000000"/>
+                <w:lang w:val="es-MX" w:eastAsia="zh-CN"/>
+              </w:rPr>
+              <w:t>$0</w:t>
+            </w:r>
+          </w:p>
+        </w:tc>
+      </w:tr>
+      <w:tr>
+        <w:trPr>
+          <w:trHeight w:val="20"/>
+          <w:jc w:val="center"/>
+        </w:trPr>
+        <w:tc>
+          <w:tcPr>
+            <w:tcW w:w="4952" w:type="dxa"/>
+            <w:tcBorders>
+              <w:top w:val="nil"/>
+              <w:left w:val="single" w:sz="8" w:space="0" w:color="BFBFBF"/>
+              <w:bottom w:val="single" w:sz="8" w:space="0" w:color="BFBFBF"/>
+              <w:right w:val="single" w:sz="8" w:space="0" w:color="BFBFBF"/>
+            </w:tcBorders>
+            <w:vAlign w:val="center"/>
+            <w:hideMark/>
+          </w:tcPr>
+          <w:p>
+            <w:pPr>
+              <w:spacing w:line="240" w:lineRule="auto"/>
+              <w:jc w:val="both"/>
+              <w:rPr>
+                <w:rFonts w:eastAsia="Times New Roman"/>
+                <w:color w:val="000000"/>
+                <w:lang w:val="es-MX"/>
+              </w:rPr>
+            </w:pPr>
+            <w:r>
+              <w:rPr>
+                <w:rFonts w:eastAsia="Times New Roman"/>
+                <w:color w:val="000000"/>
+                <w:lang w:val="es-MX" w:eastAsia="zh-CN"/>
+              </w:rPr>
+              <w:t xml:space="preserve">Capacitación del </w:t>
+            </w:r>
+            <w:proofErr w:type="spellStart"/>
+            <w:r>
+              <w:rPr>
+                <w:rFonts w:eastAsia="Times New Roman"/>
+                <w:color w:val="000000"/>
+                <w:lang w:val="es-MX" w:eastAsia="zh-CN"/>
+              </w:rPr>
+              <w:t>stakeholder</w:t>
+            </w:r>
+            <w:proofErr w:type="spellEnd"/>
+          </w:p>
+        </w:tc>
+        <w:tc>
+          <w:tcPr>
+            <w:tcW w:w="1842" w:type="dxa"/>
+            <w:tcBorders>
+              <w:top w:val="nil"/>
+              <w:left w:val="nil"/>
+              <w:bottom w:val="single" w:sz="8" w:space="0" w:color="BFBFBF"/>
+              <w:right w:val="single" w:sz="8" w:space="0" w:color="BFBFBF"/>
+            </w:tcBorders>
+            <w:vAlign w:val="center"/>
+            <w:hideMark/>
+          </w:tcPr>
+          <w:p>
+            <w:pPr>
+              <w:spacing w:line="240" w:lineRule="auto"/>
+              <w:jc w:val="both"/>
+              <w:rPr>
+                <w:rFonts w:eastAsia="Times New Roman"/>
+                <w:color w:val="000000"/>
+                <w:lang w:val="es-MX"/>
+              </w:rPr>
+            </w:pPr>
+            <w:r>
+              <w:rPr>
+                <w:rFonts w:eastAsia="Times New Roman"/>
+                <w:color w:val="000000"/>
+                <w:lang w:val="es-MX" w:eastAsia="zh-CN"/>
+              </w:rPr>
+              <w:t>$0</w:t>
+            </w:r>
+          </w:p>
+        </w:tc>
+      </w:tr>
+      <w:tr>
+        <w:trPr>
+          <w:trHeight w:val="20"/>
+          <w:jc w:val="center"/>
+        </w:trPr>
+        <w:tc>
+          <w:tcPr>
+            <w:tcW w:w="4952" w:type="dxa"/>
+            <w:tcBorders>
+              <w:top w:val="nil"/>
+              <w:left w:val="single" w:sz="8" w:space="0" w:color="BFBFBF"/>
+              <w:bottom w:val="single" w:sz="8" w:space="0" w:color="BFBFBF"/>
+              <w:right w:val="single" w:sz="8" w:space="0" w:color="BFBFBF"/>
+            </w:tcBorders>
+            <w:shd w:val="clear" w:color="auto" w:fill="BFBFBF" w:themeFill="background1" w:themeFillShade="BF"/>
+            <w:vAlign w:val="center"/>
+            <w:hideMark/>
+          </w:tcPr>
+          <w:p>
+            <w:pPr>
+              <w:spacing w:line="240" w:lineRule="auto"/>
+              <w:jc w:val="both"/>
+              <w:rPr>
+                <w:rFonts w:eastAsia="Times New Roman"/>
+                <w:b/>
+                <w:bCs/>
+                <w:color w:val="000000"/>
+                <w:lang w:val="es-MX"/>
+              </w:rPr>
+            </w:pPr>
+            <w:proofErr w:type="gramStart"/>
+            <w:r>
+              <w:rPr>
+                <w:rFonts w:eastAsia="Times New Roman"/>
+                <w:b/>
+                <w:bCs/>
+                <w:lang w:val="es-MX" w:eastAsia="zh-CN"/>
+              </w:rPr>
+              <w:t>Total</w:t>
+            </w:r>
+            <w:proofErr w:type="gramEnd"/>
+            <w:r>
+              <w:rPr>
+                <w:rFonts w:eastAsia="Times New Roman"/>
+                <w:b/>
+                <w:bCs/>
+                <w:lang w:val="es-MX" w:eastAsia="zh-CN"/>
+              </w:rPr>
+              <w:t xml:space="preserve"> Inversión Inicial</w:t>
+            </w:r>
+          </w:p>
+        </w:tc>
+        <w:tc>
+          <w:tcPr>
+            <w:tcW w:w="1842" w:type="dxa"/>
+            <w:tcBorders>
+              <w:top w:val="nil"/>
+              <w:left w:val="nil"/>
+              <w:bottom w:val="single" w:sz="8" w:space="0" w:color="BFBFBF"/>
+              <w:right w:val="single" w:sz="8" w:space="0" w:color="BFBFBF"/>
+            </w:tcBorders>
+            <w:shd w:val="clear" w:color="auto" w:fill="BFBFBF" w:themeFill="background1" w:themeFillShade="BF"/>
+            <w:vAlign w:val="center"/>
+            <w:hideMark/>
+          </w:tcPr>
+          <w:p>
+            <w:pPr>
+              <w:spacing w:line="240" w:lineRule="auto"/>
+              <w:jc w:val="both"/>
+              <w:rPr>
+                <w:rFonts w:eastAsia="Times New Roman"/>
+                <w:b/>
+                <w:bCs/>
+                <w:color w:val="000000"/>
+                <w:lang w:val="es-MX"/>
+              </w:rPr>
+            </w:pPr>
+            <w:r>
+              <w:rPr>
+                <w:rFonts w:eastAsia="Times New Roman"/>
+                <w:b/>
+                <w:bCs/>
+                <w:lang w:val="es-MX" w:eastAsia="zh-CN"/>
+              </w:rPr>
+              <w:t>$3,000</w:t>
+            </w:r>
+          </w:p>
+        </w:tc>
+      </w:tr>
+      <w:tr>
+        <w:trPr>
+          <w:trHeight w:val="20"/>
+          <w:jc w:val="center"/>
+        </w:trPr>
+        <w:tc>
+          <w:tcPr>
+            <w:tcW w:w="6794" w:type="dxa"/>
+            <w:gridSpan w:val="2"/>
+            <w:tcBorders>
+              <w:top w:val="nil"/>
+              <w:left w:val="single" w:sz="8" w:space="0" w:color="BFBFBF"/>
+              <w:bottom w:val="single" w:sz="8" w:space="0" w:color="BFBFBF"/>
+              <w:right w:val="single" w:sz="8" w:space="0" w:color="BFBFBF"/>
+            </w:tcBorders>
+            <w:shd w:val="clear" w:color="000000" w:fill="D9D9D9"/>
+            <w:vAlign w:val="center"/>
+            <w:hideMark/>
+          </w:tcPr>
+          <w:p>
+            <w:pPr>
+              <w:spacing w:line="240" w:lineRule="auto"/>
+              <w:jc w:val="both"/>
+              <w:rPr>
+                <w:rFonts w:eastAsia="Times New Roman"/>
+                <w:b/>
+                <w:bCs/>
+                <w:color w:val="000000"/>
+                <w:lang w:val="es-MX"/>
+              </w:rPr>
+            </w:pPr>
+            <w:r>
+              <w:rPr>
+                <w:rFonts w:eastAsia="Times New Roman"/>
+                <w:b/>
+                <w:bCs/>
+                <w:lang w:val="es-MX" w:eastAsia="zh-CN"/>
+              </w:rPr>
+              <w:t>Costos Operativos Anuales</w:t>
+            </w:r>
+          </w:p>
+        </w:tc>
+      </w:tr>
+      <w:tr>
+        <w:trPr>
+          <w:trHeight w:val="20"/>
+          <w:jc w:val="center"/>
+        </w:trPr>
+        <w:tc>
+          <w:tcPr>
+            <w:tcW w:w="4952" w:type="dxa"/>
+            <w:tcBorders>
+              <w:top w:val="nil"/>
+              <w:left w:val="single" w:sz="8" w:space="0" w:color="BFBFBF"/>
+              <w:bottom w:val="single" w:sz="8" w:space="0" w:color="BFBFBF"/>
+              <w:right w:val="single" w:sz="8" w:space="0" w:color="BFBFBF"/>
+            </w:tcBorders>
+            <w:vAlign w:val="center"/>
+            <w:hideMark/>
+          </w:tcPr>
+          <w:p>
+            <w:pPr>
+              <w:spacing w:line="240" w:lineRule="auto"/>
+              <w:jc w:val="both"/>
+              <w:rPr>
+                <w:rFonts w:eastAsia="Times New Roman"/>
+                <w:color w:val="000000"/>
+                <w:lang w:val="es-MX"/>
+              </w:rPr>
+            </w:pPr>
+            <w:r>
+              <w:rPr>
+                <w:rFonts w:eastAsia="Times New Roman"/>
+                <w:color w:val="000000"/>
+                <w:lang w:val="es-MX" w:eastAsia="zh-CN"/>
+              </w:rPr>
+              <w:t>Renovación de hosting</w:t>
+            </w:r>
+          </w:p>
+        </w:tc>
+        <w:tc>
+          <w:tcPr>
+            <w:tcW w:w="1842" w:type="dxa"/>
+            <w:tcBorders>
+              <w:top w:val="nil"/>
+              <w:left w:val="nil"/>
+              <w:bottom w:val="single" w:sz="8" w:space="0" w:color="BFBFBF"/>
+              <w:right w:val="single" w:sz="8" w:space="0" w:color="BFBFBF"/>
+            </w:tcBorders>
+            <w:vAlign w:val="center"/>
+            <w:hideMark/>
+          </w:tcPr>
+          <w:p>
+            <w:pPr>
+              <w:spacing w:line="240" w:lineRule="auto"/>
+              <w:jc w:val="both"/>
+              <w:rPr>
+                <w:rFonts w:eastAsia="Times New Roman"/>
+                <w:color w:val="000000"/>
+                <w:lang w:val="es-MX"/>
+              </w:rPr>
+            </w:pPr>
+            <w:r>
+              <w:rPr>
+                <w:rFonts w:eastAsia="Times New Roman"/>
+                <w:color w:val="000000"/>
+                <w:lang w:val="es-MX" w:eastAsia="zh-CN"/>
+              </w:rPr>
+              <w:t>$1,000</w:t>
+            </w:r>
+          </w:p>
+        </w:tc>
+      </w:tr>
+      <w:tr>
+        <w:trPr>
+          <w:trHeight w:val="20"/>
+          <w:jc w:val="center"/>
+        </w:trPr>
+        <w:tc>
+          <w:tcPr>
+            <w:tcW w:w="4952" w:type="dxa"/>
+            <w:tcBorders>
+              <w:top w:val="nil"/>
+              <w:left w:val="single" w:sz="8" w:space="0" w:color="BFBFBF"/>
+              <w:bottom w:val="single" w:sz="8" w:space="0" w:color="BFBFBF"/>
+              <w:right w:val="single" w:sz="8" w:space="0" w:color="BFBFBF"/>
+            </w:tcBorders>
+            <w:vAlign w:val="center"/>
+            <w:hideMark/>
+          </w:tcPr>
+          <w:p>
+            <w:pPr>
+              <w:spacing w:line="240" w:lineRule="auto"/>
+              <w:jc w:val="both"/>
+              <w:rPr>
+                <w:rFonts w:eastAsia="Times New Roman"/>
+                <w:color w:val="000000"/>
+                <w:lang w:val="es-MX"/>
+              </w:rPr>
+            </w:pPr>
+            <w:r>
+              <w:rPr>
+                <w:rFonts w:eastAsia="Times New Roman"/>
+                <w:color w:val="000000"/>
+                <w:lang w:val="es-MX" w:eastAsia="zh-CN"/>
+              </w:rPr>
+              <w:t>Renovación de dominio</w:t>
+            </w:r>
+          </w:p>
+        </w:tc>
+        <w:tc>
+          <w:tcPr>
+            <w:tcW w:w="1842" w:type="dxa"/>
+            <w:tcBorders>
+              <w:top w:val="nil"/>
+              <w:left w:val="nil"/>
+              <w:bottom w:val="single" w:sz="8" w:space="0" w:color="BFBFBF"/>
+              <w:right w:val="single" w:sz="8" w:space="0" w:color="BFBFBF"/>
+            </w:tcBorders>
+            <w:vAlign w:val="center"/>
+            <w:hideMark/>
+          </w:tcPr>
+          <w:p>
+            <w:pPr>
+              <w:spacing w:line="240" w:lineRule="auto"/>
+              <w:jc w:val="both"/>
+              <w:rPr>
+                <w:rFonts w:eastAsia="Times New Roman"/>
+                <w:color w:val="000000"/>
+                <w:lang w:val="es-MX"/>
+              </w:rPr>
+            </w:pPr>
+            <w:r>
+              <w:rPr>
+                <w:rFonts w:eastAsia="Times New Roman"/>
+                <w:color w:val="000000"/>
+                <w:lang w:val="es-MX" w:eastAsia="zh-CN"/>
+              </w:rPr>
+              <w:t>$500</w:t>
+            </w:r>
+          </w:p>
+        </w:tc>
+      </w:tr>
+      <w:tr>
+        <w:trPr>
+          <w:trHeight w:val="20"/>
+          <w:jc w:val="center"/>
+        </w:trPr>
+        <w:tc>
+          <w:tcPr>
+            <w:tcW w:w="4952" w:type="dxa"/>
+            <w:tcBorders>
+              <w:top w:val="nil"/>
+              <w:left w:val="single" w:sz="8" w:space="0" w:color="BFBFBF"/>
+              <w:bottom w:val="single" w:sz="8" w:space="0" w:color="BFBFBF"/>
+              <w:right w:val="single" w:sz="8" w:space="0" w:color="BFBFBF"/>
+            </w:tcBorders>
+            <w:vAlign w:val="center"/>
+            <w:hideMark/>
+          </w:tcPr>
+          <w:p>
+            <w:pPr>
+              <w:spacing w:line="240" w:lineRule="auto"/>
+              <w:jc w:val="both"/>
+              <w:rPr>
+                <w:rFonts w:eastAsia="Times New Roman"/>
+                <w:color w:val="000000"/>
+                <w:lang w:val="es-MX"/>
+              </w:rPr>
+            </w:pPr>
+            <w:r>
+              <w:rPr>
+                <w:rFonts w:eastAsia="Times New Roman"/>
+                <w:color w:val="000000"/>
+                <w:lang w:val="es-MX" w:eastAsia="zh-CN"/>
+              </w:rPr>
+              <w:t>Mantenimiento y actualizaciones menores</w:t>
+            </w:r>
+          </w:p>
+        </w:tc>
+        <w:tc>
+          <w:tcPr>
+            <w:tcW w:w="1842" w:type="dxa"/>
+            <w:tcBorders>
+              <w:top w:val="nil"/>
+              <w:left w:val="nil"/>
+              <w:bottom w:val="single" w:sz="8" w:space="0" w:color="BFBFBF"/>
+              <w:right w:val="single" w:sz="8" w:space="0" w:color="BFBFBF"/>
+            </w:tcBorders>
+            <w:vAlign w:val="center"/>
+            <w:hideMark/>
+          </w:tcPr>
+          <w:p>
+            <w:pPr>
+              <w:spacing w:line="240" w:lineRule="auto"/>
+              <w:jc w:val="both"/>
+              <w:rPr>
+                <w:rFonts w:eastAsia="Times New Roman"/>
+                <w:color w:val="000000"/>
+                <w:lang w:val="es-MX"/>
+              </w:rPr>
+            </w:pPr>
+            <w:r>
+              <w:rPr>
+                <w:rFonts w:eastAsia="Times New Roman"/>
+                <w:color w:val="000000"/>
+                <w:lang w:val="es-MX" w:eastAsia="zh-CN"/>
+              </w:rPr>
+              <w:t>$500</w:t>
+            </w:r>
+          </w:p>
+        </w:tc>
+      </w:tr>
+      <w:tr>
+        <w:trPr>
+          <w:trHeight w:val="20"/>
+          <w:jc w:val="center"/>
+        </w:trPr>
+        <w:tc>
+          <w:tcPr>
+            <w:tcW w:w="4952" w:type="dxa"/>
+            <w:tcBorders>
+              <w:top w:val="nil"/>
+              <w:left w:val="single" w:sz="8" w:space="0" w:color="BFBFBF"/>
+              <w:bottom w:val="single" w:sz="8" w:space="0" w:color="BFBFBF"/>
+              <w:right w:val="single" w:sz="8" w:space="0" w:color="BFBFBF"/>
+            </w:tcBorders>
+            <w:shd w:val="clear" w:color="auto" w:fill="BFBFBF" w:themeFill="background1" w:themeFillShade="BF"/>
+            <w:vAlign w:val="center"/>
+            <w:hideMark/>
+          </w:tcPr>
+          <w:p>
+            <w:pPr>
+              <w:spacing w:line="240" w:lineRule="auto"/>
+              <w:jc w:val="both"/>
+              <w:rPr>
+                <w:rFonts w:eastAsia="Times New Roman"/>
+                <w:b/>
+                <w:bCs/>
+                <w:color w:val="000000"/>
+                <w:lang w:val="es-MX"/>
+              </w:rPr>
+            </w:pPr>
+            <w:proofErr w:type="gramStart"/>
+            <w:r>
+              <w:rPr>
+                <w:rFonts w:eastAsia="Times New Roman"/>
+                <w:b/>
+                <w:bCs/>
+                <w:color w:val="000000"/>
+                <w:lang w:val="es-MX" w:eastAsia="zh-CN"/>
+              </w:rPr>
+              <w:t>Total</w:t>
+            </w:r>
+            <w:proofErr w:type="gramEnd"/>
+            <w:r>
+              <w:rPr>
+                <w:rFonts w:eastAsia="Times New Roman"/>
+                <w:b/>
+                <w:bCs/>
+                <w:color w:val="000000"/>
+                <w:lang w:val="es-MX" w:eastAsia="zh-CN"/>
+              </w:rPr>
+              <w:t xml:space="preserve"> Costos Operativos/año</w:t>
+            </w:r>
+          </w:p>
+        </w:tc>
+        <w:tc>
+          <w:tcPr>
+            <w:tcW w:w="1842" w:type="dxa"/>
+            <w:tcBorders>
+              <w:top w:val="nil"/>
+              <w:left w:val="nil"/>
+              <w:bottom w:val="single" w:sz="8" w:space="0" w:color="BFBFBF"/>
+              <w:right w:val="single" w:sz="8" w:space="0" w:color="BFBFBF"/>
+            </w:tcBorders>
+            <w:shd w:val="clear" w:color="auto" w:fill="BFBFBF" w:themeFill="background1" w:themeFillShade="BF"/>
+            <w:vAlign w:val="center"/>
+            <w:hideMark/>
+          </w:tcPr>
+          <w:p>
+            <w:pPr>
+              <w:spacing w:line="240" w:lineRule="auto"/>
+              <w:jc w:val="both"/>
+              <w:rPr>
+                <w:rFonts w:eastAsia="Times New Roman"/>
+                <w:b/>
+                <w:bCs/>
+                <w:color w:val="000000"/>
+                <w:lang w:val="es-MX"/>
+              </w:rPr>
+            </w:pPr>
+            <w:r>
+              <w:rPr>
+                <w:rFonts w:eastAsia="Times New Roman"/>
+                <w:b/>
+                <w:bCs/>
+                <w:color w:val="000000"/>
+                <w:lang w:val="es-MX" w:eastAsia="zh-CN"/>
+              </w:rPr>
+              <w:t>$2,000</w:t>
+            </w:r>
+          </w:p>
+        </w:tc>
+      </w:tr>
+      <w:tr>
+        <w:trPr>
+          <w:trHeight w:val="20"/>
+          <w:jc w:val="center"/>
+        </w:trPr>
+        <w:tc>
+          <w:tcPr>
+            <w:tcW w:w="6794" w:type="dxa"/>
+            <w:gridSpan w:val="2"/>
+            <w:tcBorders>
+              <w:top w:val="nil"/>
+              <w:left w:val="single" w:sz="8" w:space="0" w:color="BFBFBF"/>
+              <w:bottom w:val="single" w:sz="8" w:space="0" w:color="BFBFBF"/>
+              <w:right w:val="single" w:sz="8" w:space="0" w:color="BFBFBF"/>
+            </w:tcBorders>
+            <w:shd w:val="clear" w:color="auto" w:fill="D9D9D9" w:themeFill="background1" w:themeFillShade="D9"/>
+            <w:vAlign w:val="center"/>
+            <w:hideMark/>
+          </w:tcPr>
+          <w:p>
+            <w:pPr>
+              <w:spacing w:line="240" w:lineRule="auto"/>
+              <w:jc w:val="both"/>
+              <w:rPr>
+                <w:rFonts w:eastAsia="Times New Roman"/>
+                <w:b/>
+                <w:bCs/>
+                <w:color w:val="000000"/>
+                <w:lang w:val="es-MX"/>
+              </w:rPr>
+            </w:pPr>
+            <w:r>
+              <w:rPr>
+                <w:rFonts w:eastAsia="Times New Roman"/>
+                <w:b/>
+                <w:bCs/>
+                <w:color w:val="000000"/>
+                <w:lang w:val="es-MX" w:eastAsia="zh-CN"/>
+              </w:rPr>
+              <w:t>Beneficios Esperados Anuales</w:t>
+            </w:r>
+          </w:p>
+        </w:tc>
+      </w:tr>
+      <w:tr>
+        <w:trPr>
+          <w:trHeight w:val="20"/>
+          <w:jc w:val="center"/>
+        </w:trPr>
+        <w:tc>
+          <w:tcPr>
+            <w:tcW w:w="4952" w:type="dxa"/>
+            <w:tcBorders>
+              <w:top w:val="nil"/>
+              <w:left w:val="single" w:sz="8" w:space="0" w:color="BFBFBF"/>
+              <w:bottom w:val="single" w:sz="8" w:space="0" w:color="BFBFBF"/>
+              <w:right w:val="single" w:sz="8" w:space="0" w:color="BFBFBF"/>
+            </w:tcBorders>
+            <w:vAlign w:val="center"/>
+            <w:hideMark/>
+          </w:tcPr>
+          <w:p>
+            <w:pPr>
+              <w:spacing w:line="240" w:lineRule="auto"/>
+              <w:jc w:val="both"/>
+              <w:rPr>
+                <w:rFonts w:eastAsia="Times New Roman"/>
+                <w:color w:val="000000"/>
+                <w:lang w:val="es-MX"/>
+              </w:rPr>
+            </w:pPr>
+            <w:r>
+              <w:rPr>
+                <w:rFonts w:eastAsia="Times New Roman"/>
+                <w:color w:val="000000"/>
+                <w:lang w:val="es-MX" w:eastAsia="zh-CN"/>
+              </w:rPr>
+              <w:t>Captación de al menos 2 clientes nuevos al año</w:t>
+            </w:r>
+          </w:p>
+        </w:tc>
+        <w:tc>
+          <w:tcPr>
+            <w:tcW w:w="1842" w:type="dxa"/>
+            <w:tcBorders>
+              <w:top w:val="nil"/>
+              <w:left w:val="nil"/>
+              <w:bottom w:val="single" w:sz="8" w:space="0" w:color="BFBFBF"/>
+              <w:right w:val="single" w:sz="8" w:space="0" w:color="BFBFBF"/>
+            </w:tcBorders>
+            <w:vAlign w:val="center"/>
+            <w:hideMark/>
+          </w:tcPr>
+          <w:p>
+            <w:pPr>
+              <w:spacing w:line="240" w:lineRule="auto"/>
+              <w:jc w:val="both"/>
+              <w:rPr>
+                <w:rFonts w:eastAsia="Times New Roman"/>
+                <w:color w:val="000000"/>
+                <w:lang w:val="es-MX"/>
+              </w:rPr>
+            </w:pPr>
+            <w:r>
+              <w:rPr>
+                <w:rFonts w:eastAsia="Times New Roman"/>
+                <w:color w:val="000000"/>
+                <w:lang w:val="es-MX" w:eastAsia="zh-CN"/>
+              </w:rPr>
+              <w:t>$10,000</w:t>
+            </w:r>
+          </w:p>
+        </w:tc>
+      </w:tr>
+      <w:tr>
+        <w:trPr>
+          <w:trHeight w:val="20"/>
+          <w:jc w:val="center"/>
+        </w:trPr>
+        <w:tc>
+          <w:tcPr>
+            <w:tcW w:w="4952" w:type="dxa"/>
+            <w:tcBorders>
+              <w:top w:val="nil"/>
+              <w:left w:val="single" w:sz="8" w:space="0" w:color="BFBFBF"/>
+              <w:bottom w:val="single" w:sz="8" w:space="0" w:color="BFBFBF"/>
+              <w:right w:val="single" w:sz="8" w:space="0" w:color="BFBFBF"/>
+            </w:tcBorders>
+            <w:vAlign w:val="center"/>
+            <w:hideMark/>
+          </w:tcPr>
+          <w:p>
+            <w:pPr>
+              <w:spacing w:line="240" w:lineRule="auto"/>
+              <w:jc w:val="both"/>
+              <w:rPr>
+                <w:rFonts w:eastAsia="Times New Roman"/>
+                <w:color w:val="000000"/>
+                <w:lang w:val="es-MX"/>
+              </w:rPr>
+            </w:pPr>
+            <w:r>
+              <w:rPr>
+                <w:rFonts w:eastAsia="Times New Roman"/>
+                <w:color w:val="000000"/>
+                <w:lang w:val="es-MX" w:eastAsia="zh-CN"/>
+              </w:rPr>
+              <w:t>Ahorro en material impreso</w:t>
+            </w:r>
+          </w:p>
+        </w:tc>
+        <w:tc>
+          <w:tcPr>
+            <w:tcW w:w="1842" w:type="dxa"/>
+            <w:tcBorders>
+              <w:top w:val="nil"/>
+              <w:left w:val="nil"/>
+              <w:bottom w:val="single" w:sz="8" w:space="0" w:color="BFBFBF"/>
+              <w:right w:val="single" w:sz="8" w:space="0" w:color="BFBFBF"/>
+            </w:tcBorders>
+            <w:vAlign w:val="center"/>
+            <w:hideMark/>
+          </w:tcPr>
+          <w:p>
+            <w:pPr>
+              <w:spacing w:line="240" w:lineRule="auto"/>
+              <w:jc w:val="both"/>
+              <w:rPr>
+                <w:rFonts w:eastAsia="Times New Roman"/>
+                <w:color w:val="000000"/>
+                <w:lang w:val="es-MX"/>
+              </w:rPr>
+            </w:pPr>
+            <w:r>
+              <w:rPr>
+                <w:rFonts w:eastAsia="Times New Roman"/>
+                <w:color w:val="000000"/>
+                <w:lang w:val="es-MX" w:eastAsia="zh-CN"/>
+              </w:rPr>
+              <w:t>$1,500</w:t>
+            </w:r>
+          </w:p>
+        </w:tc>
+      </w:tr>
+      <w:tr>
+        <w:trPr>
+          <w:trHeight w:val="20"/>
+          <w:jc w:val="center"/>
+        </w:trPr>
+        <w:tc>
+          <w:tcPr>
+            <w:tcW w:w="4952" w:type="dxa"/>
+            <w:tcBorders>
+              <w:top w:val="nil"/>
+              <w:left w:val="single" w:sz="8" w:space="0" w:color="BFBFBF"/>
+              <w:bottom w:val="single" w:sz="8" w:space="0" w:color="BFBFBF"/>
+              <w:right w:val="single" w:sz="8" w:space="0" w:color="BFBFBF"/>
+            </w:tcBorders>
+            <w:vAlign w:val="center"/>
+            <w:hideMark/>
+          </w:tcPr>
+          <w:p>
+            <w:pPr>
+              <w:spacing w:line="240" w:lineRule="auto"/>
+              <w:jc w:val="both"/>
+              <w:rPr>
+                <w:rFonts w:eastAsia="Times New Roman"/>
+                <w:color w:val="000000"/>
+                <w:lang w:val="es-MX"/>
+              </w:rPr>
+            </w:pPr>
+            <w:r>
+              <w:rPr>
+                <w:rFonts w:eastAsia="Times New Roman"/>
+                <w:color w:val="000000"/>
+                <w:lang w:val="es-MX" w:eastAsia="zh-CN"/>
+              </w:rPr>
+              <w:t>Ahorro de tiempo en presentaciones presenciales</w:t>
+            </w:r>
+          </w:p>
+        </w:tc>
+        <w:tc>
+          <w:tcPr>
+            <w:tcW w:w="1842" w:type="dxa"/>
+            <w:tcBorders>
+              <w:top w:val="nil"/>
+              <w:left w:val="nil"/>
+              <w:bottom w:val="single" w:sz="8" w:space="0" w:color="BFBFBF"/>
+              <w:right w:val="single" w:sz="8" w:space="0" w:color="BFBFBF"/>
+            </w:tcBorders>
+            <w:vAlign w:val="center"/>
+            <w:hideMark/>
+          </w:tcPr>
+          <w:p>
+            <w:pPr>
+              <w:spacing w:line="240" w:lineRule="auto"/>
+              <w:jc w:val="both"/>
+              <w:rPr>
+                <w:rFonts w:eastAsia="Times New Roman"/>
+                <w:color w:val="000000"/>
+                <w:lang w:val="es-MX"/>
+              </w:rPr>
+            </w:pPr>
+            <w:r>
+              <w:rPr>
+                <w:rFonts w:eastAsia="Times New Roman"/>
+                <w:color w:val="000000"/>
+                <w:lang w:val="es-MX" w:eastAsia="zh-CN"/>
+              </w:rPr>
+              <w:t>$2,700</w:t>
+            </w:r>
+          </w:p>
+        </w:tc>
+      </w:tr>
+      <w:tr>
+        <w:trPr>
+          <w:trHeight w:val="20"/>
+          <w:jc w:val="center"/>
+        </w:trPr>
+        <w:tc>
+          <w:tcPr>
+            <w:tcW w:w="4952" w:type="dxa"/>
+            <w:tcBorders>
+              <w:top w:val="nil"/>
+              <w:left w:val="single" w:sz="8" w:space="0" w:color="BFBFBF"/>
+              <w:bottom w:val="single" w:sz="8" w:space="0" w:color="BFBFBF"/>
+              <w:right w:val="single" w:sz="8" w:space="0" w:color="BFBFBF"/>
+            </w:tcBorders>
+            <w:vAlign w:val="center"/>
+            <w:hideMark/>
+          </w:tcPr>
+          <w:p>
+            <w:pPr>
+              <w:spacing w:line="240" w:lineRule="auto"/>
+              <w:jc w:val="both"/>
+              <w:rPr>
+                <w:rFonts w:eastAsia="Times New Roman"/>
+                <w:color w:val="000000"/>
+                <w:lang w:val="es-MX"/>
+              </w:rPr>
+            </w:pPr>
+            <w:r>
+              <w:rPr>
+                <w:rFonts w:eastAsia="Times New Roman"/>
+                <w:color w:val="000000"/>
+                <w:lang w:val="es-MX" w:eastAsia="zh-CN"/>
+              </w:rPr>
+              <w:t>Mejora en imagen profesional (beneficio intangible)</w:t>
+            </w:r>
+          </w:p>
+        </w:tc>
+        <w:tc>
+          <w:tcPr>
+            <w:tcW w:w="1842" w:type="dxa"/>
+            <w:tcBorders>
+              <w:top w:val="nil"/>
+              <w:left w:val="nil"/>
+              <w:bottom w:val="single" w:sz="8" w:space="0" w:color="BFBFBF"/>
+              <w:right w:val="single" w:sz="8" w:space="0" w:color="BFBFBF"/>
+            </w:tcBorders>
+            <w:vAlign w:val="center"/>
+            <w:hideMark/>
+          </w:tcPr>
+          <w:p>
+            <w:pPr>
+              <w:spacing w:line="240" w:lineRule="auto"/>
+              <w:jc w:val="both"/>
+              <w:rPr>
+                <w:rFonts w:eastAsia="Times New Roman"/>
+                <w:color w:val="000000"/>
+                <w:lang w:val="es-MX"/>
+              </w:rPr>
+            </w:pPr>
+            <w:r>
+              <w:rPr>
+                <w:rFonts w:eastAsia="Times New Roman"/>
+                <w:color w:val="000000"/>
+                <w:lang w:val="es-MX" w:eastAsia="zh-CN"/>
+              </w:rPr>
+              <w:t>$2,000</w:t>
+            </w:r>
+          </w:p>
+        </w:tc>
+      </w:tr>
+      <w:tr>
+        <w:trPr>
+          <w:trHeight w:val="20"/>
+          <w:jc w:val="center"/>
+        </w:trPr>
+        <w:tc>
+          <w:tcPr>
+            <w:tcW w:w="4952" w:type="dxa"/>
+            <w:tcBorders>
+              <w:top w:val="nil"/>
+              <w:left w:val="single" w:sz="8" w:space="0" w:color="BFBFBF"/>
+              <w:bottom w:val="single" w:sz="8" w:space="0" w:color="BFBFBF"/>
+              <w:right w:val="single" w:sz="8" w:space="0" w:color="BFBFBF"/>
+            </w:tcBorders>
+            <w:shd w:val="clear" w:color="auto" w:fill="BFBFBF" w:themeFill="background1" w:themeFillShade="BF"/>
+            <w:vAlign w:val="center"/>
+            <w:hideMark/>
+          </w:tcPr>
+          <w:p>
+            <w:pPr>
+              <w:spacing w:line="240" w:lineRule="auto"/>
+              <w:jc w:val="both"/>
+              <w:rPr>
+                <w:rFonts w:eastAsia="Times New Roman"/>
+                <w:b/>
+                <w:bCs/>
+                <w:color w:val="000000"/>
+                <w:lang w:val="es-MX"/>
+              </w:rPr>
+            </w:pPr>
+            <w:proofErr w:type="gramStart"/>
+            <w:r>
+              <w:rPr>
+                <w:rFonts w:eastAsia="Times New Roman"/>
+                <w:b/>
+                <w:bCs/>
+                <w:color w:val="000000"/>
+                <w:lang w:val="es-MX" w:eastAsia="zh-CN"/>
+              </w:rPr>
+              <w:t>Total</w:t>
+            </w:r>
+            <w:proofErr w:type="gramEnd"/>
+            <w:r>
+              <w:rPr>
+                <w:rFonts w:eastAsia="Times New Roman"/>
+                <w:b/>
+                <w:bCs/>
+                <w:color w:val="000000"/>
+                <w:lang w:val="es-MX" w:eastAsia="zh-CN"/>
+              </w:rPr>
+              <w:t xml:space="preserve"> Beneficios/año</w:t>
+            </w:r>
+          </w:p>
+        </w:tc>
+        <w:tc>
+          <w:tcPr>
+            <w:tcW w:w="1842" w:type="dxa"/>
+            <w:tcBorders>
+              <w:top w:val="nil"/>
+              <w:left w:val="nil"/>
+              <w:bottom w:val="single" w:sz="8" w:space="0" w:color="BFBFBF"/>
+              <w:right w:val="single" w:sz="8" w:space="0" w:color="BFBFBF"/>
+            </w:tcBorders>
+            <w:shd w:val="clear" w:color="auto" w:fill="BFBFBF" w:themeFill="background1" w:themeFillShade="BF"/>
+            <w:vAlign w:val="center"/>
+            <w:hideMark/>
+          </w:tcPr>
+          <w:p>
+            <w:pPr>
+              <w:spacing w:line="240" w:lineRule="auto"/>
+              <w:jc w:val="both"/>
+              <w:rPr>
+                <w:rFonts w:eastAsia="Times New Roman"/>
+                <w:b/>
+                <w:bCs/>
+                <w:color w:val="000000"/>
+                <w:lang w:val="es-MX"/>
+              </w:rPr>
+            </w:pPr>
+            <w:r>
+              <w:rPr>
+                <w:rFonts w:eastAsia="Times New Roman"/>
+                <w:b/>
+                <w:bCs/>
+                <w:color w:val="000000"/>
+                <w:lang w:val="es-MX" w:eastAsia="zh-CN"/>
+              </w:rPr>
+              <w:t>$16,200</w:t>
+            </w:r>
+          </w:p>
+        </w:tc>
+      </w:tr>
+    </w:tbl>
     <w:p>
       <w:pPr>
         <w:ind w:left="360"/>
@@ -5986,11 +7506,137 @@
           <w:lang w:val="es-MX"/>
         </w:rPr>
       </w:pPr>
-      <w:r>
-        <w:rPr>
-          <w:lang w:val="es-MX" w:eastAsia="zh-CN"/>
-        </w:rPr>
-        <w:t>..</w:t>
+    </w:p>
+    <w:p>
+      <w:pPr>
+        <w:jc w:val="both"/>
+        <w:rPr>
+          <w:rFonts w:ascii="Aptos" w:hAnsi="Aptos"/>
+          <w:b/>
+          <w:bCs/>
+          <w:lang w:val="es-MX"/>
+        </w:rPr>
+      </w:pPr>
+    </w:p>
+    <w:p>
+      <w:pPr>
+        <w:jc w:val="both"/>
+        <w:rPr>
+          <w:rFonts w:ascii="Aptos" w:hAnsi="Aptos"/>
+          <w:lang w:val="es-MX"/>
+        </w:rPr>
+      </w:pPr>
+      <w:r>
+        <w:rPr>
+          <w:rFonts w:ascii="Aptos" w:hAnsi="Aptos"/>
+          <w:b/>
+          <w:bCs/>
+          <w:lang w:val="es-MX"/>
+        </w:rPr>
+        <w:t>Evaluación Económica:</w:t>
+      </w:r>
+    </w:p>
+    <w:p>
+      <w:pPr>
+        <w:numPr>
+          <w:ilvl w:val="0"/>
+          <w:numId w:val="48"/>
+        </w:numPr>
+        <w:jc w:val="both"/>
+        <w:rPr>
+          <w:rFonts w:ascii="Aptos" w:hAnsi="Aptos"/>
+          <w:lang w:val="es-MX"/>
+        </w:rPr>
+      </w:pPr>
+      <w:r>
+        <w:rPr>
+          <w:rFonts w:ascii="Aptos" w:hAnsi="Aptos"/>
+          <w:lang w:val="es-MX"/>
+        </w:rPr>
+        <w:t xml:space="preserve">Beneficio Neto Anual = $16,200 − $2,000 = </w:t>
+      </w:r>
+      <w:r>
+        <w:rPr>
+          <w:rFonts w:ascii="Aptos" w:hAnsi="Aptos"/>
+          <w:b/>
+          <w:bCs/>
+          <w:lang w:val="es-MX"/>
+        </w:rPr>
+        <w:t>$14,200</w:t>
+      </w:r>
+    </w:p>
+    <w:p>
+      <w:pPr>
+        <w:numPr>
+          <w:ilvl w:val="0"/>
+          <w:numId w:val="48"/>
+        </w:numPr>
+        <w:jc w:val="both"/>
+        <w:rPr>
+          <w:rFonts w:ascii="Aptos" w:hAnsi="Aptos"/>
+          <w:lang w:val="es-MX"/>
+        </w:rPr>
+      </w:pPr>
+      <w:r>
+        <w:rPr>
+          <w:rFonts w:ascii="Aptos" w:hAnsi="Aptos"/>
+          <w:lang w:val="es-MX"/>
+        </w:rPr>
+        <w:t xml:space="preserve">ROI = ($14,200 / $3,000) × 100 = </w:t>
+      </w:r>
+      <w:r>
+        <w:rPr>
+          <w:rFonts w:ascii="Aptos" w:hAnsi="Aptos"/>
+          <w:b/>
+          <w:bCs/>
+          <w:lang w:val="es-MX"/>
+        </w:rPr>
+        <w:t>473%</w:t>
+      </w:r>
+    </w:p>
+    <w:p>
+      <w:pPr>
+        <w:numPr>
+          <w:ilvl w:val="0"/>
+          <w:numId w:val="48"/>
+        </w:numPr>
+        <w:jc w:val="both"/>
+        <w:rPr>
+          <w:rFonts w:ascii="Aptos" w:hAnsi="Aptos"/>
+          <w:lang w:val="es-MX"/>
+        </w:rPr>
+      </w:pPr>
+      <w:proofErr w:type="spellStart"/>
+      <w:r>
+        <w:rPr>
+          <w:rFonts w:ascii="Aptos" w:hAnsi="Aptos"/>
+          <w:lang w:val="es-MX"/>
+        </w:rPr>
+        <w:t>Payback</w:t>
+      </w:r>
+      <w:proofErr w:type="spellEnd"/>
+      <w:r>
+        <w:rPr>
+          <w:rFonts w:ascii="Aptos" w:hAnsi="Aptos"/>
+          <w:lang w:val="es-MX"/>
+        </w:rPr>
+        <w:t xml:space="preserve"> = $3,000 / $14,200 = </w:t>
+      </w:r>
+      <w:r>
+        <w:rPr>
+          <w:rFonts w:ascii="Aptos" w:hAnsi="Aptos"/>
+          <w:b/>
+          <w:bCs/>
+          <w:lang w:val="es-MX"/>
+        </w:rPr>
+        <w:t>0.21 años</w:t>
+      </w:r>
+      <w:r>
+        <w:rPr>
+          <w:rFonts w:ascii="Aptos" w:hAnsi="Aptos"/>
+          <w:lang w:val="es-MX"/>
+        </w:rPr>
+        <w:t xml:space="preserve"> (≈ 2.5 meses)</w:t>
       </w:r>
     </w:p>
     <w:p>
@@ -6020,13 +7666,14 @@
         <w:rPr>
           <w:rFonts w:ascii="Aptos" w:hAnsi="Aptos"/>
         </w:rPr>
+        <w:lastRenderedPageBreak/>
         <w:t>Operacional</w:t>
       </w:r>
       <w:bookmarkEnd w:id="19"/>
     </w:p>
     <w:p>
       <w:pPr>
-        <w:ind w:firstLine="360"/>
+        <w:jc w:val="both"/>
         <w:rPr>
           <w:lang w:val="es-MX" w:eastAsia="zh-CN"/>
         </w:rPr>
@@ -6035,8 +7682,43 @@
         <w:rPr>
           <w:lang w:val="es-MX" w:eastAsia="zh-CN"/>
         </w:rPr>
-        <w:t>--</w:t>
-      </w:r>
+        <w:t xml:space="preserve">El proyecto cuenta con el apoyo directo del arquitecto </w:t>
+      </w:r>
+      <w:proofErr w:type="spellStart"/>
+      <w:r>
+        <w:rPr>
+          <w:lang w:val="es-MX" w:eastAsia="zh-CN"/>
+        </w:rPr>
+        <w:t>freelancer</w:t>
+      </w:r>
+      <w:proofErr w:type="spellEnd"/>
+      <w:r>
+        <w:rPr>
+          <w:lang w:val="es-MX" w:eastAsia="zh-CN"/>
+        </w:rPr>
+        <w:t xml:space="preserve">, quien durante la entrevista expresó un interés claro en contar con su propio portafolio digital para exhibir sus renders y proyectos. Se comprometió a proporcionar el material gráfico necesario y a participar en la definición de contenidos. El sistema no modifica los procesos actuales del </w:t>
+      </w:r>
+      <w:proofErr w:type="gramStart"/>
+      <w:r>
+        <w:rPr>
+          <w:lang w:val="es-MX" w:eastAsia="zh-CN"/>
+        </w:rPr>
+        <w:t>arquitecto</w:t>
+      </w:r>
+      <w:proofErr w:type="gramEnd"/>
+      <w:r>
+        <w:rPr>
+          <w:lang w:val="es-MX" w:eastAsia="zh-CN"/>
+        </w:rPr>
+        <w:t xml:space="preserve"> sino que añade un canal de exhibición. La capacitación requerida es mínima y los usuarios finales no requieren capacitación alguna. No existen consideraciones éticas o legales adversas.</w:t>
+      </w:r>
+    </w:p>
+    <w:p>
+      <w:pPr>
+        <w:rPr>
+          <w:lang w:val="es-MX" w:eastAsia="zh-CN"/>
+        </w:rPr>
+      </w:pPr>
     </w:p>
     <w:p>
       <w:pPr>
@@ -6190,6 +7872,195 @@
     </w:p>
     <w:p>
       <w:pPr>
+        <w:pStyle w:val="Prrafodelista"/>
+        <w:numPr>
+          <w:ilvl w:val="0"/>
+          <w:numId w:val="49"/>
+        </w:numPr>
+        <w:jc w:val="both"/>
+        <w:rPr>
+          <w:rFonts w:ascii="Aptos" w:hAnsi="Aptos"/>
+          <w:lang w:val="es-MX"/>
+        </w:rPr>
+      </w:pPr>
+      <w:r>
+        <w:rPr>
+          <w:rFonts w:ascii="Aptos" w:hAnsi="Aptos"/>
+          <w:lang w:val="es-MX"/>
+        </w:rPr>
+        <w:t>RF01: El sistema debe mostrar un encabezado con el nombre completo y profesión del arquitecto.</w:t>
+      </w:r>
+    </w:p>
+    <w:p>
+      <w:pPr>
+        <w:numPr>
+          <w:ilvl w:val="0"/>
+          <w:numId w:val="49"/>
+        </w:numPr>
+        <w:jc w:val="both"/>
+        <w:rPr>
+          <w:rFonts w:ascii="Aptos" w:hAnsi="Aptos"/>
+          <w:lang w:val="es-MX"/>
+        </w:rPr>
+      </w:pPr>
+      <w:r>
+        <w:rPr>
+          <w:rFonts w:ascii="Aptos" w:hAnsi="Aptos"/>
+          <w:lang w:val="es-MX"/>
+        </w:rPr>
+        <w:t xml:space="preserve">RF02: El sistema debe incluir una galería de renders 3D en formato </w:t>
+      </w:r>
+      <w:proofErr w:type="spellStart"/>
+      <w:r>
+        <w:rPr>
+          <w:rFonts w:ascii="Aptos" w:hAnsi="Aptos"/>
+          <w:lang w:val="es-MX"/>
+        </w:rPr>
+        <w:t>grid</w:t>
+      </w:r>
+      <w:proofErr w:type="spellEnd"/>
+      <w:r>
+        <w:rPr>
+          <w:rFonts w:ascii="Aptos" w:hAnsi="Aptos"/>
+          <w:lang w:val="es-MX"/>
+        </w:rPr>
+        <w:t xml:space="preserve"> con imágenes optimizadas.</w:t>
+      </w:r>
+    </w:p>
+    <w:p>
+      <w:pPr>
+        <w:numPr>
+          <w:ilvl w:val="0"/>
+          <w:numId w:val="49"/>
+        </w:numPr>
+        <w:jc w:val="both"/>
+        <w:rPr>
+          <w:rFonts w:ascii="Aptos" w:hAnsi="Aptos"/>
+          <w:lang w:val="es-MX"/>
+        </w:rPr>
+      </w:pPr>
+      <w:r>
+        <w:rPr>
+          <w:rFonts w:ascii="Aptos" w:hAnsi="Aptos"/>
+          <w:lang w:val="es-MX"/>
+        </w:rPr>
+        <w:t xml:space="preserve">RF03: La galería debe incluir efecto </w:t>
+      </w:r>
+      <w:proofErr w:type="spellStart"/>
+      <w:r>
+        <w:rPr>
+          <w:rFonts w:ascii="Aptos" w:hAnsi="Aptos"/>
+          <w:lang w:val="es-MX"/>
+        </w:rPr>
+        <w:t>hover</w:t>
+      </w:r>
+      <w:proofErr w:type="spellEnd"/>
+      <w:r>
+        <w:rPr>
+          <w:rFonts w:ascii="Aptos" w:hAnsi="Aptos"/>
+          <w:lang w:val="es-MX"/>
+        </w:rPr>
+        <w:t xml:space="preserve"> y vista ampliada (modal) al seleccionar una imagen.</w:t>
+      </w:r>
+    </w:p>
+    <w:p>
+      <w:pPr>
+        <w:numPr>
+          <w:ilvl w:val="0"/>
+          <w:numId w:val="49"/>
+        </w:numPr>
+        <w:jc w:val="both"/>
+        <w:rPr>
+          <w:rFonts w:ascii="Aptos" w:hAnsi="Aptos"/>
+          <w:lang w:val="es-MX"/>
+        </w:rPr>
+      </w:pPr>
+      <w:r>
+        <w:rPr>
+          <w:rFonts w:ascii="Aptos" w:hAnsi="Aptos"/>
+          <w:lang w:val="es-MX"/>
+        </w:rPr>
+        <w:t>RF04: El sistema debe presentar un catálogo de servicios con tarjetas o bloques visuales, incluyendo breve descripción por servicio (diseño residencial, remodelación, renders 3D, diseño de interiores).</w:t>
+      </w:r>
+    </w:p>
+    <w:p>
+      <w:pPr>
+        <w:numPr>
+          <w:ilvl w:val="0"/>
+          <w:numId w:val="49"/>
+        </w:numPr>
+        <w:jc w:val="both"/>
+        <w:rPr>
+          <w:rFonts w:ascii="Aptos" w:hAnsi="Aptos"/>
+          <w:lang w:val="es-MX"/>
+        </w:rPr>
+      </w:pPr>
+      <w:r>
+        <w:rPr>
+          <w:rFonts w:ascii="Aptos" w:hAnsi="Aptos"/>
+          <w:lang w:val="es-MX"/>
+        </w:rPr>
+        <w:t>RF05: El sistema debe incluir una sección de contacto con información del arquitecto.</w:t>
+      </w:r>
+    </w:p>
+    <w:p>
+      <w:pPr>
+        <w:numPr>
+          <w:ilvl w:val="0"/>
+          <w:numId w:val="49"/>
+        </w:numPr>
+        <w:jc w:val="both"/>
+        <w:rPr>
+          <w:rFonts w:ascii="Aptos" w:hAnsi="Aptos"/>
+          <w:lang w:val="es-MX"/>
+        </w:rPr>
+      </w:pPr>
+      <w:r>
+        <w:rPr>
+          <w:rFonts w:ascii="Aptos" w:hAnsi="Aptos"/>
+          <w:lang w:val="es-MX"/>
+        </w:rPr>
+        <w:t>RF06: El sistema debe contar con navegación interna entre secciones (inicio, portafolio, servicios, contacto).</w:t>
+      </w:r>
+    </w:p>
+    <w:p>
+      <w:pPr>
+        <w:numPr>
+          <w:ilvl w:val="0"/>
+          <w:numId w:val="49"/>
+        </w:numPr>
+        <w:jc w:val="both"/>
+        <w:rPr>
+          <w:rFonts w:ascii="Aptos" w:hAnsi="Aptos"/>
+          <w:lang w:val="es-MX"/>
+        </w:rPr>
+      </w:pPr>
+      <w:r>
+        <w:rPr>
+          <w:rFonts w:ascii="Aptos" w:hAnsi="Aptos"/>
+          <w:lang w:val="es-MX"/>
+        </w:rPr>
+        <w:t xml:space="preserve">RF07: El sistema debe permitir </w:t>
+      </w:r>
+      <w:proofErr w:type="spellStart"/>
+      <w:r>
+        <w:rPr>
+          <w:rFonts w:ascii="Aptos" w:hAnsi="Aptos"/>
+          <w:lang w:val="es-MX"/>
+        </w:rPr>
+        <w:t>scroll</w:t>
+      </w:r>
+      <w:proofErr w:type="spellEnd"/>
+      <w:r>
+        <w:rPr>
+          <w:rFonts w:ascii="Aptos" w:hAnsi="Aptos"/>
+          <w:lang w:val="es-MX"/>
+        </w:rPr>
+        <w:t xml:space="preserve"> suave entre secciones.</w:t>
+      </w:r>
+    </w:p>
+    <w:p>
+      <w:pPr>
         <w:ind w:left="360"/>
         <w:jc w:val="both"/>
         <w:rPr>
@@ -6197,13 +8068,6 @@
           <w:lang w:val="es-MX"/>
         </w:rPr>
       </w:pPr>
-      <w:r>
-        <w:rPr>
-          <w:rFonts w:ascii="Aptos" w:hAnsi="Aptos"/>
-          <w:lang w:val="es-MX"/>
-        </w:rPr>
-        <w:t>…</w:t>
-      </w:r>
     </w:p>
     <w:p>
       <w:pPr>
@@ -6238,20 +8102,154 @@
     </w:p>
     <w:p>
       <w:pPr>
+        <w:pStyle w:val="Prrafodelista"/>
+        <w:numPr>
+          <w:ilvl w:val="0"/>
+          <w:numId w:val="50"/>
+        </w:numPr>
+        <w:jc w:val="both"/>
+        <w:rPr>
+          <w:lang w:val="es-MX" w:eastAsia="zh-CN"/>
+        </w:rPr>
+      </w:pPr>
+      <w:r>
+        <w:rPr>
+          <w:lang w:val="es-MX" w:eastAsia="zh-CN"/>
+        </w:rPr>
+        <w:t xml:space="preserve">RNF01: El sitio debe ser responsivo y funcionar correctamente en desktop, </w:t>
+      </w:r>
+      <w:proofErr w:type="spellStart"/>
+      <w:r>
+        <w:rPr>
+          <w:lang w:val="es-MX" w:eastAsia="zh-CN"/>
+        </w:rPr>
+        <w:t>tablet</w:t>
+      </w:r>
+      <w:proofErr w:type="spellEnd"/>
+      <w:r>
+        <w:rPr>
+          <w:lang w:val="es-MX" w:eastAsia="zh-CN"/>
+        </w:rPr>
+        <w:t xml:space="preserve"> y móvil.</w:t>
+      </w:r>
+    </w:p>
+    <w:p>
+      <w:pPr>
+        <w:numPr>
+          <w:ilvl w:val="0"/>
+          <w:numId w:val="50"/>
+        </w:numPr>
+        <w:jc w:val="both"/>
+        <w:rPr>
+          <w:lang w:val="es-MX" w:eastAsia="zh-CN"/>
+        </w:rPr>
+      </w:pPr>
+      <w:r>
+        <w:rPr>
+          <w:lang w:val="es-MX" w:eastAsia="zh-CN"/>
+        </w:rPr>
+        <w:t>RNF02: El tiempo de carga de la página principal no debe exceder 3 segundos en una conexión estándar.</w:t>
+      </w:r>
+    </w:p>
+    <w:p>
+      <w:pPr>
+        <w:numPr>
+          <w:ilvl w:val="0"/>
+          <w:numId w:val="50"/>
+        </w:numPr>
+        <w:jc w:val="both"/>
+        <w:rPr>
+          <w:lang w:val="es-MX" w:eastAsia="zh-CN"/>
+        </w:rPr>
+      </w:pPr>
+      <w:r>
+        <w:rPr>
+          <w:lang w:val="es-MX" w:eastAsia="zh-CN"/>
+        </w:rPr>
+        <w:t>RNF03: Las imágenes de renders deben estar optimizadas para web sin pérdida significativa de calidad visual.</w:t>
+      </w:r>
+    </w:p>
+    <w:p>
+      <w:pPr>
+        <w:numPr>
+          <w:ilvl w:val="0"/>
+          <w:numId w:val="50"/>
+        </w:numPr>
+        <w:jc w:val="both"/>
+        <w:rPr>
+          <w:lang w:val="es-MX" w:eastAsia="zh-CN"/>
+        </w:rPr>
+      </w:pPr>
+      <w:r>
+        <w:rPr>
+          <w:lang w:val="es-MX" w:eastAsia="zh-CN"/>
+        </w:rPr>
+        <w:t>RNF04: El diseño debe ser minimalista, moderno y centrado en lo visual, siguiendo principios UX/UI.</w:t>
+      </w:r>
+    </w:p>
+    <w:p>
+      <w:pPr>
+        <w:numPr>
+          <w:ilvl w:val="0"/>
+          <w:numId w:val="50"/>
+        </w:numPr>
+        <w:jc w:val="both"/>
+        <w:rPr>
+          <w:lang w:val="es-MX" w:eastAsia="zh-CN"/>
+        </w:rPr>
+      </w:pPr>
+      <w:r>
+        <w:rPr>
+          <w:lang w:val="es-MX" w:eastAsia="zh-CN"/>
+        </w:rPr>
+        <w:t>RNF05: El sistema debe contar con certificado SSL para navegación segura.</w:t>
+      </w:r>
+    </w:p>
+    <w:p>
+      <w:pPr>
+        <w:numPr>
+          <w:ilvl w:val="0"/>
+          <w:numId w:val="50"/>
+        </w:numPr>
+        <w:jc w:val="both"/>
+        <w:rPr>
+          <w:lang w:val="es-MX" w:eastAsia="zh-CN"/>
+        </w:rPr>
+      </w:pPr>
+      <w:r>
+        <w:rPr>
+          <w:lang w:val="es-MX" w:eastAsia="zh-CN"/>
+        </w:rPr>
+        <w:t>RNF06: El sistema debe ser compatible con los navegadores principales (Chrome, Firefox, Safari, Edge).</w:t>
+      </w:r>
+    </w:p>
+    <w:p>
+      <w:pPr>
+        <w:numPr>
+          <w:ilvl w:val="0"/>
+          <w:numId w:val="50"/>
+        </w:numPr>
+        <w:jc w:val="both"/>
+        <w:rPr>
+          <w:lang w:val="es-MX" w:eastAsia="zh-CN"/>
+        </w:rPr>
+      </w:pPr>
+      <w:r>
+        <w:rPr>
+          <w:lang w:val="es-MX" w:eastAsia="zh-CN"/>
+        </w:rPr>
+        <w:lastRenderedPageBreak/>
+        <w:t>RNF07: La estructura del código debe ser modular para facilitar futuras actualizaciones y ampliaciones.</w:t>
+      </w:r>
+    </w:p>
+    <w:p>
+      <w:pPr>
         <w:ind w:firstLine="360"/>
         <w:jc w:val="both"/>
         <w:rPr>
-          <w:rFonts w:ascii="Aptos" w:hAnsi="Aptos"/>
-          <w:lang w:val="es-MX"/>
-        </w:rPr>
-      </w:pPr>
-      <w:r>
-        <w:rPr>
           <w:lang w:val="es-MX" w:eastAsia="zh-CN"/>
         </w:rPr>
-        <w:lastRenderedPageBreak/>
-        <w:t>..</w:t>
-      </w:r>
+      </w:pPr>
     </w:p>
     <w:p>
       <w:pPr>
@@ -7070,6 +9068,7 @@
           <w:rFonts w:ascii="Aptos" w:hAnsi="Aptos"/>
           <w:lang w:val="es-MX"/>
         </w:rPr>
+        <w:lastRenderedPageBreak/>
         <w:t>…</w:t>
       </w:r>
     </w:p>
@@ -7100,7 +9099,6 @@
         <w:rPr>
           <w:rFonts w:ascii="Aptos" w:hAnsi="Aptos"/>
         </w:rPr>
-        <w:lastRenderedPageBreak/>
         <w:t>Actividades Realizadas</w:t>
       </w:r>
       <w:bookmarkEnd w:id="34"/>
@@ -7919,6 +9917,7 @@
         <w:rPr>
           <w:lang w:val="es-MX" w:eastAsia="zh-CN"/>
         </w:rPr>
+        <w:lastRenderedPageBreak/>
         <w:t>--</w:t>
       </w:r>
     </w:p>
@@ -7931,6 +9930,7 @@
         </w:rPr>
       </w:pPr>
     </w:p>
+    <w:bookmarkStart w:id="44" w:name="_Toc229479502"/>
     <w:p>
       <w:pPr>
         <w:pStyle w:val="Ttulo0"/>
@@ -7945,13 +9945,11 @@
           <w:color w:val="FFFFFF" w:themeColor="background1"/>
         </w:rPr>
       </w:pPr>
-      <w:bookmarkStart w:id="44" w:name="_Toc229479502"/>
       <w:r>
         <w:rPr>
           <w:noProof/>
           <w:color w:val="FFFFFF" w:themeColor="background1"/>
         </w:rPr>
-        <w:lastRenderedPageBreak/>
         <mc:AlternateContent>
           <mc:Choice Requires="wps">
             <w:drawing>
@@ -10106,6 +12104,155 @@
     </w:lvl>
   </w:abstractNum>
   <w:abstractNum w:abstractNumId="15" w15:restartNumberingAfterBreak="0">
+    <w:nsid w:val="4B716CA7"/>
+    <w:multiLevelType w:val="multilevel"/>
+    <w:tmpl w:val="3EAC95F0"/>
+    <w:lvl w:ilvl="0">
+      <w:start w:val="1"/>
+      <w:numFmt w:val="bullet"/>
+      <w:lvlText w:val=""/>
+      <w:lvlJc w:val="left"/>
+      <w:pPr>
+        <w:tabs>
+          <w:tab w:val="num" w:pos="720"/>
+        </w:tabs>
+        <w:ind w:left="720" w:hanging="360"/>
+      </w:pPr>
+      <w:rPr>
+        <w:rFonts w:ascii="Symbol" w:hAnsi="Symbol" w:hint="default"/>
+        <w:sz w:val="20"/>
+      </w:rPr>
+    </w:lvl>
+    <w:lvl w:ilvl="1" w:tentative="1">
+      <w:start w:val="1"/>
+      <w:numFmt w:val="bullet"/>
+      <w:lvlText w:val="o"/>
+      <w:lvlJc w:val="left"/>
+      <w:pPr>
+        <w:tabs>
+          <w:tab w:val="num" w:pos="1440"/>
+        </w:tabs>
+        <w:ind w:left="1440" w:hanging="360"/>
+      </w:pPr>
+      <w:rPr>
+        <w:rFonts w:ascii="Courier New" w:hAnsi="Courier New" w:hint="default"/>
+        <w:sz w:val="20"/>
+      </w:rPr>
+    </w:lvl>
+    <w:lvl w:ilvl="2" w:tentative="1">
+      <w:start w:val="1"/>
+      <w:numFmt w:val="bullet"/>
+      <w:lvlText w:val=""/>
+      <w:lvlJc w:val="left"/>
+      <w:pPr>
+        <w:tabs>
+          <w:tab w:val="num" w:pos="2160"/>
+        </w:tabs>
+        <w:ind w:left="2160" w:hanging="360"/>
+      </w:pPr>
+      <w:rPr>
+        <w:rFonts w:ascii="Wingdings" w:hAnsi="Wingdings" w:hint="default"/>
+        <w:sz w:val="20"/>
+      </w:rPr>
+    </w:lvl>
+    <w:lvl w:ilvl="3" w:tentative="1">
+      <w:start w:val="1"/>
+      <w:numFmt w:val="bullet"/>
+      <w:lvlText w:val=""/>
+      <w:lvlJc w:val="left"/>
+      <w:pPr>
+        <w:tabs>
+          <w:tab w:val="num" w:pos="2880"/>
+        </w:tabs>
+        <w:ind w:left="2880" w:hanging="360"/>
+      </w:pPr>
+      <w:rPr>
+        <w:rFonts w:ascii="Wingdings" w:hAnsi="Wingdings" w:hint="default"/>
+        <w:sz w:val="20"/>
+      </w:rPr>
+    </w:lvl>
+    <w:lvl w:ilvl="4" w:tentative="1">
+      <w:start w:val="1"/>
+      <w:numFmt w:val="bullet"/>
+      <w:lvlText w:val=""/>
+      <w:lvlJc w:val="left"/>
+      <w:pPr>
+        <w:tabs>
+          <w:tab w:val="num" w:pos="3600"/>
+        </w:tabs>
+        <w:ind w:left="3600" w:hanging="360"/>
+      </w:pPr>
+      <w:rPr>
+        <w:rFonts w:ascii="Wingdings" w:hAnsi="Wingdings" w:hint="default"/>
+        <w:sz w:val="20"/>
+      </w:rPr>
+    </w:lvl>
+    <w:lvl w:ilvl="5" w:tentative="1">
+      <w:start w:val="1"/>
+      <w:numFmt w:val="bullet"/>
+      <w:lvlText w:val=""/>
+      <w:lvlJc w:val="left"/>
+      <w:pPr>
+        <w:tabs>
+          <w:tab w:val="num" w:pos="4320"/>
+        </w:tabs>
+        <w:ind w:left="4320" w:hanging="360"/>
+      </w:pPr>
+      <w:rPr>
+        <w:rFonts w:ascii="Wingdings" w:hAnsi="Wingdings" w:hint="default"/>
+        <w:sz w:val="20"/>
+      </w:rPr>
+    </w:lvl>
+    <w:lvl w:ilvl="6" w:tentative="1">
+      <w:start w:val="1"/>
+      <w:numFmt w:val="bullet"/>
+      <w:lvlText w:val=""/>
+      <w:lvlJc w:val="left"/>
+      <w:pPr>
+        <w:tabs>
+          <w:tab w:val="num" w:pos="5040"/>
+        </w:tabs>
+        <w:ind w:left="5040" w:hanging="360"/>
+      </w:pPr>
+      <w:rPr>
+        <w:rFonts w:ascii="Wingdings" w:hAnsi="Wingdings" w:hint="default"/>
+        <w:sz w:val="20"/>
+      </w:rPr>
+    </w:lvl>
+    <w:lvl w:ilvl="7" w:tentative="1">
+      <w:start w:val="1"/>
+      <w:numFmt w:val="bullet"/>
+      <w:lvlText w:val=""/>
+      <w:lvlJc w:val="left"/>
+      <w:pPr>
+        <w:tabs>
+          <w:tab w:val="num" w:pos="5760"/>
+        </w:tabs>
+        <w:ind w:left="5760" w:hanging="360"/>
+      </w:pPr>
+      <w:rPr>
+        <w:rFonts w:ascii="Wingdings" w:hAnsi="Wingdings" w:hint="default"/>
+        <w:sz w:val="20"/>
+      </w:rPr>
+    </w:lvl>
+    <w:lvl w:ilvl="8" w:tentative="1">
+      <w:start w:val="1"/>
+      <w:numFmt w:val="bullet"/>
+      <w:lvlText w:val=""/>
+      <w:lvlJc w:val="left"/>
+      <w:pPr>
+        <w:tabs>
+          <w:tab w:val="num" w:pos="6480"/>
+        </w:tabs>
+        <w:ind w:left="6480" w:hanging="360"/>
+      </w:pPr>
+      <w:rPr>
+        <w:rFonts w:ascii="Wingdings" w:hAnsi="Wingdings" w:hint="default"/>
+        <w:sz w:val="20"/>
+      </w:rPr>
+    </w:lvl>
+  </w:abstractNum>
+  <w:abstractNum w:abstractNumId="16" w15:restartNumberingAfterBreak="0">
     <w:nsid w:val="4F926886"/>
     <w:multiLevelType w:val="multilevel"/>
     <w:tmpl w:val="7A64C20E"/>
@@ -10218,7 +12365,7 @@
       </w:rPr>
     </w:lvl>
   </w:abstractNum>
-  <w:abstractNum w:abstractNumId="16" w15:restartNumberingAfterBreak="0">
+  <w:abstractNum w:abstractNumId="17" w15:restartNumberingAfterBreak="0">
     <w:nsid w:val="4F995FF3"/>
     <w:multiLevelType w:val="multilevel"/>
     <w:tmpl w:val="764CAAEE"/>
@@ -10367,7 +12514,7 @@
       </w:rPr>
     </w:lvl>
   </w:abstractNum>
-  <w:abstractNum w:abstractNumId="17" w15:restartNumberingAfterBreak="0">
+  <w:abstractNum w:abstractNumId="18" w15:restartNumberingAfterBreak="0">
     <w:nsid w:val="524F5C40"/>
     <w:multiLevelType w:val="hybridMultilevel"/>
     <w:tmpl w:val="9E989372"/>
@@ -10453,7 +12600,7 @@
       </w:pPr>
     </w:lvl>
   </w:abstractNum>
-  <w:abstractNum w:abstractNumId="18" w15:restartNumberingAfterBreak="0">
+  <w:abstractNum w:abstractNumId="19" w15:restartNumberingAfterBreak="0">
     <w:nsid w:val="53EE12D1"/>
     <w:multiLevelType w:val="hybridMultilevel"/>
     <w:tmpl w:val="292E466C"/>
@@ -10540,7 +12687,7 @@
       </w:pPr>
     </w:lvl>
   </w:abstractNum>
-  <w:abstractNum w:abstractNumId="19" w15:restartNumberingAfterBreak="0">
+  <w:abstractNum w:abstractNumId="20" w15:restartNumberingAfterBreak="0">
     <w:nsid w:val="575D55A8"/>
     <w:multiLevelType w:val="multilevel"/>
     <w:tmpl w:val="B7663982"/>
@@ -10689,7 +12836,156 @@
       </w:rPr>
     </w:lvl>
   </w:abstractNum>
-  <w:abstractNum w:abstractNumId="20" w15:restartNumberingAfterBreak="0">
+  <w:abstractNum w:abstractNumId="21" w15:restartNumberingAfterBreak="0">
+    <w:nsid w:val="5C1F517B"/>
+    <w:multiLevelType w:val="multilevel"/>
+    <w:tmpl w:val="325EC078"/>
+    <w:lvl w:ilvl="0">
+      <w:start w:val="1"/>
+      <w:numFmt w:val="bullet"/>
+      <w:lvlText w:val=""/>
+      <w:lvlJc w:val="left"/>
+      <w:pPr>
+        <w:tabs>
+          <w:tab w:val="num" w:pos="720"/>
+        </w:tabs>
+        <w:ind w:left="720" w:hanging="360"/>
+      </w:pPr>
+      <w:rPr>
+        <w:rFonts w:ascii="Symbol" w:hAnsi="Symbol" w:hint="default"/>
+        <w:sz w:val="20"/>
+      </w:rPr>
+    </w:lvl>
+    <w:lvl w:ilvl="1" w:tentative="1">
+      <w:start w:val="1"/>
+      <w:numFmt w:val="bullet"/>
+      <w:lvlText w:val="o"/>
+      <w:lvlJc w:val="left"/>
+      <w:pPr>
+        <w:tabs>
+          <w:tab w:val="num" w:pos="1440"/>
+        </w:tabs>
+        <w:ind w:left="1440" w:hanging="360"/>
+      </w:pPr>
+      <w:rPr>
+        <w:rFonts w:ascii="Courier New" w:hAnsi="Courier New" w:hint="default"/>
+        <w:sz w:val="20"/>
+      </w:rPr>
+    </w:lvl>
+    <w:lvl w:ilvl="2" w:tentative="1">
+      <w:start w:val="1"/>
+      <w:numFmt w:val="bullet"/>
+      <w:lvlText w:val=""/>
+      <w:lvlJc w:val="left"/>
+      <w:pPr>
+        <w:tabs>
+          <w:tab w:val="num" w:pos="2160"/>
+        </w:tabs>
+        <w:ind w:left="2160" w:hanging="360"/>
+      </w:pPr>
+      <w:rPr>
+        <w:rFonts w:ascii="Wingdings" w:hAnsi="Wingdings" w:hint="default"/>
+        <w:sz w:val="20"/>
+      </w:rPr>
+    </w:lvl>
+    <w:lvl w:ilvl="3" w:tentative="1">
+      <w:start w:val="1"/>
+      <w:numFmt w:val="bullet"/>
+      <w:lvlText w:val=""/>
+      <w:lvlJc w:val="left"/>
+      <w:pPr>
+        <w:tabs>
+          <w:tab w:val="num" w:pos="2880"/>
+        </w:tabs>
+        <w:ind w:left="2880" w:hanging="360"/>
+      </w:pPr>
+      <w:rPr>
+        <w:rFonts w:ascii="Wingdings" w:hAnsi="Wingdings" w:hint="default"/>
+        <w:sz w:val="20"/>
+      </w:rPr>
+    </w:lvl>
+    <w:lvl w:ilvl="4" w:tentative="1">
+      <w:start w:val="1"/>
+      <w:numFmt w:val="bullet"/>
+      <w:lvlText w:val=""/>
+      <w:lvlJc w:val="left"/>
+      <w:pPr>
+        <w:tabs>
+          <w:tab w:val="num" w:pos="3600"/>
+        </w:tabs>
+        <w:ind w:left="3600" w:hanging="360"/>
+      </w:pPr>
+      <w:rPr>
+        <w:rFonts w:ascii="Wingdings" w:hAnsi="Wingdings" w:hint="default"/>
+        <w:sz w:val="20"/>
+      </w:rPr>
+    </w:lvl>
+    <w:lvl w:ilvl="5" w:tentative="1">
+      <w:start w:val="1"/>
+      <w:numFmt w:val="bullet"/>
+      <w:lvlText w:val=""/>
+      <w:lvlJc w:val="left"/>
+      <w:pPr>
+        <w:tabs>
+          <w:tab w:val="num" w:pos="4320"/>
+        </w:tabs>
+        <w:ind w:left="4320" w:hanging="360"/>
+      </w:pPr>
+      <w:rPr>
+        <w:rFonts w:ascii="Wingdings" w:hAnsi="Wingdings" w:hint="default"/>
+        <w:sz w:val="20"/>
+      </w:rPr>
+    </w:lvl>
+    <w:lvl w:ilvl="6" w:tentative="1">
+      <w:start w:val="1"/>
+      <w:numFmt w:val="bullet"/>
+      <w:lvlText w:val=""/>
+      <w:lvlJc w:val="left"/>
+      <w:pPr>
+        <w:tabs>
+          <w:tab w:val="num" w:pos="5040"/>
+        </w:tabs>
+        <w:ind w:left="5040" w:hanging="360"/>
+      </w:pPr>
+      <w:rPr>
+        <w:rFonts w:ascii="Wingdings" w:hAnsi="Wingdings" w:hint="default"/>
+        <w:sz w:val="20"/>
+      </w:rPr>
+    </w:lvl>
+    <w:lvl w:ilvl="7" w:tentative="1">
+      <w:start w:val="1"/>
+      <w:numFmt w:val="bullet"/>
+      <w:lvlText w:val=""/>
+      <w:lvlJc w:val="left"/>
+      <w:pPr>
+        <w:tabs>
+          <w:tab w:val="num" w:pos="5760"/>
+        </w:tabs>
+        <w:ind w:left="5760" w:hanging="360"/>
+      </w:pPr>
+      <w:rPr>
+        <w:rFonts w:ascii="Wingdings" w:hAnsi="Wingdings" w:hint="default"/>
+        <w:sz w:val="20"/>
+      </w:rPr>
+    </w:lvl>
+    <w:lvl w:ilvl="8" w:tentative="1">
+      <w:start w:val="1"/>
+      <w:numFmt w:val="bullet"/>
+      <w:lvlText w:val=""/>
+      <w:lvlJc w:val="left"/>
+      <w:pPr>
+        <w:tabs>
+          <w:tab w:val="num" w:pos="6480"/>
+        </w:tabs>
+        <w:ind w:left="6480" w:hanging="360"/>
+      </w:pPr>
+      <w:rPr>
+        <w:rFonts w:ascii="Wingdings" w:hAnsi="Wingdings" w:hint="default"/>
+        <w:sz w:val="20"/>
+      </w:rPr>
+    </w:lvl>
+  </w:abstractNum>
+  <w:abstractNum w:abstractNumId="22" w15:restartNumberingAfterBreak="0">
     <w:nsid w:val="62330250"/>
     <w:multiLevelType w:val="hybridMultilevel"/>
     <w:tmpl w:val="D17C20DE"/>
@@ -10801,7 +13097,7 @@
       </w:rPr>
     </w:lvl>
   </w:abstractNum>
-  <w:abstractNum w:abstractNumId="21" w15:restartNumberingAfterBreak="0">
+  <w:abstractNum w:abstractNumId="23" w15:restartNumberingAfterBreak="0">
     <w:nsid w:val="64CA61D0"/>
     <w:multiLevelType w:val="hybridMultilevel"/>
     <w:tmpl w:val="569E4CCA"/>
@@ -10914,7 +13210,7 @@
       </w:rPr>
     </w:lvl>
   </w:abstractNum>
-  <w:abstractNum w:abstractNumId="22" w15:restartNumberingAfterBreak="0">
+  <w:abstractNum w:abstractNumId="24" w15:restartNumberingAfterBreak="0">
     <w:nsid w:val="64D47160"/>
     <w:multiLevelType w:val="multilevel"/>
     <w:tmpl w:val="E808F888"/>
@@ -11028,7 +13324,156 @@
       </w:rPr>
     </w:lvl>
   </w:abstractNum>
-  <w:abstractNum w:abstractNumId="23" w15:restartNumberingAfterBreak="0">
+  <w:abstractNum w:abstractNumId="25" w15:restartNumberingAfterBreak="0">
+    <w:nsid w:val="66E4048F"/>
+    <w:multiLevelType w:val="multilevel"/>
+    <w:tmpl w:val="38B28578"/>
+    <w:lvl w:ilvl="0">
+      <w:start w:val="1"/>
+      <w:numFmt w:val="bullet"/>
+      <w:lvlText w:val=""/>
+      <w:lvlJc w:val="left"/>
+      <w:pPr>
+        <w:tabs>
+          <w:tab w:val="num" w:pos="720"/>
+        </w:tabs>
+        <w:ind w:left="720" w:hanging="360"/>
+      </w:pPr>
+      <w:rPr>
+        <w:rFonts w:ascii="Symbol" w:hAnsi="Symbol" w:hint="default"/>
+        <w:sz w:val="20"/>
+      </w:rPr>
+    </w:lvl>
+    <w:lvl w:ilvl="1" w:tentative="1">
+      <w:start w:val="1"/>
+      <w:numFmt w:val="bullet"/>
+      <w:lvlText w:val="o"/>
+      <w:lvlJc w:val="left"/>
+      <w:pPr>
+        <w:tabs>
+          <w:tab w:val="num" w:pos="1440"/>
+        </w:tabs>
+        <w:ind w:left="1440" w:hanging="360"/>
+      </w:pPr>
+      <w:rPr>
+        <w:rFonts w:ascii="Courier New" w:hAnsi="Courier New" w:hint="default"/>
+        <w:sz w:val="20"/>
+      </w:rPr>
+    </w:lvl>
+    <w:lvl w:ilvl="2" w:tentative="1">
+      <w:start w:val="1"/>
+      <w:numFmt w:val="bullet"/>
+      <w:lvlText w:val=""/>
+      <w:lvlJc w:val="left"/>
+      <w:pPr>
+        <w:tabs>
+          <w:tab w:val="num" w:pos="2160"/>
+        </w:tabs>
+        <w:ind w:left="2160" w:hanging="360"/>
+      </w:pPr>
+      <w:rPr>
+        <w:rFonts w:ascii="Wingdings" w:hAnsi="Wingdings" w:hint="default"/>
+        <w:sz w:val="20"/>
+      </w:rPr>
+    </w:lvl>
+    <w:lvl w:ilvl="3" w:tentative="1">
+      <w:start w:val="1"/>
+      <w:numFmt w:val="bullet"/>
+      <w:lvlText w:val=""/>
+      <w:lvlJc w:val="left"/>
+      <w:pPr>
+        <w:tabs>
+          <w:tab w:val="num" w:pos="2880"/>
+        </w:tabs>
+        <w:ind w:left="2880" w:hanging="360"/>
+      </w:pPr>
+      <w:rPr>
+        <w:rFonts w:ascii="Wingdings" w:hAnsi="Wingdings" w:hint="default"/>
+        <w:sz w:val="20"/>
+      </w:rPr>
+    </w:lvl>
+    <w:lvl w:ilvl="4" w:tentative="1">
+      <w:start w:val="1"/>
+      <w:numFmt w:val="bullet"/>
+      <w:lvlText w:val=""/>
+      <w:lvlJc w:val="left"/>
+      <w:pPr>
+        <w:tabs>
+          <w:tab w:val="num" w:pos="3600"/>
+        </w:tabs>
+        <w:ind w:left="3600" w:hanging="360"/>
+      </w:pPr>
+      <w:rPr>
+        <w:rFonts w:ascii="Wingdings" w:hAnsi="Wingdings" w:hint="default"/>
+        <w:sz w:val="20"/>
+      </w:rPr>
+    </w:lvl>
+    <w:lvl w:ilvl="5" w:tentative="1">
+      <w:start w:val="1"/>
+      <w:numFmt w:val="bullet"/>
+      <w:lvlText w:val=""/>
+      <w:lvlJc w:val="left"/>
+      <w:pPr>
+        <w:tabs>
+          <w:tab w:val="num" w:pos="4320"/>
+        </w:tabs>
+        <w:ind w:left="4320" w:hanging="360"/>
+      </w:pPr>
+      <w:rPr>
+        <w:rFonts w:ascii="Wingdings" w:hAnsi="Wingdings" w:hint="default"/>
+        <w:sz w:val="20"/>
+      </w:rPr>
+    </w:lvl>
+    <w:lvl w:ilvl="6" w:tentative="1">
+      <w:start w:val="1"/>
+      <w:numFmt w:val="bullet"/>
+      <w:lvlText w:val=""/>
+      <w:lvlJc w:val="left"/>
+      <w:pPr>
+        <w:tabs>
+          <w:tab w:val="num" w:pos="5040"/>
+        </w:tabs>
+        <w:ind w:left="5040" w:hanging="360"/>
+      </w:pPr>
+      <w:rPr>
+        <w:rFonts w:ascii="Wingdings" w:hAnsi="Wingdings" w:hint="default"/>
+        <w:sz w:val="20"/>
+      </w:rPr>
+    </w:lvl>
+    <w:lvl w:ilvl="7" w:tentative="1">
+      <w:start w:val="1"/>
+      <w:numFmt w:val="bullet"/>
+      <w:lvlText w:val=""/>
+      <w:lvlJc w:val="left"/>
+      <w:pPr>
+        <w:tabs>
+          <w:tab w:val="num" w:pos="5760"/>
+        </w:tabs>
+        <w:ind w:left="5760" w:hanging="360"/>
+      </w:pPr>
+      <w:rPr>
+        <w:rFonts w:ascii="Wingdings" w:hAnsi="Wingdings" w:hint="default"/>
+        <w:sz w:val="20"/>
+      </w:rPr>
+    </w:lvl>
+    <w:lvl w:ilvl="8" w:tentative="1">
+      <w:start w:val="1"/>
+      <w:numFmt w:val="bullet"/>
+      <w:lvlText w:val=""/>
+      <w:lvlJc w:val="left"/>
+      <w:pPr>
+        <w:tabs>
+          <w:tab w:val="num" w:pos="6480"/>
+        </w:tabs>
+        <w:ind w:left="6480" w:hanging="360"/>
+      </w:pPr>
+      <w:rPr>
+        <w:rFonts w:ascii="Wingdings" w:hAnsi="Wingdings" w:hint="default"/>
+        <w:sz w:val="20"/>
+      </w:rPr>
+    </w:lvl>
+  </w:abstractNum>
+  <w:abstractNum w:abstractNumId="26" w15:restartNumberingAfterBreak="0">
     <w:nsid w:val="69EB30DD"/>
     <w:multiLevelType w:val="hybridMultilevel"/>
     <w:tmpl w:val="9E6C2CF8"/>
@@ -11114,7 +13559,7 @@
       </w:pPr>
     </w:lvl>
   </w:abstractNum>
-  <w:abstractNum w:abstractNumId="24" w15:restartNumberingAfterBreak="0">
+  <w:abstractNum w:abstractNumId="27" w15:restartNumberingAfterBreak="0">
     <w:nsid w:val="700B1AFC"/>
     <w:multiLevelType w:val="multilevel"/>
     <w:tmpl w:val="65AE2CA4"/>
@@ -11228,7 +13673,7 @@
       </w:rPr>
     </w:lvl>
   </w:abstractNum>
-  <w:abstractNum w:abstractNumId="25" w15:restartNumberingAfterBreak="0">
+  <w:abstractNum w:abstractNumId="28" w15:restartNumberingAfterBreak="0">
     <w:nsid w:val="712028E0"/>
     <w:multiLevelType w:val="multilevel"/>
     <w:tmpl w:val="AAB8F85E"/>
@@ -11377,7 +13822,7 @@
       </w:rPr>
     </w:lvl>
   </w:abstractNum>
-  <w:abstractNum w:abstractNumId="26" w15:restartNumberingAfterBreak="0">
+  <w:abstractNum w:abstractNumId="29" w15:restartNumberingAfterBreak="0">
     <w:nsid w:val="71353B64"/>
     <w:multiLevelType w:val="multilevel"/>
     <w:tmpl w:val="30CC6976"/>
@@ -11526,7 +13971,7 @@
       </w:rPr>
     </w:lvl>
   </w:abstractNum>
-  <w:abstractNum w:abstractNumId="27" w15:restartNumberingAfterBreak="0">
+  <w:abstractNum w:abstractNumId="30" w15:restartNumberingAfterBreak="0">
     <w:nsid w:val="763F218F"/>
     <w:multiLevelType w:val="multilevel"/>
     <w:tmpl w:val="A4B6621E"/>
@@ -11675,7 +14120,7 @@
       </w:rPr>
     </w:lvl>
   </w:abstractNum>
-  <w:abstractNum w:abstractNumId="28" w15:restartNumberingAfterBreak="0">
+  <w:abstractNum w:abstractNumId="31" w15:restartNumberingAfterBreak="0">
     <w:nsid w:val="7A3A51F1"/>
     <w:multiLevelType w:val="multilevel"/>
     <w:tmpl w:val="06C64BEC"/>
@@ -11789,7 +14234,7 @@
       </w:rPr>
     </w:lvl>
   </w:abstractNum>
-  <w:abstractNum w:abstractNumId="29" w15:restartNumberingAfterBreak="0">
+  <w:abstractNum w:abstractNumId="32" w15:restartNumberingAfterBreak="0">
     <w:nsid w:val="7D323D10"/>
     <w:multiLevelType w:val="multilevel"/>
     <w:tmpl w:val="E3AE4666"/>
@@ -11902,7 +14347,7 @@
       </w:rPr>
     </w:lvl>
   </w:abstractNum>
-  <w:abstractNum w:abstractNumId="30" w15:restartNumberingAfterBreak="0">
+  <w:abstractNum w:abstractNumId="33" w15:restartNumberingAfterBreak="0">
     <w:nsid w:val="7DE626F9"/>
     <w:multiLevelType w:val="hybridMultilevel"/>
     <w:tmpl w:val="CCC89EAA"/>
@@ -12015,7 +14460,7 @@
       </w:rPr>
     </w:lvl>
   </w:abstractNum>
-  <w:abstractNum w:abstractNumId="31" w15:restartNumberingAfterBreak="0">
+  <w:abstractNum w:abstractNumId="34" w15:restartNumberingAfterBreak="0">
     <w:nsid w:val="7E3E6FFE"/>
     <w:multiLevelType w:val="hybridMultilevel"/>
     <w:tmpl w:val="60A4DEF4"/>
@@ -12104,7 +14549,7 @@
       </w:pPr>
     </w:lvl>
   </w:abstractNum>
-  <w:abstractNum w:abstractNumId="32" w15:restartNumberingAfterBreak="0">
+  <w:abstractNum w:abstractNumId="35" w15:restartNumberingAfterBreak="0">
     <w:nsid w:val="7F4A005A"/>
     <w:multiLevelType w:val="hybridMultilevel"/>
     <w:tmpl w:val="37F8A6B8"/>
@@ -12191,7 +14636,7 @@
     </w:lvl>
   </w:abstractNum>
   <w:num w:numId="1" w16cid:durableId="179203886">
-    <w:abstractNumId w:val="29"/>
+    <w:abstractNumId w:val="32"/>
   </w:num>
   <w:num w:numId="2" w16cid:durableId="1225720037">
     <w:abstractNumId w:val="14"/>
@@ -12206,16 +14651,16 @@
     <w:abstractNumId w:val="10"/>
   </w:num>
   <w:num w:numId="6" w16cid:durableId="1573000927">
-    <w:abstractNumId w:val="15"/>
+    <w:abstractNumId w:val="16"/>
   </w:num>
   <w:num w:numId="7" w16cid:durableId="250434419">
     <w:abstractNumId w:val="11"/>
   </w:num>
   <w:num w:numId="8" w16cid:durableId="570386331">
-    <w:abstractNumId w:val="24"/>
+    <w:abstractNumId w:val="27"/>
   </w:num>
   <w:num w:numId="9" w16cid:durableId="1243491530">
-    <w:abstractNumId w:val="22"/>
+    <w:abstractNumId w:val="24"/>
   </w:num>
   <w:num w:numId="10" w16cid:durableId="508761525">
     <w:abstractNumId w:val="0"/>
@@ -12224,94 +14669,94 @@
     <w:abstractNumId w:val="4"/>
   </w:num>
   <w:num w:numId="12" w16cid:durableId="1989476770">
-    <w:abstractNumId w:val="25"/>
+    <w:abstractNumId w:val="28"/>
   </w:num>
   <w:num w:numId="13" w16cid:durableId="2095079369">
-    <w:abstractNumId w:val="16"/>
+    <w:abstractNumId w:val="17"/>
   </w:num>
   <w:num w:numId="14" w16cid:durableId="398019298">
-    <w:abstractNumId w:val="26"/>
+    <w:abstractNumId w:val="29"/>
   </w:num>
   <w:num w:numId="15" w16cid:durableId="2143501457">
     <w:abstractNumId w:val="6"/>
   </w:num>
   <w:num w:numId="16" w16cid:durableId="1495687783">
-    <w:abstractNumId w:val="19"/>
+    <w:abstractNumId w:val="20"/>
   </w:num>
   <w:num w:numId="17" w16cid:durableId="2117404063">
     <w:abstractNumId w:val="7"/>
   </w:num>
   <w:num w:numId="18" w16cid:durableId="1581256841">
-    <w:abstractNumId w:val="28"/>
+    <w:abstractNumId w:val="31"/>
   </w:num>
   <w:num w:numId="19" w16cid:durableId="811679382">
-    <w:abstractNumId w:val="18"/>
+    <w:abstractNumId w:val="19"/>
   </w:num>
   <w:num w:numId="20" w16cid:durableId="622461175">
-    <w:abstractNumId w:val="31"/>
+    <w:abstractNumId w:val="34"/>
   </w:num>
   <w:num w:numId="21" w16cid:durableId="287205736">
-    <w:abstractNumId w:val="18"/>
+    <w:abstractNumId w:val="19"/>
   </w:num>
   <w:num w:numId="22" w16cid:durableId="1645967533">
-    <w:abstractNumId w:val="18"/>
+    <w:abstractNumId w:val="19"/>
   </w:num>
   <w:num w:numId="23" w16cid:durableId="57636482">
-    <w:abstractNumId w:val="18"/>
+    <w:abstractNumId w:val="19"/>
   </w:num>
   <w:num w:numId="24" w16cid:durableId="1401832151">
-    <w:abstractNumId w:val="32"/>
+    <w:abstractNumId w:val="35"/>
   </w:num>
   <w:num w:numId="25" w16cid:durableId="1086725508">
     <w:abstractNumId w:val="1"/>
   </w:num>
   <w:num w:numId="26" w16cid:durableId="1195457363">
-    <w:abstractNumId w:val="18"/>
+    <w:abstractNumId w:val="19"/>
   </w:num>
   <w:num w:numId="27" w16cid:durableId="1865708365">
-    <w:abstractNumId w:val="18"/>
+    <w:abstractNumId w:val="19"/>
   </w:num>
   <w:num w:numId="28" w16cid:durableId="1392538093">
-    <w:abstractNumId w:val="17"/>
+    <w:abstractNumId w:val="18"/>
   </w:num>
   <w:num w:numId="29" w16cid:durableId="573707990">
     <w:abstractNumId w:val="13"/>
   </w:num>
   <w:num w:numId="30" w16cid:durableId="1633319968">
-    <w:abstractNumId w:val="18"/>
+    <w:abstractNumId w:val="19"/>
   </w:num>
   <w:num w:numId="31" w16cid:durableId="548999243">
-    <w:abstractNumId w:val="18"/>
+    <w:abstractNumId w:val="19"/>
   </w:num>
   <w:num w:numId="32" w16cid:durableId="924845275">
-    <w:abstractNumId w:val="18"/>
+    <w:abstractNumId w:val="19"/>
   </w:num>
   <w:num w:numId="33" w16cid:durableId="754060141">
     <w:abstractNumId w:val="5"/>
   </w:num>
   <w:num w:numId="34" w16cid:durableId="1095399857">
-    <w:abstractNumId w:val="18"/>
+    <w:abstractNumId w:val="19"/>
   </w:num>
   <w:num w:numId="35" w16cid:durableId="1507748665">
-    <w:abstractNumId w:val="18"/>
+    <w:abstractNumId w:val="19"/>
   </w:num>
   <w:num w:numId="36" w16cid:durableId="681781034">
-    <w:abstractNumId w:val="18"/>
+    <w:abstractNumId w:val="19"/>
   </w:num>
   <w:num w:numId="37" w16cid:durableId="1206407438">
-    <w:abstractNumId w:val="18"/>
+    <w:abstractNumId w:val="19"/>
   </w:num>
   <w:num w:numId="38" w16cid:durableId="772359201">
-    <w:abstractNumId w:val="23"/>
+    <w:abstractNumId w:val="26"/>
   </w:num>
   <w:num w:numId="39" w16cid:durableId="433326379">
-    <w:abstractNumId w:val="18"/>
+    <w:abstractNumId w:val="19"/>
   </w:num>
   <w:num w:numId="40" w16cid:durableId="818349092">
-    <w:abstractNumId w:val="18"/>
+    <w:abstractNumId w:val="19"/>
   </w:num>
   <w:num w:numId="41" w16cid:durableId="1655138924">
-    <w:abstractNumId w:val="30"/>
+    <w:abstractNumId w:val="33"/>
   </w:num>
   <w:num w:numId="42" w16cid:durableId="1491099215">
     <w:abstractNumId w:val="8"/>
@@ -12320,16 +14765,25 @@
     <w:abstractNumId w:val="3"/>
   </w:num>
   <w:num w:numId="44" w16cid:durableId="2064787310">
-    <w:abstractNumId w:val="21"/>
+    <w:abstractNumId w:val="23"/>
   </w:num>
   <w:num w:numId="45" w16cid:durableId="1694499940">
-    <w:abstractNumId w:val="20"/>
+    <w:abstractNumId w:val="22"/>
   </w:num>
   <w:num w:numId="46" w16cid:durableId="1692219595">
     <w:abstractNumId w:val="9"/>
   </w:num>
   <w:num w:numId="47" w16cid:durableId="216204593">
-    <w:abstractNumId w:val="27"/>
+    <w:abstractNumId w:val="30"/>
+  </w:num>
+  <w:num w:numId="48" w16cid:durableId="1784810721">
+    <w:abstractNumId w:val="25"/>
+  </w:num>
+  <w:num w:numId="49" w16cid:durableId="1241332247">
+    <w:abstractNumId w:val="15"/>
+  </w:num>
+  <w:num w:numId="50" w16cid:durableId="372658366">
+    <w:abstractNumId w:val="21"/>
   </w:num>
 </w:numbering>
 </file>

</xml_diff>

<commit_message>
:pencil2: Terminando puntos 6 (Requerimientos) y 7 (Metodologías) de la documentación
</commit_message>
<xml_diff>
--- a/DOC_FINAL/DOCUMENTACION_FINAL.docx
+++ b/DOC_FINAL/DOCUMENTACION_FINAL.docx
@@ -4434,11 +4434,10 @@
           <w:noProof/>
           <w:color w:val="FFFFFF" w:themeColor="background1"/>
         </w:rPr>
-        <w:lastRenderedPageBreak/>
         <mc:AlternateContent>
           <mc:Choice Requires="wps">
             <w:drawing>
-              <wp:anchor distT="0" distB="0" distL="114300" distR="114300" simplePos="0" relativeHeight="251660288" behindDoc="1" locked="0" layoutInCell="1" allowOverlap="1" wp14:anchorId="27816426" wp14:editId="3AA57728">
+              <wp:anchor distT="0" distB="0" distL="114300" distR="114300" simplePos="0" relativeHeight="251658241" behindDoc="1" locked="0" layoutInCell="1" allowOverlap="1" wp14:anchorId="27816426" wp14:editId="3AA57728">
                 <wp:simplePos x="0" y="0"/>
                 <wp:positionH relativeFrom="column">
                   <wp:posOffset>-2269067</wp:posOffset>
@@ -4509,9 +4508,9 @@
               </wp:anchor>
             </w:drawing>
           </mc:Choice>
-          <mc:Fallback>
+          <mc:Fallback xmlns:arto="http://schemas.microsoft.com/office/word/2006/arto" xmlns:a="http://schemas.openxmlformats.org/drawingml/2006/main">
             <w:pict>
-              <v:roundrect w14:anchorId="10FAE9A5" id="Rectángulo: esquinas redondeadas 1" o:spid="_x0000_s1026" style="position:absolute;margin-left:-178.65pt;margin-top:-3.35pt;width:490pt;height:28.95pt;z-index:-251656192;visibility:visible;mso-wrap-style:square;mso-width-percent:0;mso-height-percent:0;mso-wrap-distance-left:9pt;mso-wrap-distance-top:0;mso-wrap-distance-right:9pt;mso-wrap-distance-bottom:0;mso-position-horizontal:absolute;mso-position-horizontal-relative:text;mso-position-vertical:absolute;mso-position-vertical-relative:text;mso-width-percent:0;mso-height-percent:0;mso-width-relative:margin;mso-height-relative:margin;v-text-anchor:middle" arcsize=".5" o:gfxdata="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" fillcolor="#272727 [2749]" stroked="f" strokeweight="2pt"/>
+              <v:roundrect id="Rectángulo: esquinas redondeadas 1" style="position:absolute;margin-left:-178.65pt;margin-top:-3.35pt;width:490pt;height:28.95pt;z-index:-251656192;visibility:visible;mso-wrap-style:square;mso-width-percent:0;mso-height-percent:0;mso-wrap-distance-left:9pt;mso-wrap-distance-top:0;mso-wrap-distance-right:9pt;mso-wrap-distance-bottom:0;mso-position-horizontal:absolute;mso-position-horizontal-relative:text;mso-position-vertical:absolute;mso-position-vertical-relative:text;mso-width-percent:0;mso-height-percent:0;mso-width-relative:margin;mso-height-relative:margin;v-text-anchor:middle" o:spid="_x0000_s1026" fillcolor="#272727 [2749]" stroked="f" strokeweight="2pt" arcsize=".5" w14:anchorId="10FAE9A5" o:gfxdata="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"/>
             </w:pict>
           </mc:Fallback>
         </mc:AlternateContent>
@@ -4784,7 +4783,7 @@
         <mc:AlternateContent>
           <mc:Choice Requires="wps">
             <w:drawing>
-              <wp:anchor distT="0" distB="0" distL="114300" distR="114300" simplePos="0" relativeHeight="251662336" behindDoc="1" locked="0" layoutInCell="1" allowOverlap="1" wp14:anchorId="33D99751" wp14:editId="3C65A388">
+              <wp:anchor distT="0" distB="0" distL="114300" distR="114300" simplePos="0" relativeHeight="251658242" behindDoc="1" locked="0" layoutInCell="1" allowOverlap="1" wp14:anchorId="33D99751" wp14:editId="3C65A388">
                 <wp:simplePos x="0" y="0"/>
                 <wp:positionH relativeFrom="column">
                   <wp:posOffset>-1166918</wp:posOffset>
@@ -4855,9 +4854,9 @@
               </wp:anchor>
             </w:drawing>
           </mc:Choice>
-          <mc:Fallback>
+          <mc:Fallback xmlns:arto="http://schemas.microsoft.com/office/word/2006/arto" xmlns:a="http://schemas.openxmlformats.org/drawingml/2006/main">
             <w:pict>
-              <v:roundrect w14:anchorId="79B3C149" id="Rectángulo: esquinas redondeadas 1" o:spid="_x0000_s1026" style="position:absolute;margin-left:-91.9pt;margin-top:12.6pt;width:461.45pt;height:28.9pt;z-index:-251654144;visibility:visible;mso-wrap-style:square;mso-width-percent:0;mso-height-percent:0;mso-wrap-distance-left:9pt;mso-wrap-distance-top:0;mso-wrap-distance-right:9pt;mso-wrap-distance-bottom:0;mso-position-horizontal:absolute;mso-position-horizontal-relative:text;mso-position-vertical:absolute;mso-position-vertical-relative:text;mso-width-percent:0;mso-height-percent:0;mso-width-relative:margin;mso-height-relative:margin;v-text-anchor:middle" arcsize=".5" o:gfxdata="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" fillcolor="#272727 [2749]" stroked="f" strokeweight="2pt"/>
+              <v:roundrect id="Rectángulo: esquinas redondeadas 1" style="position:absolute;margin-left:-91.9pt;margin-top:12.6pt;width:461.45pt;height:28.9pt;z-index:-251654144;visibility:visible;mso-wrap-style:square;mso-width-percent:0;mso-height-percent:0;mso-wrap-distance-left:9pt;mso-wrap-distance-top:0;mso-wrap-distance-right:9pt;mso-wrap-distance-bottom:0;mso-position-horizontal:absolute;mso-position-horizontal-relative:text;mso-position-vertical:absolute;mso-position-vertical-relative:text;mso-width-percent:0;mso-height-percent:0;mso-width-relative:margin;mso-height-relative:margin;v-text-anchor:middle" o:spid="_x0000_s1026" fillcolor="#272727 [2749]" stroked="f" strokeweight="2pt" arcsize=".5" w14:anchorId="79B3C149" o:gfxdata="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"/>
             </w:pict>
           </mc:Fallback>
         </mc:AlternateContent>
@@ -4966,15 +4965,7 @@
           <w:rFonts w:ascii="Aptos" w:hAnsi="Aptos"/>
           <w:lang w:val="es-MX"/>
         </w:rPr>
-        <w:t xml:space="preserve">Esta situación provoca que la difusión de sus servicios dependa casi exclusivamente de la recomendación directa o "boca a boca", un mecanismo limitado que reduce significativamente el alcance, la visibilidad y las oportunidades de crecimiento profesional. La ausencia de un </w:t>
-      </w:r>
-      <w:r>
-        <w:rPr>
-          <w:rFonts w:ascii="Aptos" w:hAnsi="Aptos"/>
-          <w:lang w:val="es-MX"/>
-        </w:rPr>
-        <w:lastRenderedPageBreak/>
-        <w:t>portafolio digital impide mostrar adecuadamente renders 3D, planos técnicos, procesos de diseño y proyectos ejecutados, elementos fundamentales para generar credibilidad y confianza en clientes potenciales.</w:t>
+        <w:t>Esta situación provoca que la difusión de sus servicios dependa casi exclusivamente de la recomendación directa o "boca a boca", un mecanismo limitado que reduce significativamente el alcance, la visibilidad y las oportunidades de crecimiento profesional. La ausencia de un portafolio digital impide mostrar adecuadamente renders 3D, planos técnicos, procesos de diseño y proyectos ejecutados, elementos fundamentales para generar credibilidad y confianza en clientes potenciales.</w:t>
       </w:r>
     </w:p>
     <w:p>
@@ -5477,21 +5468,7 @@
         <w:rPr>
           <w:lang w:val="es-MX"/>
         </w:rPr>
-        <w:t xml:space="preserve"> </w:t>
-      </w:r>
-      <w:proofErr w:type="gramStart"/>
-      <w:r>
-        <w:rPr>
-          <w:lang w:val="es-MX"/>
-        </w:rPr>
-        <w:t>Responsable</w:t>
-      </w:r>
-      <w:proofErr w:type="gramEnd"/>
-      <w:r>
-        <w:rPr>
-          <w:lang w:val="es-MX"/>
-        </w:rPr>
-        <w:t xml:space="preserve"> del diseño, desarrollo e implementación del sistema.</w:t>
+        <w:t xml:space="preserve"> Responsable del diseño, desarrollo e implementación del sistema.</w:t>
       </w:r>
     </w:p>
     <w:p>
@@ -5510,7 +5487,7 @@
         <mc:AlternateContent>
           <mc:Choice Requires="wps">
             <w:drawing>
-              <wp:anchor distT="0" distB="0" distL="114300" distR="114300" simplePos="0" relativeHeight="251664384" behindDoc="1" locked="0" layoutInCell="1" allowOverlap="1" wp14:anchorId="3DF3DC75" wp14:editId="466600CF">
+              <wp:anchor distT="0" distB="0" distL="114300" distR="114300" simplePos="0" relativeHeight="251658243" behindDoc="1" locked="0" layoutInCell="1" allowOverlap="1" wp14:anchorId="3DF3DC75" wp14:editId="466600CF">
                 <wp:simplePos x="0" y="0"/>
                 <wp:positionH relativeFrom="column">
                   <wp:posOffset>-1473200</wp:posOffset>
@@ -5581,9 +5558,9 @@
               </wp:anchor>
             </w:drawing>
           </mc:Choice>
-          <mc:Fallback>
+          <mc:Fallback xmlns:arto="http://schemas.microsoft.com/office/word/2006/arto" xmlns:a="http://schemas.openxmlformats.org/drawingml/2006/main">
             <w:pict>
-              <v:roundrect w14:anchorId="026729D6" id="Rectángulo: esquinas redondeadas 1" o:spid="_x0000_s1026" style="position:absolute;margin-left:-116pt;margin-top:12.35pt;width:417.35pt;height:28.9pt;z-index:-251652096;visibility:visible;mso-wrap-style:square;mso-width-percent:0;mso-height-percent:0;mso-wrap-distance-left:9pt;mso-wrap-distance-top:0;mso-wrap-distance-right:9pt;mso-wrap-distance-bottom:0;mso-position-horizontal:absolute;mso-position-horizontal-relative:text;mso-position-vertical:absolute;mso-position-vertical-relative:text;mso-width-percent:0;mso-height-percent:0;mso-width-relative:margin;mso-height-relative:margin;v-text-anchor:middle" arcsize=".5" o:gfxdata="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" fillcolor="#272727 [2749]" stroked="f" strokeweight="2pt"/>
+              <v:roundrect id="Rectángulo: esquinas redondeadas 1" style="position:absolute;margin-left:-116pt;margin-top:12.35pt;width:417.35pt;height:28.9pt;z-index:-251652096;visibility:visible;mso-wrap-style:square;mso-width-percent:0;mso-height-percent:0;mso-wrap-distance-left:9pt;mso-wrap-distance-top:0;mso-wrap-distance-right:9pt;mso-wrap-distance-bottom:0;mso-position-horizontal:absolute;mso-position-horizontal-relative:text;mso-position-vertical:absolute;mso-position-vertical-relative:text;mso-width-percent:0;mso-height-percent:0;mso-width-relative:margin;mso-height-relative:margin;v-text-anchor:middle" o:spid="_x0000_s1026" fillcolor="#272727 [2749]" stroked="f" strokeweight="2pt" arcsize=".5" w14:anchorId="026729D6" o:gfxdata="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"/>
             </w:pict>
           </mc:Fallback>
         </mc:AlternateContent>
@@ -5649,7 +5626,6 @@
           <w:rFonts w:ascii="Aptos" w:hAnsi="Aptos"/>
           <w:lang w:val="es-MX"/>
         </w:rPr>
-        <w:lastRenderedPageBreak/>
         <w:t>El crecimiento del trabajo freelance y la digitalización del sector de la construcción han impulsado la demanda de servicios arquitectónicos independientes. Los clientes buscan soluciones visuales que les permitan ver el trabajo del arquitecto para comparar su idea con los acabados y técnicas que maneja, siendo los renders 3D un elemento de ayuda y de los principales factores de decisión.</w:t>
       </w:r>
     </w:p>
@@ -5677,23 +5653,7 @@
           <w:rFonts w:ascii="Aptos" w:hAnsi="Aptos"/>
           <w:lang w:val="es-MX"/>
         </w:rPr>
-        <w:t xml:space="preserve">El análisis del mercado muestra que pocos arquitectos cuentan con sitios web profesionales, optimizados para dispositivos móviles y con galerías interactivas de renders. La mayoría solo hace uso de redes sociales como Facebook o Instagram, e incluso algunas páginas con filtros para buscar arquitectos solo muestran el </w:t>
-      </w:r>
-      <w:proofErr w:type="gramStart"/>
-      <w:r>
-        <w:rPr>
-          <w:rFonts w:ascii="Aptos" w:hAnsi="Aptos"/>
-          <w:lang w:val="es-MX"/>
-        </w:rPr>
-        <w:t>nombre</w:t>
-      </w:r>
-      <w:proofErr w:type="gramEnd"/>
-      <w:r>
-        <w:rPr>
-          <w:rFonts w:ascii="Aptos" w:hAnsi="Aptos"/>
-          <w:lang w:val="es-MX"/>
-        </w:rPr>
-        <w:t xml:space="preserve"> pero no permiten ver su trabajo.</w:t>
+        <w:t>El análisis del mercado muestra que pocos arquitectos cuentan con sitios web profesionales, optimizados para dispositivos móviles y con galerías interactivas de renders. La mayoría solo hace uso de redes sociales como Facebook o Instagram, e incluso algunas páginas con filtros para buscar arquitectos solo muestran el nombre pero no permiten ver su trabajo.</w:t>
       </w:r>
     </w:p>
     <w:p>
@@ -5813,35 +5773,7 @@
         <w:rPr>
           <w:lang w:val="es-MX" w:eastAsia="zh-CN"/>
         </w:rPr>
-        <w:t xml:space="preserve"> Página que muestra proyectos </w:t>
-      </w:r>
-      <w:proofErr w:type="gramStart"/>
-      <w:r>
-        <w:rPr>
-          <w:lang w:val="es-MX" w:eastAsia="zh-CN"/>
-        </w:rPr>
-        <w:t>arquitectónicos</w:t>
-      </w:r>
-      <w:proofErr w:type="gramEnd"/>
-      <w:r>
-        <w:rPr>
-          <w:lang w:val="es-MX" w:eastAsia="zh-CN"/>
-        </w:rPr>
-        <w:t xml:space="preserve"> pero no identifica al arquitecto que los realizó ni ofrece su contacto directo. Es más cercana a lo </w:t>
-      </w:r>
-      <w:proofErr w:type="gramStart"/>
-      <w:r>
-        <w:rPr>
-          <w:lang w:val="es-MX" w:eastAsia="zh-CN"/>
-        </w:rPr>
-        <w:t>propuesto</w:t>
-      </w:r>
-      <w:proofErr w:type="gramEnd"/>
-      <w:r>
-        <w:rPr>
-          <w:lang w:val="es-MX" w:eastAsia="zh-CN"/>
-        </w:rPr>
-        <w:t xml:space="preserve"> pero sigue sin ser un portafolio individual.</w:t>
+        <w:t xml:space="preserve"> Página que muestra proyectos arquitectónicos pero no identifica al arquitecto que los realizó ni ofrece su contacto directo. Es más cercana a lo propuesto pero sigue sin ser un portafolio individual.</w:t>
       </w:r>
     </w:p>
     <w:p>
@@ -5920,7 +5852,7 @@
         <mc:AlternateContent>
           <mc:Choice Requires="wps">
             <w:drawing>
-              <wp:anchor distT="0" distB="0" distL="114300" distR="114300" simplePos="0" relativeHeight="251666432" behindDoc="1" locked="0" layoutInCell="1" allowOverlap="1" wp14:anchorId="06EFB663" wp14:editId="658C3A1E">
+              <wp:anchor distT="0" distB="0" distL="114300" distR="114300" simplePos="0" relativeHeight="251658244" behindDoc="1" locked="0" layoutInCell="1" allowOverlap="1" wp14:anchorId="06EFB663" wp14:editId="658C3A1E">
                 <wp:simplePos x="0" y="0"/>
                 <wp:positionH relativeFrom="column">
                   <wp:posOffset>-1126067</wp:posOffset>
@@ -5991,9 +5923,9 @@
               </wp:anchor>
             </w:drawing>
           </mc:Choice>
-          <mc:Fallback>
+          <mc:Fallback xmlns:arto="http://schemas.microsoft.com/office/word/2006/arto" xmlns:a="http://schemas.openxmlformats.org/drawingml/2006/main">
             <w:pict>
-              <v:roundrect w14:anchorId="7B719B34" id="Rectángulo: esquinas redondeadas 1" o:spid="_x0000_s1026" style="position:absolute;margin-left:-88.65pt;margin-top:11.7pt;width:351.35pt;height:28.9pt;z-index:-251650048;visibility:visible;mso-wrap-style:square;mso-width-percent:0;mso-height-percent:0;mso-wrap-distance-left:9pt;mso-wrap-distance-top:0;mso-wrap-distance-right:9pt;mso-wrap-distance-bottom:0;mso-position-horizontal:absolute;mso-position-horizontal-relative:text;mso-position-vertical:absolute;mso-position-vertical-relative:text;mso-width-percent:0;mso-height-percent:0;mso-width-relative:margin;mso-height-relative:margin;v-text-anchor:middle" arcsize=".5" o:gfxdata="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" fillcolor="#272727 [2749]" stroked="f" strokeweight="2pt"/>
+              <v:roundrect id="Rectángulo: esquinas redondeadas 1" style="position:absolute;margin-left:-88.65pt;margin-top:11.7pt;width:351.35pt;height:28.9pt;z-index:-251650048;visibility:visible;mso-wrap-style:square;mso-width-percent:0;mso-height-percent:0;mso-wrap-distance-left:9pt;mso-wrap-distance-top:0;mso-wrap-distance-right:9pt;mso-wrap-distance-bottom:0;mso-position-horizontal:absolute;mso-position-horizontal-relative:text;mso-position-vertical:absolute;mso-position-vertical-relative:text;mso-width-percent:0;mso-height-percent:0;mso-width-relative:margin;mso-height-relative:margin;v-text-anchor:middle" o:spid="_x0000_s1026" fillcolor="#272727 [2749]" stroked="f" strokeweight="2pt" arcsize=".5" w14:anchorId="7B719B34" o:gfxdata="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"/>
             </w:pict>
           </mc:Fallback>
         </mc:AlternateContent>
@@ -6075,15 +6007,7 @@
           <w:rFonts w:ascii="Aptos" w:hAnsi="Aptos"/>
           <w:lang w:val="es-MX"/>
         </w:rPr>
-        <w:t xml:space="preserve">) que son ampliamente accesibles y bien documentadas. El equipo de desarrollo cuenta con las competencias requeridas como estudiantes de Ingeniería en Computación Inteligente. Las herramientas de desarrollo son gratuitas (Visual Studio Code, </w:t>
-      </w:r>
-      <w:r>
-        <w:rPr>
-          <w:rFonts w:ascii="Aptos" w:hAnsi="Aptos"/>
-          <w:lang w:val="es-MX"/>
-        </w:rPr>
-        <w:lastRenderedPageBreak/>
-        <w:t xml:space="preserve">GitHub). El sistema será desplegado en un Hostinger VPS utilizando </w:t>
+        <w:t xml:space="preserve">) que son ampliamente accesibles y bien documentadas. El equipo de desarrollo cuenta con las competencias requeridas como estudiantes de Ingeniería en Computación Inteligente. Las herramientas de desarrollo son gratuitas (Visual Studio Code, GitHub). El sistema será desplegado en un Hostinger VPS utilizando </w:t>
       </w:r>
       <w:proofErr w:type="spellStart"/>
       <w:r>
@@ -6676,7 +6600,6 @@
                 <w:lang w:val="es-MX"/>
               </w:rPr>
             </w:pPr>
-            <w:proofErr w:type="gramStart"/>
             <w:r>
               <w:rPr>
                 <w:rFonts w:eastAsia="Times New Roman"/>
@@ -6684,17 +6607,7 @@
                 <w:bCs/>
                 <w:lang w:val="es-MX" w:eastAsia="zh-CN"/>
               </w:rPr>
-              <w:t>Total</w:t>
-            </w:r>
-            <w:proofErr w:type="gramEnd"/>
-            <w:r>
-              <w:rPr>
-                <w:rFonts w:eastAsia="Times New Roman"/>
-                <w:b/>
-                <w:bCs/>
-                <w:lang w:val="es-MX" w:eastAsia="zh-CN"/>
-              </w:rPr>
-              <w:t xml:space="preserve"> Inversión Inicial</w:t>
+              <w:t>Total Inversión Inicial</w:t>
             </w:r>
           </w:p>
         </w:tc>
@@ -6707,7 +6620,7 @@
               <w:bottom w:val="single" w:sz="8" w:space="0" w:color="BFBFBF"/>
               <w:right w:val="single" w:sz="8" w:space="0" w:color="BFBFBF"/>
             </w:tcBorders>
-            <w:shd w:val="clear" w:color="auto" w:fill="BFBFBF" w:themeFill="background1" w:themeFillShade="BF"/>
+            <w:shd w:val="clear" w:color="auto" w:fill="262626" w:themeFill="text1" w:themeFillTint="D9"/>
             <w:vAlign w:val="center"/>
             <w:hideMark/>
           </w:tcPr>
@@ -7018,7 +6931,6 @@
                 <w:lang w:val="es-MX"/>
               </w:rPr>
             </w:pPr>
-            <w:proofErr w:type="gramStart"/>
             <w:r>
               <w:rPr>
                 <w:rFonts w:eastAsia="Times New Roman"/>
@@ -7027,18 +6939,7 @@
                 <w:color w:val="000000"/>
                 <w:lang w:val="es-MX" w:eastAsia="zh-CN"/>
               </w:rPr>
-              <w:t>Total</w:t>
-            </w:r>
-            <w:proofErr w:type="gramEnd"/>
-            <w:r>
-              <w:rPr>
-                <w:rFonts w:eastAsia="Times New Roman"/>
-                <w:b/>
-                <w:bCs/>
-                <w:color w:val="000000"/>
-                <w:lang w:val="es-MX" w:eastAsia="zh-CN"/>
-              </w:rPr>
-              <w:t xml:space="preserve"> Costos Operativos/año</w:t>
+              <w:t>Total Costos Operativos/año</w:t>
             </w:r>
           </w:p>
         </w:tc>
@@ -7051,7 +6952,7 @@
               <w:bottom w:val="single" w:sz="8" w:space="0" w:color="BFBFBF"/>
               <w:right w:val="single" w:sz="8" w:space="0" w:color="BFBFBF"/>
             </w:tcBorders>
-            <w:shd w:val="clear" w:color="auto" w:fill="BFBFBF" w:themeFill="background1" w:themeFillShade="BF"/>
+            <w:shd w:val="clear" w:color="auto" w:fill="262626" w:themeFill="text1" w:themeFillTint="D9"/>
             <w:vAlign w:val="center"/>
             <w:hideMark/>
           </w:tcPr>
@@ -7063,7 +6964,7 @@
                 <w:rFonts w:eastAsia="Times New Roman"/>
                 <w:b/>
                 <w:bCs/>
-                <w:color w:val="000000"/>
+                <w:color w:val="FFFFFF" w:themeColor="background1"/>
                 <w:lang w:val="es-MX"/>
               </w:rPr>
             </w:pPr>
@@ -7072,7 +6973,7 @@
                 <w:rFonts w:eastAsia="Times New Roman"/>
                 <w:b/>
                 <w:bCs/>
-                <w:color w:val="000000"/>
+                <w:color w:val="FFFFFF" w:themeColor="background1"/>
                 <w:lang w:val="es-MX" w:eastAsia="zh-CN"/>
               </w:rPr>
               <w:t>$2,000</w:t>
@@ -7434,7 +7335,6 @@
                 <w:lang w:val="es-MX"/>
               </w:rPr>
             </w:pPr>
-            <w:proofErr w:type="gramStart"/>
             <w:r>
               <w:rPr>
                 <w:rFonts w:eastAsia="Times New Roman"/>
@@ -7443,18 +7343,7 @@
                 <w:color w:val="000000"/>
                 <w:lang w:val="es-MX" w:eastAsia="zh-CN"/>
               </w:rPr>
-              <w:t>Total</w:t>
-            </w:r>
-            <w:proofErr w:type="gramEnd"/>
-            <w:r>
-              <w:rPr>
-                <w:rFonts w:eastAsia="Times New Roman"/>
-                <w:b/>
-                <w:bCs/>
-                <w:color w:val="000000"/>
-                <w:lang w:val="es-MX" w:eastAsia="zh-CN"/>
-              </w:rPr>
-              <w:t xml:space="preserve"> Beneficios/año</w:t>
+              <w:t>Total Beneficios/año</w:t>
             </w:r>
           </w:p>
         </w:tc>
@@ -7467,7 +7356,7 @@
               <w:bottom w:val="single" w:sz="8" w:space="0" w:color="BFBFBF"/>
               <w:right w:val="single" w:sz="8" w:space="0" w:color="BFBFBF"/>
             </w:tcBorders>
-            <w:shd w:val="clear" w:color="auto" w:fill="BFBFBF" w:themeFill="background1" w:themeFillShade="BF"/>
+            <w:shd w:val="clear" w:color="auto" w:fill="262626" w:themeFill="text1" w:themeFillTint="D9"/>
             <w:vAlign w:val="center"/>
             <w:hideMark/>
           </w:tcPr>
@@ -7479,7 +7368,7 @@
                 <w:rFonts w:eastAsia="Times New Roman"/>
                 <w:b/>
                 <w:bCs/>
-                <w:color w:val="000000"/>
+                <w:color w:val="FFFFFF" w:themeColor="background1"/>
                 <w:lang w:val="es-MX"/>
               </w:rPr>
             </w:pPr>
@@ -7488,7 +7377,7 @@
                 <w:rFonts w:eastAsia="Times New Roman"/>
                 <w:b/>
                 <w:bCs/>
-                <w:color w:val="000000"/>
+                <w:color w:val="FFFFFF" w:themeColor="background1"/>
                 <w:lang w:val="es-MX" w:eastAsia="zh-CN"/>
               </w:rPr>
               <w:t>$16,200</w:t>
@@ -7666,7 +7555,6 @@
         <w:rPr>
           <w:rFonts w:ascii="Aptos" w:hAnsi="Aptos"/>
         </w:rPr>
-        <w:lastRenderedPageBreak/>
         <w:t>Operacional</w:t>
       </w:r>
       <w:bookmarkEnd w:id="19"/>
@@ -7675,11 +7563,13 @@
       <w:pPr>
         <w:jc w:val="both"/>
         <w:rPr>
+          <w:rFonts w:ascii="Aptos" w:hAnsi="Aptos"/>
           <w:lang w:val="es-MX" w:eastAsia="zh-CN"/>
         </w:rPr>
       </w:pPr>
       <w:r>
         <w:rPr>
+          <w:rFonts w:ascii="Aptos" w:hAnsi="Aptos"/>
           <w:lang w:val="es-MX" w:eastAsia="zh-CN"/>
         </w:rPr>
         <w:t xml:space="preserve">El proyecto cuenta con el apoyo directo del arquitecto </w:t>
@@ -7687,6 +7577,7 @@
       <w:proofErr w:type="spellStart"/>
       <w:r>
         <w:rPr>
+          <w:rFonts w:ascii="Aptos" w:hAnsi="Aptos"/>
           <w:lang w:val="es-MX" w:eastAsia="zh-CN"/>
         </w:rPr>
         <w:t>freelancer</w:t>
@@ -7694,28 +7585,16 @@
       <w:proofErr w:type="spellEnd"/>
       <w:r>
         <w:rPr>
+          <w:rFonts w:ascii="Aptos" w:hAnsi="Aptos"/>
           <w:lang w:val="es-MX" w:eastAsia="zh-CN"/>
         </w:rPr>
-        <w:t xml:space="preserve">, quien durante la entrevista expresó un interés claro en contar con su propio portafolio digital para exhibir sus renders y proyectos. Se comprometió a proporcionar el material gráfico necesario y a participar en la definición de contenidos. El sistema no modifica los procesos actuales del </w:t>
-      </w:r>
-      <w:proofErr w:type="gramStart"/>
-      <w:r>
-        <w:rPr>
-          <w:lang w:val="es-MX" w:eastAsia="zh-CN"/>
-        </w:rPr>
-        <w:t>arquitecto</w:t>
-      </w:r>
-      <w:proofErr w:type="gramEnd"/>
-      <w:r>
-        <w:rPr>
-          <w:lang w:val="es-MX" w:eastAsia="zh-CN"/>
-        </w:rPr>
-        <w:t xml:space="preserve"> sino que añade un canal de exhibición. La capacitación requerida es mínima y los usuarios finales no requieren capacitación alguna. No existen consideraciones éticas o legales adversas.</w:t>
-      </w:r>
-    </w:p>
-    <w:p>
-      <w:pPr>
-        <w:rPr>
+        <w:t>, quien durante la entrevista expresó un interés claro en contar con su propio portafolio digital para exhibir sus renders y proyectos. Se comprometió a proporcionar el material gráfico necesario y a participar en la definición de contenidos. El sistema no modifica los procesos actuales del arquitecto sino que añade un canal de exhibición. La capacitación requerida es mínima y los usuarios finales no requieren capacitación alguna. No existen consideraciones éticas o legales adversas.</w:t>
+      </w:r>
+    </w:p>
+    <w:p>
+      <w:pPr>
+        <w:rPr>
+          <w:rFonts w:ascii="Aptos" w:hAnsi="Aptos"/>
           <w:lang w:val="es-MX" w:eastAsia="zh-CN"/>
         </w:rPr>
       </w:pPr>
@@ -7736,7 +7615,7 @@
         <mc:AlternateContent>
           <mc:Choice Requires="wps">
             <w:drawing>
-              <wp:anchor distT="0" distB="0" distL="114300" distR="114300" simplePos="0" relativeHeight="251668480" behindDoc="1" locked="0" layoutInCell="1" allowOverlap="1" wp14:anchorId="564FD237" wp14:editId="1FA01508">
+              <wp:anchor distT="0" distB="0" distL="114300" distR="114300" simplePos="0" relativeHeight="251658245" behindDoc="1" locked="0" layoutInCell="1" allowOverlap="1" wp14:anchorId="564FD237" wp14:editId="1FA01508">
                 <wp:simplePos x="0" y="0"/>
                 <wp:positionH relativeFrom="column">
                   <wp:posOffset>-1489710</wp:posOffset>
@@ -7807,9 +7686,9 @@
               </wp:anchor>
             </w:drawing>
           </mc:Choice>
-          <mc:Fallback>
+          <mc:Fallback xmlns:arto="http://schemas.microsoft.com/office/word/2006/arto" xmlns:a="http://schemas.openxmlformats.org/drawingml/2006/main">
             <w:pict>
-              <v:roundrect w14:anchorId="4B80D576" id="Rectángulo: esquinas redondeadas 1" o:spid="_x0000_s1026" style="position:absolute;margin-left:-117.3pt;margin-top:27.45pt;width:417.3pt;height:28.9pt;z-index:-251648000;visibility:visible;mso-wrap-style:square;mso-width-percent:0;mso-height-percent:0;mso-wrap-distance-left:9pt;mso-wrap-distance-top:0;mso-wrap-distance-right:9pt;mso-wrap-distance-bottom:0;mso-position-horizontal:absolute;mso-position-horizontal-relative:text;mso-position-vertical:absolute;mso-position-vertical-relative:text;mso-width-percent:0;mso-height-percent:0;mso-width-relative:margin;mso-height-relative:margin;v-text-anchor:middle" arcsize=".5" o:gfxdata="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" fillcolor="#272727 [2749]" stroked="f" strokeweight="2pt"/>
+              <v:roundrect id="Rectángulo: esquinas redondeadas 1" style="position:absolute;margin-left:-117.3pt;margin-top:27.45pt;width:417.3pt;height:28.9pt;z-index:-251648000;visibility:visible;mso-wrap-style:square;mso-width-percent:0;mso-height-percent:0;mso-wrap-distance-left:9pt;mso-wrap-distance-top:0;mso-wrap-distance-right:9pt;mso-wrap-distance-bottom:0;mso-position-horizontal:absolute;mso-position-horizontal-relative:text;mso-position-vertical:absolute;mso-position-vertical-relative:text;mso-width-percent:0;mso-height-percent:0;mso-width-relative:margin;mso-height-relative:margin;v-text-anchor:middle" o:spid="_x0000_s1026" fillcolor="#272727 [2749]" stroked="f" strokeweight="2pt" arcsize=".5" w14:anchorId="4B80D576" o:gfxdata="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"/>
             </w:pict>
           </mc:Fallback>
         </mc:AlternateContent>
@@ -7870,9 +7749,241 @@
       </w:r>
       <w:bookmarkEnd w:id="21"/>
     </w:p>
-    <w:p>
-      <w:pPr>
-        <w:pStyle w:val="Prrafodelista"/>
+    <w:tbl>
+      <w:tblPr>
+        <w:tblW w:w="6794" w:type="dxa"/>
+        <w:jc w:val="center"/>
+        <w:tblCellMar>
+          <w:top w:w="68" w:type="dxa"/>
+          <w:left w:w="70" w:type="dxa"/>
+          <w:bottom w:w="68" w:type="dxa"/>
+          <w:right w:w="70" w:type="dxa"/>
+        </w:tblCellMar>
+        <w:tblLook w:val="04A0" w:firstRow="1" w:lastRow="0" w:firstColumn="1" w:lastColumn="0" w:noHBand="0" w:noVBand="1"/>
+      </w:tblPr>
+      <w:tblGrid>
+        <w:gridCol w:w="2117"/>
+        <w:gridCol w:w="4677"/>
+      </w:tblGrid>
+      <w:tr>
+        <w:trPr>
+          <w:trHeight w:val="596"/>
+          <w:jc w:val="center"/>
+        </w:trPr>
+        <w:tc>
+          <w:tcPr>
+            <w:tcW w:w="2117" w:type="dxa"/>
+            <w:tcBorders>
+              <w:top w:val="single" w:sz="8" w:space="0" w:color="BFBFBF"/>
+              <w:left w:val="single" w:sz="8" w:space="0" w:color="BFBFBF"/>
+              <w:bottom w:val="single" w:sz="8" w:space="0" w:color="BFBFBF"/>
+              <w:right w:val="single" w:sz="8" w:space="0" w:color="BFBFBF"/>
+            </w:tcBorders>
+            <w:shd w:val="clear" w:color="000000" w:fill="262626"/>
+            <w:vAlign w:val="center"/>
+            <w:hideMark/>
+          </w:tcPr>
+          <w:p>
+            <w:pPr>
+              <w:spacing w:line="240" w:lineRule="auto"/>
+              <w:jc w:val="center"/>
+              <w:rPr>
+                <w:rFonts w:eastAsia="Times New Roman"/>
+                <w:b/>
+                <w:bCs/>
+                <w:color w:val="FFFFFF"/>
+                <w:lang w:val="es-MX"/>
+              </w:rPr>
+            </w:pPr>
+            <w:r>
+              <w:rPr>
+                <w:rFonts w:eastAsia="Times New Roman"/>
+                <w:b/>
+                <w:bCs/>
+                <w:lang w:val="es-MX" w:eastAsia="zh-CN"/>
+              </w:rPr>
+              <w:t>Requerimiento</w:t>
+            </w:r>
+          </w:p>
+        </w:tc>
+        <w:tc>
+          <w:tcPr>
+            <w:tcW w:w="4677" w:type="dxa"/>
+            <w:tcBorders>
+              <w:top w:val="single" w:sz="8" w:space="0" w:color="BFBFBF"/>
+              <w:left w:val="nil"/>
+              <w:bottom w:val="single" w:sz="8" w:space="0" w:color="BFBFBF"/>
+              <w:right w:val="single" w:sz="8" w:space="0" w:color="BFBFBF"/>
+            </w:tcBorders>
+            <w:shd w:val="clear" w:color="000000" w:fill="262626"/>
+            <w:vAlign w:val="center"/>
+            <w:hideMark/>
+          </w:tcPr>
+          <w:p>
+            <w:pPr>
+              <w:spacing w:line="240" w:lineRule="auto"/>
+              <w:jc w:val="center"/>
+              <w:rPr>
+                <w:rFonts w:eastAsia="Times New Roman"/>
+                <w:b/>
+                <w:bCs/>
+                <w:color w:val="FFFFFF"/>
+                <w:lang w:val="es-MX"/>
+              </w:rPr>
+            </w:pPr>
+            <w:r>
+              <w:rPr>
+                <w:rFonts w:eastAsia="Times New Roman"/>
+                <w:b/>
+                <w:bCs/>
+                <w:lang w:val="es-MX" w:eastAsia="zh-CN"/>
+              </w:rPr>
+              <w:t>Descripción</w:t>
+            </w:r>
+          </w:p>
+        </w:tc>
+      </w:tr>
+      <w:tr>
+        <w:trPr>
+          <w:trHeight w:val="20"/>
+          <w:jc w:val="center"/>
+        </w:trPr>
+        <w:tc>
+          <w:tcPr>
+            <w:tcW w:w="2117" w:type="dxa"/>
+            <w:tcBorders>
+              <w:top w:val="nil"/>
+              <w:left w:val="single" w:sz="8" w:space="0" w:color="BFBFBF"/>
+              <w:bottom w:val="single" w:sz="8" w:space="0" w:color="BFBFBF"/>
+              <w:right w:val="single" w:sz="8" w:space="0" w:color="BFBFBF"/>
+            </w:tcBorders>
+            <w:vAlign w:val="center"/>
+            <w:hideMark/>
+          </w:tcPr>
+          <w:p>
+            <w:pPr>
+              <w:spacing w:line="240" w:lineRule="auto"/>
+              <w:jc w:val="both"/>
+              <w:rPr>
+                <w:rFonts w:eastAsia="Times New Roman"/>
+                <w:color w:val="000000"/>
+                <w:lang w:val="es-MX"/>
+              </w:rPr>
+            </w:pPr>
+            <w:r>
+              <w:rPr>
+                <w:rFonts w:ascii="Aptos" w:hAnsi="Aptos"/>
+                <w:lang w:val="es-MX"/>
+              </w:rPr>
+              <w:t>RF01</w:t>
+            </w:r>
+          </w:p>
+        </w:tc>
+        <w:tc>
+          <w:tcPr>
+            <w:tcW w:w="4677" w:type="dxa"/>
+            <w:tcBorders>
+              <w:top w:val="nil"/>
+              <w:left w:val="nil"/>
+              <w:bottom w:val="single" w:sz="8" w:space="0" w:color="BFBFBF"/>
+              <w:right w:val="single" w:sz="8" w:space="0" w:color="BFBFBF"/>
+            </w:tcBorders>
+            <w:vAlign w:val="center"/>
+            <w:hideMark/>
+          </w:tcPr>
+          <w:p>
+            <w:pPr>
+              <w:spacing w:line="240" w:lineRule="auto"/>
+              <w:jc w:val="both"/>
+              <w:rPr>
+                <w:rFonts w:eastAsia="Times New Roman"/>
+                <w:color w:val="000000"/>
+                <w:lang w:val="es-MX"/>
+              </w:rPr>
+            </w:pPr>
+            <w:r>
+              <w:rPr>
+                <w:rFonts w:ascii="Aptos" w:hAnsi="Aptos"/>
+                <w:lang w:val="es-MX"/>
+              </w:rPr>
+              <w:t>El sistema debe mostrar un encabezado con el nombre completo y profesión del arquitecto.</w:t>
+            </w:r>
+          </w:p>
+        </w:tc>
+      </w:tr>
+      <w:tr>
+        <w:trPr>
+          <w:trHeight w:val="20"/>
+          <w:jc w:val="center"/>
+        </w:trPr>
+        <w:tc>
+          <w:tcPr>
+            <w:tcW w:w="2117" w:type="dxa"/>
+            <w:tcBorders>
+              <w:top w:val="nil"/>
+              <w:left w:val="single" w:sz="8" w:space="0" w:color="BFBFBF"/>
+              <w:bottom w:val="single" w:sz="8" w:space="0" w:color="BFBFBF"/>
+              <w:right w:val="single" w:sz="8" w:space="0" w:color="BFBFBF"/>
+            </w:tcBorders>
+            <w:vAlign w:val="center"/>
+            <w:hideMark/>
+          </w:tcPr>
+          <w:p>
+            <w:pPr>
+              <w:spacing w:line="240" w:lineRule="auto"/>
+              <w:jc w:val="both"/>
+              <w:rPr>
+                <w:rFonts w:eastAsia="Times New Roman"/>
+                <w:color w:val="000000"/>
+                <w:lang w:val="es-MX"/>
+              </w:rPr>
+            </w:pPr>
+          </w:p>
+        </w:tc>
+        <w:tc>
+          <w:tcPr>
+            <w:tcW w:w="4677" w:type="dxa"/>
+            <w:tcBorders>
+              <w:top w:val="nil"/>
+              <w:left w:val="nil"/>
+              <w:bottom w:val="single" w:sz="8" w:space="0" w:color="BFBFBF"/>
+              <w:right w:val="single" w:sz="8" w:space="0" w:color="BFBFBF"/>
+            </w:tcBorders>
+            <w:vAlign w:val="center"/>
+            <w:hideMark/>
+          </w:tcPr>
+          <w:p>
+            <w:pPr>
+              <w:spacing w:line="240" w:lineRule="auto"/>
+              <w:jc w:val="both"/>
+              <w:rPr>
+                <w:rFonts w:eastAsia="Times New Roman"/>
+                <w:color w:val="000000"/>
+                <w:lang w:val="es-MX"/>
+              </w:rPr>
+            </w:pPr>
+          </w:p>
+        </w:tc>
+      </w:tr>
+    </w:tbl>
+    <w:p>
+      <w:pPr>
+        <w:rPr>
+          <w:lang w:val="es-MX" w:eastAsia="zh-CN"/>
+        </w:rPr>
+      </w:pPr>
+    </w:p>
+    <w:p>
+      <w:pPr>
+        <w:jc w:val="both"/>
+        <w:rPr>
+          <w:rFonts w:ascii="Aptos" w:hAnsi="Aptos"/>
+          <w:lang w:val="es-MX"/>
+        </w:rPr>
+      </w:pPr>
+    </w:p>
+    <w:p>
+      <w:pPr>
         <w:numPr>
           <w:ilvl w:val="0"/>
           <w:numId w:val="49"/>
@@ -7888,43 +7999,7 @@
           <w:rFonts w:ascii="Aptos" w:hAnsi="Aptos"/>
           <w:lang w:val="es-MX"/>
         </w:rPr>
-        <w:t>RF01: El sistema debe mostrar un encabezado con el nombre completo y profesión del arquitecto.</w:t>
-      </w:r>
-    </w:p>
-    <w:p>
-      <w:pPr>
-        <w:numPr>
-          <w:ilvl w:val="0"/>
-          <w:numId w:val="49"/>
-        </w:numPr>
-        <w:jc w:val="both"/>
-        <w:rPr>
-          <w:rFonts w:ascii="Aptos" w:hAnsi="Aptos"/>
-          <w:lang w:val="es-MX"/>
-        </w:rPr>
-      </w:pPr>
-      <w:r>
-        <w:rPr>
-          <w:rFonts w:ascii="Aptos" w:hAnsi="Aptos"/>
-          <w:lang w:val="es-MX"/>
-        </w:rPr>
-        <w:t xml:space="preserve">RF02: El sistema debe incluir una galería de renders 3D en formato </w:t>
-      </w:r>
-      <w:proofErr w:type="spellStart"/>
-      <w:r>
-        <w:rPr>
-          <w:rFonts w:ascii="Aptos" w:hAnsi="Aptos"/>
-          <w:lang w:val="es-MX"/>
-        </w:rPr>
-        <w:t>grid</w:t>
-      </w:r>
-      <w:proofErr w:type="spellEnd"/>
-      <w:r>
-        <w:rPr>
-          <w:rFonts w:ascii="Aptos" w:hAnsi="Aptos"/>
-          <w:lang w:val="es-MX"/>
-        </w:rPr>
-        <w:t xml:space="preserve"> con imágenes optimizadas.</w:t>
+        <w:t>: El sistema debe incluir una galería de renders 3D en formato grid con imágenes optimizadas.</w:t>
       </w:r>
     </w:p>
     <w:p>
@@ -8238,7 +8313,6 @@
         <w:rPr>
           <w:lang w:val="es-MX" w:eastAsia="zh-CN"/>
         </w:rPr>
-        <w:lastRenderedPageBreak/>
         <w:t>RNF07: La estructura del código debe ser modular para facilitar futuras actualizaciones y ampliaciones.</w:t>
       </w:r>
     </w:p>
@@ -8267,7 +8341,7 @@
         <mc:AlternateContent>
           <mc:Choice Requires="wps">
             <w:drawing>
-              <wp:anchor distT="0" distB="0" distL="114300" distR="114300" simplePos="0" relativeHeight="251670528" behindDoc="1" locked="0" layoutInCell="1" allowOverlap="1" wp14:anchorId="37504329" wp14:editId="63A4C114">
+              <wp:anchor distT="0" distB="0" distL="114300" distR="114300" simplePos="0" relativeHeight="251658246" behindDoc="1" locked="0" layoutInCell="1" allowOverlap="1" wp14:anchorId="37504329" wp14:editId="63A4C114">
                 <wp:simplePos x="0" y="0"/>
                 <wp:positionH relativeFrom="column">
                   <wp:posOffset>-1244600</wp:posOffset>
@@ -8338,9 +8412,9 @@
               </wp:anchor>
             </w:drawing>
           </mc:Choice>
-          <mc:Fallback>
+          <mc:Fallback xmlns:arto="http://schemas.microsoft.com/office/word/2006/arto" xmlns:a="http://schemas.openxmlformats.org/drawingml/2006/main">
             <w:pict>
-              <v:roundrect w14:anchorId="7DEA31D4" id="Rectángulo: esquinas redondeadas 1" o:spid="_x0000_s1026" style="position:absolute;margin-left:-98pt;margin-top:12.1pt;width:353.35pt;height:28.9pt;z-index:-251645952;visibility:visible;mso-wrap-style:square;mso-width-percent:0;mso-height-percent:0;mso-wrap-distance-left:9pt;mso-wrap-distance-top:0;mso-wrap-distance-right:9pt;mso-wrap-distance-bottom:0;mso-position-horizontal:absolute;mso-position-horizontal-relative:text;mso-position-vertical:absolute;mso-position-vertical-relative:text;mso-width-percent:0;mso-height-percent:0;mso-width-relative:margin;mso-height-relative:margin;v-text-anchor:middle" arcsize=".5" o:gfxdata="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" fillcolor="#272727 [2749]" stroked="f" strokeweight="2pt"/>
+              <v:roundrect id="Rectángulo: esquinas redondeadas 1" style="position:absolute;margin-left:-98pt;margin-top:12.1pt;width:353.35pt;height:28.9pt;z-index:-251645952;visibility:visible;mso-wrap-style:square;mso-width-percent:0;mso-height-percent:0;mso-wrap-distance-left:9pt;mso-wrap-distance-top:0;mso-wrap-distance-right:9pt;mso-wrap-distance-bottom:0;mso-position-horizontal:absolute;mso-position-horizontal-relative:text;mso-position-vertical:absolute;mso-position-vertical-relative:text;mso-width-percent:0;mso-height-percent:0;mso-width-relative:margin;mso-height-relative:margin;v-text-anchor:middle" o:spid="_x0000_s1026" fillcolor="#272727 [2749]" stroked="f" strokeweight="2pt" arcsize=".5" w14:anchorId="7DEA31D4" o:gfxdata="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"/>
             </w:pict>
           </mc:Fallback>
         </mc:AlternateContent>
@@ -8394,6 +8468,9 @@
     </w:p>
     <w:p>
       <w:pPr>
+        <w:tabs>
+          <w:tab w:val="left" w:pos="1347"/>
+        </w:tabs>
         <w:ind w:left="360"/>
         <w:jc w:val="both"/>
         <w:rPr>
@@ -8406,7 +8483,23 @@
           <w:rFonts w:ascii="Aptos" w:hAnsi="Aptos"/>
           <w:lang w:val="es-MX"/>
         </w:rPr>
-        <w:t>…</w:t>
+        <w:t xml:space="preserve">Para el desarrollo del sistema se adoptará la metodología ágil </w:t>
+      </w:r>
+      <w:r>
+        <w:rPr>
+          <w:rFonts w:ascii="Aptos" w:hAnsi="Aptos"/>
+          <w:b/>
+          <w:bCs/>
+          <w:lang w:val="es-MX"/>
+        </w:rPr>
+        <w:t>Scrum</w:t>
+      </w:r>
+      <w:r>
+        <w:rPr>
+          <w:rFonts w:ascii="Aptos" w:hAnsi="Aptos"/>
+          <w:lang w:val="es-MX"/>
+        </w:rPr>
+        <w:t>, marco de trabajo propuesto por Ken Schwaber y Jeff Sutherland, basado en un enfoque iterativo e incremental que permite generar entregables funcionales en periodos cortos de tiempo.</w:t>
       </w:r>
     </w:p>
     <w:p>
@@ -8446,14 +8539,31 @@
         <w:jc w:val="both"/>
         <w:rPr>
           <w:rFonts w:ascii="Aptos" w:hAnsi="Aptos"/>
-          <w:lang w:val="es-MX"/>
-        </w:rPr>
-      </w:pPr>
-      <w:r>
-        <w:rPr>
           <w:lang w:val="es-MX" w:eastAsia="zh-CN"/>
         </w:rPr>
-        <w:t>..</w:t>
+      </w:pPr>
+      <w:r>
+        <w:rPr>
+          <w:rFonts w:ascii="Aptos" w:hAnsi="Aptos"/>
+          <w:lang w:val="es-MX" w:eastAsia="zh-CN"/>
+        </w:rPr>
+        <w:t xml:space="preserve">La adopción de Scrum se justifica por: flexibilidad ante cambios en el diseño y contenido visual sin afectar la totalidad del proyecto; entregas incrementales cada dos semanas con versiones funcionales; mejor control del tiempo mediante planificación por </w:t>
+      </w:r>
+      <w:proofErr w:type="spellStart"/>
+      <w:r>
+        <w:rPr>
+          <w:rFonts w:ascii="Aptos" w:hAnsi="Aptos"/>
+          <w:lang w:val="es-MX" w:eastAsia="zh-CN"/>
+        </w:rPr>
+        <w:t>Sprints</w:t>
+      </w:r>
+      <w:proofErr w:type="spellEnd"/>
+      <w:r>
+        <w:rPr>
+          <w:rFonts w:ascii="Aptos" w:hAnsi="Aptos"/>
+          <w:lang w:val="es-MX" w:eastAsia="zh-CN"/>
+        </w:rPr>
+        <w:t>; mejora continua a través de revisiones periódicas; y reducción de riesgos al desarrollar por módulos funcionales que permiten detectar errores de forma temprana.</w:t>
       </w:r>
     </w:p>
     <w:p>
@@ -8490,8 +8600,229 @@
     <w:p>
       <w:pPr>
         <w:ind w:left="360"/>
-        <w:rPr>
+        <w:jc w:val="both"/>
+        <w:rPr>
+          <w:rFonts w:ascii="Aptos" w:hAnsi="Aptos"/>
           <w:lang w:val="es-MX" w:eastAsia="zh-CN"/>
+        </w:rPr>
+      </w:pPr>
+      <w:r>
+        <w:rPr>
+          <w:rFonts w:ascii="Aptos" w:hAnsi="Aptos"/>
+          <w:b/>
+          <w:bCs/>
+          <w:lang w:val="es-MX" w:eastAsia="zh-CN"/>
+        </w:rPr>
+        <w:t>Sprint 1 (Semanas 1-2): Estructura base del sistema.</w:t>
+      </w:r>
+      <w:r>
+        <w:rPr>
+          <w:rFonts w:ascii="Aptos" w:hAnsi="Aptos"/>
+          <w:lang w:val="es-MX" w:eastAsia="zh-CN"/>
+        </w:rPr>
+        <w:t xml:space="preserve"> Definición de estructura HTML, implementación del encabezado, creación de secciones principales, aplicación de estilos visuales básicos y configuración de navegación interna. Entregable: prototipo funcional navegable.</w:t>
+      </w:r>
+    </w:p>
+    <w:p>
+      <w:pPr>
+        <w:ind w:left="360"/>
+        <w:jc w:val="both"/>
+        <w:rPr>
+          <w:rFonts w:ascii="Aptos" w:hAnsi="Aptos"/>
+          <w:lang w:val="es-MX" w:eastAsia="zh-CN"/>
+        </w:rPr>
+      </w:pPr>
+    </w:p>
+    <w:p>
+      <w:pPr>
+        <w:ind w:left="360"/>
+        <w:jc w:val="both"/>
+        <w:rPr>
+          <w:rFonts w:ascii="Aptos" w:hAnsi="Aptos"/>
+          <w:lang w:val="es-MX" w:eastAsia="zh-CN"/>
+        </w:rPr>
+      </w:pPr>
+      <w:r>
+        <w:rPr>
+          <w:rFonts w:ascii="Aptos" w:hAnsi="Aptos"/>
+          <w:b/>
+          <w:bCs/>
+          <w:lang w:val="es-MX" w:eastAsia="zh-CN"/>
+        </w:rPr>
+        <w:t>Sprint 2 (Semanas 3-4): Desarrollo del Portafolio Visual.</w:t>
+      </w:r>
+      <w:r>
+        <w:rPr>
+          <w:rFonts w:ascii="Aptos" w:hAnsi="Aptos"/>
+          <w:lang w:val="es-MX" w:eastAsia="zh-CN"/>
+        </w:rPr>
+        <w:t xml:space="preserve"> Implementación de galería en formato </w:t>
+      </w:r>
+      <w:proofErr w:type="spellStart"/>
+      <w:r>
+        <w:rPr>
+          <w:rFonts w:ascii="Aptos" w:hAnsi="Aptos"/>
+          <w:lang w:val="es-MX" w:eastAsia="zh-CN"/>
+        </w:rPr>
+        <w:t>grid</w:t>
+      </w:r>
+      <w:proofErr w:type="spellEnd"/>
+      <w:r>
+        <w:rPr>
+          <w:rFonts w:ascii="Aptos" w:hAnsi="Aptos"/>
+          <w:lang w:val="es-MX" w:eastAsia="zh-CN"/>
+        </w:rPr>
+        <w:t>, integración de renders optimizados, incorporación de efectos visuales (</w:t>
+      </w:r>
+      <w:proofErr w:type="spellStart"/>
+      <w:r>
+        <w:rPr>
+          <w:rFonts w:ascii="Aptos" w:hAnsi="Aptos"/>
+          <w:lang w:val="es-MX" w:eastAsia="zh-CN"/>
+        </w:rPr>
+        <w:t>hover</w:t>
+      </w:r>
+      <w:proofErr w:type="spellEnd"/>
+      <w:r>
+        <w:rPr>
+          <w:rFonts w:ascii="Aptos" w:hAnsi="Aptos"/>
+          <w:lang w:val="es-MX" w:eastAsia="zh-CN"/>
+        </w:rPr>
+        <w:t xml:space="preserve"> y visualización ampliada), ajustes de diseño responsivo. Entregable: galería funcional y visualmente estructurada.</w:t>
+      </w:r>
+    </w:p>
+    <w:p>
+      <w:pPr>
+        <w:ind w:left="360"/>
+        <w:jc w:val="both"/>
+        <w:rPr>
+          <w:rFonts w:ascii="Aptos" w:hAnsi="Aptos"/>
+          <w:lang w:val="es-MX" w:eastAsia="zh-CN"/>
+        </w:rPr>
+      </w:pPr>
+    </w:p>
+    <w:p>
+      <w:pPr>
+        <w:ind w:left="360"/>
+        <w:jc w:val="both"/>
+        <w:rPr>
+          <w:rFonts w:ascii="Aptos" w:hAnsi="Aptos"/>
+          <w:lang w:val="es-MX" w:eastAsia="zh-CN"/>
+        </w:rPr>
+      </w:pPr>
+      <w:r>
+        <w:rPr>
+          <w:rFonts w:ascii="Aptos" w:hAnsi="Aptos"/>
+          <w:b/>
+          <w:bCs/>
+          <w:lang w:val="es-MX" w:eastAsia="zh-CN"/>
+        </w:rPr>
+        <w:t>Sprint 3 (Semanas 5-6): Catálogo de Servicios.</w:t>
+      </w:r>
+      <w:r>
+        <w:rPr>
+          <w:rFonts w:ascii="Aptos" w:hAnsi="Aptos"/>
+          <w:lang w:val="es-MX" w:eastAsia="zh-CN"/>
+        </w:rPr>
+        <w:t xml:space="preserve"> Diseño de sección tipo tarjetas informativas, redacción e integración de descripciones de servicios, mejora de jerarquía visual, ajustes de UX. Entregable: sección de servicios clara y organizada.</w:t>
+      </w:r>
+    </w:p>
+    <w:p>
+      <w:pPr>
+        <w:ind w:left="360"/>
+        <w:jc w:val="both"/>
+        <w:rPr>
+          <w:rFonts w:ascii="Aptos" w:hAnsi="Aptos"/>
+          <w:lang w:val="es-MX" w:eastAsia="zh-CN"/>
+        </w:rPr>
+      </w:pPr>
+    </w:p>
+    <w:p>
+      <w:pPr>
+        <w:ind w:left="360"/>
+        <w:jc w:val="both"/>
+        <w:rPr>
+          <w:rFonts w:ascii="Aptos" w:hAnsi="Aptos"/>
+          <w:lang w:val="es-MX" w:eastAsia="zh-CN"/>
+        </w:rPr>
+      </w:pPr>
+      <w:r>
+        <w:rPr>
+          <w:rFonts w:ascii="Aptos" w:hAnsi="Aptos"/>
+          <w:b/>
+          <w:bCs/>
+          <w:lang w:val="es-MX" w:eastAsia="zh-CN"/>
+        </w:rPr>
+        <w:t>Sprint 4 (Semanas 7-8): Sistema de Contacto y Cierre.</w:t>
+      </w:r>
+      <w:r>
+        <w:rPr>
+          <w:rFonts w:ascii="Aptos" w:hAnsi="Aptos"/>
+          <w:lang w:val="es-MX" w:eastAsia="zh-CN"/>
+        </w:rPr>
+        <w:t xml:space="preserve"> Desarrollo de sección de contacto, pruebas funcionales y corrección de errores, optimización final y despliegue en Hostinger VPS con </w:t>
+      </w:r>
+      <w:proofErr w:type="spellStart"/>
+      <w:r>
+        <w:rPr>
+          <w:rFonts w:ascii="Aptos" w:hAnsi="Aptos"/>
+          <w:lang w:val="es-MX" w:eastAsia="zh-CN"/>
+        </w:rPr>
+        <w:t>Nginx</w:t>
+      </w:r>
+      <w:proofErr w:type="spellEnd"/>
+      <w:r>
+        <w:rPr>
+          <w:rFonts w:ascii="Aptos" w:hAnsi="Aptos"/>
+          <w:lang w:val="es-MX" w:eastAsia="zh-CN"/>
+        </w:rPr>
+        <w:t xml:space="preserve"> y Flask + </w:t>
+      </w:r>
+      <w:proofErr w:type="spellStart"/>
+      <w:r>
+        <w:rPr>
+          <w:rFonts w:ascii="Aptos" w:hAnsi="Aptos"/>
+          <w:lang w:val="es-MX" w:eastAsia="zh-CN"/>
+        </w:rPr>
+        <w:t>Gunicorn</w:t>
+      </w:r>
+      <w:proofErr w:type="spellEnd"/>
+      <w:r>
+        <w:rPr>
+          <w:rFonts w:ascii="Aptos" w:hAnsi="Aptos"/>
+          <w:lang w:val="es-MX" w:eastAsia="zh-CN"/>
+        </w:rPr>
+        <w:t>. Entregable: sistema completo, funcional y publicado.</w:t>
+      </w:r>
+    </w:p>
+    <w:p>
+      <w:pPr>
+        <w:ind w:left="360"/>
+        <w:rPr>
+          <w:lang w:val="es-MX" w:eastAsia="zh-CN"/>
+        </w:rPr>
+      </w:pPr>
+    </w:p>
+    <w:p>
+      <w:pPr>
+        <w:rPr>
+          <w:lang w:val="es-MX" w:eastAsia="zh-CN"/>
+        </w:rPr>
+      </w:pPr>
+    </w:p>
+    <w:bookmarkStart w:id="27" w:name="_Toc229479485"/>
+    <w:p>
+      <w:pPr>
+        <w:pStyle w:val="Ttulo0"/>
+        <w:numPr>
+          <w:ilvl w:val="0"/>
+          <w:numId w:val="20"/>
+        </w:numPr>
+        <w:jc w:val="both"/>
+        <w:outlineLvl w:val="0"/>
+        <w:rPr>
+          <w:rFonts w:ascii="Aptos" w:hAnsi="Aptos"/>
+          <w:color w:val="FFFFFF" w:themeColor="background1"/>
         </w:rPr>
       </w:pPr>
       <w:r>
@@ -8502,13 +8833,13 @@
         <mc:AlternateContent>
           <mc:Choice Requires="wps">
             <w:drawing>
-              <wp:anchor distT="0" distB="0" distL="114300" distR="114300" simplePos="0" relativeHeight="251672576" behindDoc="1" locked="0" layoutInCell="1" allowOverlap="1" wp14:anchorId="7E57F6DF" wp14:editId="5EB672F4">
+              <wp:anchor distT="0" distB="0" distL="114300" distR="114300" simplePos="0" relativeHeight="251658247" behindDoc="1" locked="0" layoutInCell="1" allowOverlap="1" wp14:anchorId="7E57F6DF" wp14:editId="4A1C0402">
                 <wp:simplePos x="0" y="0"/>
                 <wp:positionH relativeFrom="column">
-                  <wp:posOffset>-1109133</wp:posOffset>
+                  <wp:posOffset>-1109345</wp:posOffset>
                 </wp:positionH>
                 <wp:positionV relativeFrom="paragraph">
-                  <wp:posOffset>321310</wp:posOffset>
+                  <wp:posOffset>-39582</wp:posOffset>
                 </wp:positionV>
                 <wp:extent cx="6604000" cy="367030"/>
                 <wp:effectExtent l="0" t="0" r="6350" b="0"/>
@@ -8573,42 +8904,13 @@
               </wp:anchor>
             </w:drawing>
           </mc:Choice>
-          <mc:Fallback>
+          <mc:Fallback xmlns:arto="http://schemas.microsoft.com/office/word/2006/arto" xmlns:a="http://schemas.openxmlformats.org/drawingml/2006/main">
             <w:pict>
-              <v:roundrect w14:anchorId="4972F3B5" id="Rectángulo: esquinas redondeadas 1" o:spid="_x0000_s1026" style="position:absolute;margin-left:-87.35pt;margin-top:25.3pt;width:520pt;height:28.9pt;z-index:-251643904;visibility:visible;mso-wrap-style:square;mso-width-percent:0;mso-height-percent:0;mso-wrap-distance-left:9pt;mso-wrap-distance-top:0;mso-wrap-distance-right:9pt;mso-wrap-distance-bottom:0;mso-position-horizontal:absolute;mso-position-horizontal-relative:text;mso-position-vertical:absolute;mso-position-vertical-relative:text;mso-width-percent:0;mso-height-percent:0;mso-width-relative:margin;mso-height-relative:margin;v-text-anchor:middle" arcsize=".5" o:gfxdata="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" fillcolor="#272727 [2749]" stroked="f" strokeweight="2pt"/>
+              <v:roundrect id="Rectángulo: esquinas redondeadas 1" style="position:absolute;margin-left:-87.35pt;margin-top:-3.1pt;width:520pt;height:28.9pt;z-index:-251658233;visibility:visible;mso-wrap-style:square;mso-width-percent:0;mso-height-percent:0;mso-wrap-distance-left:9pt;mso-wrap-distance-top:0;mso-wrap-distance-right:9pt;mso-wrap-distance-bottom:0;mso-position-horizontal:absolute;mso-position-horizontal-relative:text;mso-position-vertical:absolute;mso-position-vertical-relative:text;mso-width-percent:0;mso-height-percent:0;mso-width-relative:margin;mso-height-relative:margin;v-text-anchor:middle" o:spid="_x0000_s1026" fillcolor="#272727 [2749]" stroked="f" strokeweight="2pt" arcsize=".5" w14:anchorId="0244A6F0" o:gfxdata="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"/>
             </w:pict>
           </mc:Fallback>
         </mc:AlternateContent>
       </w:r>
-      <w:r>
-        <w:rPr>
-          <w:lang w:val="es-MX" w:eastAsia="zh-CN"/>
-        </w:rPr>
-        <w:t>--</w:t>
-      </w:r>
-    </w:p>
-    <w:p>
-      <w:pPr>
-        <w:rPr>
-          <w:lang w:val="es-MX" w:eastAsia="zh-CN"/>
-        </w:rPr>
-      </w:pPr>
-    </w:p>
-    <w:p>
-      <w:pPr>
-        <w:pStyle w:val="Ttulo0"/>
-        <w:numPr>
-          <w:ilvl w:val="0"/>
-          <w:numId w:val="20"/>
-        </w:numPr>
-        <w:jc w:val="both"/>
-        <w:outlineLvl w:val="0"/>
-        <w:rPr>
-          <w:rFonts w:ascii="Aptos" w:hAnsi="Aptos"/>
-          <w:color w:val="FFFFFF" w:themeColor="background1"/>
-        </w:rPr>
-      </w:pPr>
-      <w:bookmarkStart w:id="27" w:name="_Toc229479485"/>
       <w:r>
         <w:rPr>
           <w:rFonts w:ascii="Aptos" w:hAnsi="Aptos"/>
@@ -8664,7 +8966,7 @@
         <mc:AlternateContent>
           <mc:Choice Requires="wps">
             <w:drawing>
-              <wp:anchor distT="0" distB="0" distL="114300" distR="114300" simplePos="0" relativeHeight="251674624" behindDoc="1" locked="0" layoutInCell="1" allowOverlap="1" wp14:anchorId="055FB8D0" wp14:editId="562A9B5D">
+              <wp:anchor distT="0" distB="0" distL="114300" distR="114300" simplePos="0" relativeHeight="251658248" behindDoc="1" locked="0" layoutInCell="1" allowOverlap="1" wp14:anchorId="055FB8D0" wp14:editId="562A9B5D">
                 <wp:simplePos x="0" y="0"/>
                 <wp:positionH relativeFrom="column">
                   <wp:posOffset>-1100667</wp:posOffset>
@@ -8735,9 +9037,9 @@
               </wp:anchor>
             </w:drawing>
           </mc:Choice>
-          <mc:Fallback>
+          <mc:Fallback xmlns:arto="http://schemas.microsoft.com/office/word/2006/arto" xmlns:a="http://schemas.openxmlformats.org/drawingml/2006/main">
             <w:pict>
-              <v:roundrect w14:anchorId="4ECB31C5" id="Rectángulo: esquinas redondeadas 1" o:spid="_x0000_s1026" style="position:absolute;margin-left:-86.65pt;margin-top:16.45pt;width:372.65pt;height:28.9pt;z-index:-251641856;visibility:visible;mso-wrap-style:square;mso-width-percent:0;mso-height-percent:0;mso-wrap-distance-left:9pt;mso-wrap-distance-top:0;mso-wrap-distance-right:9pt;mso-wrap-distance-bottom:0;mso-position-horizontal:absolute;mso-position-horizontal-relative:text;mso-position-vertical:absolute;mso-position-vertical-relative:text;mso-width-percent:0;mso-height-percent:0;mso-width-relative:margin;mso-height-relative:margin;v-text-anchor:middle" arcsize=".5" o:gfxdata="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" fillcolor="#272727 [2749]" stroked="f" strokeweight="2pt"/>
+              <v:roundrect id="Rectángulo: esquinas redondeadas 1" style="position:absolute;margin-left:-86.65pt;margin-top:16.45pt;width:372.65pt;height:28.9pt;z-index:-251641856;visibility:visible;mso-wrap-style:square;mso-width-percent:0;mso-height-percent:0;mso-wrap-distance-left:9pt;mso-wrap-distance-top:0;mso-wrap-distance-right:9pt;mso-wrap-distance-bottom:0;mso-position-horizontal:absolute;mso-position-horizontal-relative:text;mso-position-vertical:absolute;mso-position-vertical-relative:text;mso-width-percent:0;mso-height-percent:0;mso-width-relative:margin;mso-height-relative:margin;v-text-anchor:middle" o:spid="_x0000_s1026" fillcolor="#272727 [2749]" stroked="f" strokeweight="2pt" arcsize=".5" w14:anchorId="4ECB31C5" o:gfxdata="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"/>
             </w:pict>
           </mc:Fallback>
         </mc:AlternateContent>
@@ -8920,7 +9222,7 @@
         <mc:AlternateContent>
           <mc:Choice Requires="wps">
             <w:drawing>
-              <wp:anchor distT="0" distB="0" distL="114300" distR="114300" simplePos="0" relativeHeight="251676672" behindDoc="1" locked="0" layoutInCell="1" allowOverlap="1" wp14:anchorId="1DF694CD" wp14:editId="7109ABEF">
+              <wp:anchor distT="0" distB="0" distL="114300" distR="114300" simplePos="0" relativeHeight="251658249" behindDoc="1" locked="0" layoutInCell="1" allowOverlap="1" wp14:anchorId="1DF694CD" wp14:editId="7109ABEF">
                 <wp:simplePos x="0" y="0"/>
                 <wp:positionH relativeFrom="column">
                   <wp:posOffset>-1244601</wp:posOffset>
@@ -8991,9 +9293,9 @@
               </wp:anchor>
             </w:drawing>
           </mc:Choice>
-          <mc:Fallback>
+          <mc:Fallback xmlns:arto="http://schemas.microsoft.com/office/word/2006/arto" xmlns:a="http://schemas.openxmlformats.org/drawingml/2006/main">
             <w:pict>
-              <v:roundrect w14:anchorId="3F97C9DB" id="Rectángulo: esquinas redondeadas 1" o:spid="_x0000_s1026" style="position:absolute;margin-left:-98pt;margin-top:26.85pt;width:433.35pt;height:28.9pt;z-index:-251639808;visibility:visible;mso-wrap-style:square;mso-width-percent:0;mso-height-percent:0;mso-wrap-distance-left:9pt;mso-wrap-distance-top:0;mso-wrap-distance-right:9pt;mso-wrap-distance-bottom:0;mso-position-horizontal:absolute;mso-position-horizontal-relative:text;mso-position-vertical:absolute;mso-position-vertical-relative:text;mso-width-percent:0;mso-height-percent:0;mso-width-relative:margin;mso-height-relative:margin;v-text-anchor:middle" arcsize=".5" o:gfxdata="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" fillcolor="#272727 [2749]" stroked="f" strokeweight="2pt"/>
+              <v:roundrect id="Rectángulo: esquinas redondeadas 1" style="position:absolute;margin-left:-98pt;margin-top:26.85pt;width:433.35pt;height:28.9pt;z-index:-251639808;visibility:visible;mso-wrap-style:square;mso-width-percent:0;mso-height-percent:0;mso-wrap-distance-left:9pt;mso-wrap-distance-top:0;mso-wrap-distance-right:9pt;mso-wrap-distance-bottom:0;mso-position-horizontal:absolute;mso-position-horizontal-relative:text;mso-position-vertical:absolute;mso-position-vertical-relative:text;mso-width-percent:0;mso-height-percent:0;mso-width-relative:margin;mso-height-relative:margin;v-text-anchor:middle" o:spid="_x0000_s1026" fillcolor="#272727 [2749]" stroked="f" strokeweight="2pt" arcsize=".5" w14:anchorId="3F97C9DB" o:gfxdata="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"/>
             </w:pict>
           </mc:Fallback>
         </mc:AlternateContent>
@@ -9068,7 +9370,6 @@
           <w:rFonts w:ascii="Aptos" w:hAnsi="Aptos"/>
           <w:lang w:val="es-MX"/>
         </w:rPr>
-        <w:lastRenderedPageBreak/>
         <w:t>…</w:t>
       </w:r>
     </w:p>
@@ -9233,7 +9534,7 @@
         <mc:AlternateContent>
           <mc:Choice Requires="wps">
             <w:drawing>
-              <wp:anchor distT="0" distB="0" distL="114300" distR="114300" simplePos="0" relativeHeight="251678720" behindDoc="1" locked="0" layoutInCell="1" allowOverlap="1" wp14:anchorId="1B21B668" wp14:editId="02A6898E">
+              <wp:anchor distT="0" distB="0" distL="114300" distR="114300" simplePos="0" relativeHeight="251658250" behindDoc="1" locked="0" layoutInCell="1" allowOverlap="1" wp14:anchorId="1B21B668" wp14:editId="02A6898E">
                 <wp:simplePos x="0" y="0"/>
                 <wp:positionH relativeFrom="column">
                   <wp:posOffset>-1168400</wp:posOffset>
@@ -9304,9 +9605,9 @@
               </wp:anchor>
             </w:drawing>
           </mc:Choice>
-          <mc:Fallback>
+          <mc:Fallback xmlns:arto="http://schemas.microsoft.com/office/word/2006/arto" xmlns:a="http://schemas.openxmlformats.org/drawingml/2006/main">
             <w:pict>
-              <v:roundrect w14:anchorId="26313A47" id="Rectángulo: esquinas redondeadas 1" o:spid="_x0000_s1026" style="position:absolute;margin-left:-92pt;margin-top:12.55pt;width:475.95pt;height:28.9pt;z-index:-251637760;visibility:visible;mso-wrap-style:square;mso-width-percent:0;mso-height-percent:0;mso-wrap-distance-left:9pt;mso-wrap-distance-top:0;mso-wrap-distance-right:9pt;mso-wrap-distance-bottom:0;mso-position-horizontal:absolute;mso-position-horizontal-relative:text;mso-position-vertical:absolute;mso-position-vertical-relative:text;mso-width-percent:0;mso-height-percent:0;mso-width-relative:margin;mso-height-relative:margin;v-text-anchor:middle" arcsize=".5" o:gfxdata="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" fillcolor="#272727 [2749]" stroked="f" strokeweight="2pt"/>
+              <v:roundrect id="Rectángulo: esquinas redondeadas 1" style="position:absolute;margin-left:-92pt;margin-top:12.55pt;width:475.95pt;height:28.9pt;z-index:-251637760;visibility:visible;mso-wrap-style:square;mso-width-percent:0;mso-height-percent:0;mso-wrap-distance-left:9pt;mso-wrap-distance-top:0;mso-wrap-distance-right:9pt;mso-wrap-distance-bottom:0;mso-position-horizontal:absolute;mso-position-horizontal-relative:text;mso-position-vertical:absolute;mso-position-vertical-relative:text;mso-width-percent:0;mso-height-percent:0;mso-width-relative:margin;mso-height-relative:margin;v-text-anchor:middle" o:spid="_x0000_s1026" fillcolor="#272727 [2749]" stroked="f" strokeweight="2pt" arcsize=".5" w14:anchorId="26313A47" o:gfxdata="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"/>
             </w:pict>
           </mc:Fallback>
         </mc:AlternateContent>
@@ -9360,6 +9661,22 @@
           <w:lang w:val="es-MX"/>
         </w:rPr>
       </w:pPr>
+    </w:p>
+    <w:bookmarkStart w:id="38" w:name="_Toc229479496"/>
+    <w:p>
+      <w:pPr>
+        <w:pStyle w:val="Ttulo0"/>
+        <w:numPr>
+          <w:ilvl w:val="0"/>
+          <w:numId w:val="20"/>
+        </w:numPr>
+        <w:jc w:val="both"/>
+        <w:outlineLvl w:val="0"/>
+        <w:rPr>
+          <w:rFonts w:ascii="Aptos" w:hAnsi="Aptos"/>
+          <w:color w:val="FFFFFF" w:themeColor="background1"/>
+        </w:rPr>
+      </w:pPr>
       <w:r>
         <w:rPr>
           <w:noProof/>
@@ -9368,13 +9685,13 @@
         <mc:AlternateContent>
           <mc:Choice Requires="wps">
             <w:drawing>
-              <wp:anchor distT="0" distB="0" distL="114300" distR="114300" simplePos="0" relativeHeight="251680768" behindDoc="1" locked="0" layoutInCell="1" allowOverlap="1" wp14:anchorId="50BE0FD3" wp14:editId="2C3CEDBD">
+              <wp:anchor distT="0" distB="0" distL="114300" distR="114300" simplePos="0" relativeHeight="251658251" behindDoc="1" locked="0" layoutInCell="1" allowOverlap="1" wp14:anchorId="50BE0FD3" wp14:editId="59C397E9">
                 <wp:simplePos x="0" y="0"/>
                 <wp:positionH relativeFrom="column">
                   <wp:posOffset>-1397000</wp:posOffset>
                 </wp:positionH>
                 <wp:positionV relativeFrom="paragraph">
-                  <wp:posOffset>170392</wp:posOffset>
+                  <wp:posOffset>-42968</wp:posOffset>
                 </wp:positionV>
                 <wp:extent cx="5562600" cy="367030"/>
                 <wp:effectExtent l="0" t="0" r="0" b="0"/>
@@ -9439,29 +9756,13 @@
               </wp:anchor>
             </w:drawing>
           </mc:Choice>
-          <mc:Fallback>
+          <mc:Fallback xmlns:arto="http://schemas.microsoft.com/office/word/2006/arto" xmlns:a="http://schemas.openxmlformats.org/drawingml/2006/main">
             <w:pict>
-              <v:roundrect w14:anchorId="4FD3A68F" id="Rectángulo: esquinas redondeadas 1" o:spid="_x0000_s1026" style="position:absolute;margin-left:-110pt;margin-top:13.4pt;width:438pt;height:28.9pt;z-index:-251635712;visibility:visible;mso-wrap-style:square;mso-width-percent:0;mso-height-percent:0;mso-wrap-distance-left:9pt;mso-wrap-distance-top:0;mso-wrap-distance-right:9pt;mso-wrap-distance-bottom:0;mso-position-horizontal:absolute;mso-position-horizontal-relative:text;mso-position-vertical:absolute;mso-position-vertical-relative:text;mso-width-percent:0;mso-height-percent:0;mso-width-relative:margin;mso-height-relative:margin;v-text-anchor:middle" arcsize=".5" o:gfxdata="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" fillcolor="#272727 [2749]" stroked="f" strokeweight="2pt"/>
+              <v:roundrect id="Rectángulo: esquinas redondeadas 1" style="position:absolute;margin-left:-110pt;margin-top:-3.4pt;width:438pt;height:28.9pt;z-index:-251658229;visibility:visible;mso-wrap-style:square;mso-width-percent:0;mso-height-percent:0;mso-wrap-distance-left:9pt;mso-wrap-distance-top:0;mso-wrap-distance-right:9pt;mso-wrap-distance-bottom:0;mso-position-horizontal:absolute;mso-position-horizontal-relative:text;mso-position-vertical:absolute;mso-position-vertical-relative:text;mso-width-percent:0;mso-height-percent:0;mso-width-relative:margin;mso-height-relative:margin;v-text-anchor:middle" o:spid="_x0000_s1026" fillcolor="#272727 [2749]" stroked="f" strokeweight="2pt" arcsize=".5" w14:anchorId="4C6799BE" o:gfxdata="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"/>
             </w:pict>
           </mc:Fallback>
         </mc:AlternateContent>
       </w:r>
-    </w:p>
-    <w:p>
-      <w:pPr>
-        <w:pStyle w:val="Ttulo0"/>
-        <w:numPr>
-          <w:ilvl w:val="0"/>
-          <w:numId w:val="20"/>
-        </w:numPr>
-        <w:jc w:val="both"/>
-        <w:outlineLvl w:val="0"/>
-        <w:rPr>
-          <w:rFonts w:ascii="Aptos" w:hAnsi="Aptos"/>
-          <w:color w:val="FFFFFF" w:themeColor="background1"/>
-        </w:rPr>
-      </w:pPr>
-      <w:bookmarkStart w:id="38" w:name="_Toc229479496"/>
       <w:r>
         <w:rPr>
           <w:rFonts w:ascii="Aptos" w:hAnsi="Aptos"/>
@@ -9503,7 +9804,7 @@
         <mc:AlternateContent>
           <mc:Choice Requires="wps">
             <w:drawing>
-              <wp:anchor distT="0" distB="0" distL="114300" distR="114300" simplePos="0" relativeHeight="251682816" behindDoc="1" locked="0" layoutInCell="1" allowOverlap="1" wp14:anchorId="052EA7AA" wp14:editId="519BF7A3">
+              <wp:anchor distT="0" distB="0" distL="114300" distR="114300" simplePos="0" relativeHeight="251658252" behindDoc="1" locked="0" layoutInCell="1" allowOverlap="1" wp14:anchorId="052EA7AA" wp14:editId="519BF7A3">
                 <wp:simplePos x="0" y="0"/>
                 <wp:positionH relativeFrom="column">
                   <wp:posOffset>-1116753</wp:posOffset>
@@ -9574,9 +9875,9 @@
               </wp:anchor>
             </w:drawing>
           </mc:Choice>
-          <mc:Fallback>
+          <mc:Fallback xmlns:arto="http://schemas.microsoft.com/office/word/2006/arto" xmlns:a="http://schemas.openxmlformats.org/drawingml/2006/main">
             <w:pict>
-              <v:roundrect w14:anchorId="616175EC" id="Rectángulo: esquinas redondeadas 1" o:spid="_x0000_s1026" style="position:absolute;margin-left:-87.95pt;margin-top:11.95pt;width:417.3pt;height:28.9pt;z-index:-251633664;visibility:visible;mso-wrap-style:square;mso-width-percent:0;mso-height-percent:0;mso-wrap-distance-left:9pt;mso-wrap-distance-top:0;mso-wrap-distance-right:9pt;mso-wrap-distance-bottom:0;mso-position-horizontal:absolute;mso-position-horizontal-relative:text;mso-position-vertical:absolute;mso-position-vertical-relative:text;mso-width-percent:0;mso-height-percent:0;mso-width-relative:margin;mso-height-relative:margin;v-text-anchor:middle" arcsize=".5" o:gfxdata="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" fillcolor="#272727 [2749]" stroked="f" strokeweight="2pt"/>
+              <v:roundrect id="Rectángulo: esquinas redondeadas 1" style="position:absolute;margin-left:-87.95pt;margin-top:11.95pt;width:417.3pt;height:28.9pt;z-index:-251633664;visibility:visible;mso-wrap-style:square;mso-width-percent:0;mso-height-percent:0;mso-wrap-distance-left:9pt;mso-wrap-distance-top:0;mso-wrap-distance-right:9pt;mso-wrap-distance-bottom:0;mso-position-horizontal:absolute;mso-position-horizontal-relative:text;mso-position-vertical:absolute;mso-position-vertical-relative:text;mso-width-percent:0;mso-height-percent:0;mso-width-relative:margin;mso-height-relative:margin;v-text-anchor:middle" o:spid="_x0000_s1026" fillcolor="#272727 [2749]" stroked="f" strokeweight="2pt" arcsize=".5" w14:anchorId="616175EC" o:gfxdata="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"/>
             </w:pict>
           </mc:Fallback>
         </mc:AlternateContent>
@@ -9638,7 +9939,7 @@
         <mc:AlternateContent>
           <mc:Choice Requires="wps">
             <w:drawing>
-              <wp:anchor distT="0" distB="0" distL="114300" distR="114300" simplePos="0" relativeHeight="251684864" behindDoc="1" locked="0" layoutInCell="1" allowOverlap="1" wp14:anchorId="5D284E90" wp14:editId="2E495C88">
+              <wp:anchor distT="0" distB="0" distL="114300" distR="114300" simplePos="0" relativeHeight="251658253" behindDoc="1" locked="0" layoutInCell="1" allowOverlap="1" wp14:anchorId="5D284E90" wp14:editId="2E495C88">
                 <wp:simplePos x="0" y="0"/>
                 <wp:positionH relativeFrom="column">
                   <wp:posOffset>-1685078</wp:posOffset>
@@ -9709,9 +10010,9 @@
               </wp:anchor>
             </w:drawing>
           </mc:Choice>
-          <mc:Fallback>
+          <mc:Fallback xmlns:arto="http://schemas.microsoft.com/office/word/2006/arto" xmlns:a="http://schemas.openxmlformats.org/drawingml/2006/main">
             <w:pict>
-              <v:roundrect w14:anchorId="0FA47FDE" id="Rectángulo: esquinas redondeadas 1" o:spid="_x0000_s1026" style="position:absolute;margin-left:-132.7pt;margin-top:28pt;width:417.3pt;height:28.9pt;z-index:-251631616;visibility:visible;mso-wrap-style:square;mso-width-percent:0;mso-height-percent:0;mso-wrap-distance-left:9pt;mso-wrap-distance-top:0;mso-wrap-distance-right:9pt;mso-wrap-distance-bottom:0;mso-position-horizontal:absolute;mso-position-horizontal-relative:text;mso-position-vertical:absolute;mso-position-vertical-relative:text;mso-width-percent:0;mso-height-percent:0;mso-width-relative:margin;mso-height-relative:margin;v-text-anchor:middle" arcsize=".5" o:gfxdata="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" fillcolor="#272727 [2749]" stroked="f" strokeweight="2pt"/>
+              <v:roundrect id="Rectángulo: esquinas redondeadas 1" style="position:absolute;margin-left:-132.7pt;margin-top:28pt;width:417.3pt;height:28.9pt;z-index:-251631616;visibility:visible;mso-wrap-style:square;mso-width-percent:0;mso-height-percent:0;mso-wrap-distance-left:9pt;mso-wrap-distance-top:0;mso-wrap-distance-right:9pt;mso-wrap-distance-bottom:0;mso-position-horizontal:absolute;mso-position-horizontal-relative:text;mso-position-vertical:absolute;mso-position-vertical-relative:text;mso-width-percent:0;mso-height-percent:0;mso-width-relative:margin;mso-height-relative:margin;v-text-anchor:middle" o:spid="_x0000_s1026" fillcolor="#272727 [2749]" stroked="f" strokeweight="2pt" arcsize=".5" w14:anchorId="0FA47FDE" o:gfxdata="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"/>
             </w:pict>
           </mc:Fallback>
         </mc:AlternateContent>
@@ -9917,7 +10218,6 @@
         <w:rPr>
           <w:lang w:val="es-MX" w:eastAsia="zh-CN"/>
         </w:rPr>
-        <w:lastRenderedPageBreak/>
         <w:t>--</w:t>
       </w:r>
     </w:p>
@@ -9953,7 +10253,7 @@
         <mc:AlternateContent>
           <mc:Choice Requires="wps">
             <w:drawing>
-              <wp:anchor distT="0" distB="0" distL="114300" distR="114300" simplePos="0" relativeHeight="251686912" behindDoc="1" locked="0" layoutInCell="1" allowOverlap="1" wp14:anchorId="4F431C2B" wp14:editId="38675FF2">
+              <wp:anchor distT="0" distB="0" distL="114300" distR="114300" simplePos="0" relativeHeight="251658254" behindDoc="1" locked="0" layoutInCell="1" allowOverlap="1" wp14:anchorId="4F431C2B" wp14:editId="38675FF2">
                 <wp:simplePos x="0" y="0"/>
                 <wp:positionH relativeFrom="column">
                   <wp:posOffset>-1769533</wp:posOffset>
@@ -10024,9 +10324,9 @@
               </wp:anchor>
             </w:drawing>
           </mc:Choice>
-          <mc:Fallback>
+          <mc:Fallback xmlns:arto="http://schemas.microsoft.com/office/word/2006/arto" xmlns:a="http://schemas.openxmlformats.org/drawingml/2006/main">
             <w:pict>
-              <v:roundrect w14:anchorId="769F9ACF" id="Rectángulo: esquinas redondeadas 1" o:spid="_x0000_s1026" style="position:absolute;margin-left:-139.35pt;margin-top:-3.35pt;width:400.65pt;height:28.9pt;z-index:-251629568;visibility:visible;mso-wrap-style:square;mso-width-percent:0;mso-height-percent:0;mso-wrap-distance-left:9pt;mso-wrap-distance-top:0;mso-wrap-distance-right:9pt;mso-wrap-distance-bottom:0;mso-position-horizontal:absolute;mso-position-horizontal-relative:text;mso-position-vertical:absolute;mso-position-vertical-relative:text;mso-width-percent:0;mso-height-percent:0;mso-width-relative:margin;mso-height-relative:margin;v-text-anchor:middle" arcsize=".5" o:gfxdata="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" fillcolor="#272727 [2749]" stroked="f" strokeweight="2pt"/>
+              <v:roundrect id="Rectángulo: esquinas redondeadas 1" style="position:absolute;margin-left:-139.35pt;margin-top:-3.35pt;width:400.65pt;height:28.9pt;z-index:-251629568;visibility:visible;mso-wrap-style:square;mso-width-percent:0;mso-height-percent:0;mso-wrap-distance-left:9pt;mso-wrap-distance-top:0;mso-wrap-distance-right:9pt;mso-wrap-distance-bottom:0;mso-position-horizontal:absolute;mso-position-horizontal-relative:text;mso-position-vertical:absolute;mso-position-vertical-relative:text;mso-width-percent:0;mso-height-percent:0;mso-width-relative:margin;mso-height-relative:margin;v-text-anchor:middle" o:spid="_x0000_s1026" fillcolor="#272727 [2749]" stroked="f" strokeweight="2pt" arcsize=".5" w14:anchorId="769F9ACF" o:gfxdata="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"/>
             </w:pict>
           </mc:Fallback>
         </mc:AlternateContent>
@@ -10102,7 +10402,7 @@
         <mc:AlternateContent>
           <mc:Choice Requires="wps">
             <w:drawing>
-              <wp:anchor distT="0" distB="0" distL="114300" distR="114300" simplePos="0" relativeHeight="251688960" behindDoc="1" locked="0" layoutInCell="1" allowOverlap="1" wp14:anchorId="7E2C8943" wp14:editId="4EB09EBB">
+              <wp:anchor distT="0" distB="0" distL="114300" distR="114300" simplePos="0" relativeHeight="251658255" behindDoc="1" locked="0" layoutInCell="1" allowOverlap="1" wp14:anchorId="7E2C8943" wp14:editId="4EB09EBB">
                 <wp:simplePos x="0" y="0"/>
                 <wp:positionH relativeFrom="column">
                   <wp:posOffset>-2633980</wp:posOffset>
@@ -10173,9 +10473,9 @@
               </wp:anchor>
             </w:drawing>
           </mc:Choice>
-          <mc:Fallback>
+          <mc:Fallback xmlns:arto="http://schemas.microsoft.com/office/word/2006/arto" xmlns:a="http://schemas.openxmlformats.org/drawingml/2006/main">
             <w:pict>
-              <v:roundrect w14:anchorId="3120418F" id="Rectángulo: esquinas redondeadas 1" o:spid="_x0000_s1026" style="position:absolute;margin-left:-207.4pt;margin-top:28.05pt;width:417.3pt;height:28.9pt;z-index:-251627520;visibility:visible;mso-wrap-style:square;mso-width-percent:0;mso-height-percent:0;mso-wrap-distance-left:9pt;mso-wrap-distance-top:0;mso-wrap-distance-right:9pt;mso-wrap-distance-bottom:0;mso-position-horizontal:absolute;mso-position-horizontal-relative:text;mso-position-vertical:absolute;mso-position-vertical-relative:text;mso-width-percent:0;mso-height-percent:0;mso-width-relative:margin;mso-height-relative:margin;v-text-anchor:middle" arcsize=".5" o:gfxdata="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" fillcolor="#272727 [2749]" stroked="f" strokeweight="2pt"/>
+              <v:roundrect id="Rectángulo: esquinas redondeadas 1" style="position:absolute;margin-left:-207.4pt;margin-top:28.05pt;width:417.3pt;height:28.9pt;z-index:-251627520;visibility:visible;mso-wrap-style:square;mso-width-percent:0;mso-height-percent:0;mso-wrap-distance-left:9pt;mso-wrap-distance-top:0;mso-wrap-distance-right:9pt;mso-wrap-distance-bottom:0;mso-position-horizontal:absolute;mso-position-horizontal-relative:text;mso-position-vertical:absolute;mso-position-vertical-relative:text;mso-width-percent:0;mso-height-percent:0;mso-width-relative:margin;mso-height-relative:margin;v-text-anchor:middle" o:spid="_x0000_s1026" fillcolor="#272727 [2749]" stroked="f" strokeweight="2pt" arcsize=".5" w14:anchorId="3120418F" o:gfxdata="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"/>
             </w:pict>
           </mc:Fallback>
         </mc:AlternateContent>
@@ -10295,7 +10595,6 @@
         <w:docPartUnique/>
       </w:docPartObj>
     </w:sdtPr>
-    <w:sdtEndPr/>
     <w:sdtContent>
       <w:p>
         <w:pPr>
@@ -10341,7 +10640,6 @@
         <w:docPartUnique/>
       </w:docPartObj>
     </w:sdtPr>
-    <w:sdtEndPr/>
     <w:sdtContent>
       <w:p>
         <w:pPr>
@@ -15186,7 +15484,7 @@
   <w:style w:type="paragraph" w:default="1" w:styleId="Normal">
     <w:name w:val="Normal"/>
     <w:qFormat/>
-    <w:rsid w:val="006C61A0"/>
+    <w:rsid w:val="008E1752"/>
   </w:style>
   <w:style w:type="paragraph" w:styleId="Ttulo1">
     <w:name w:val="heading 1"/>
@@ -15628,6 +15926,19 @@
       <w:szCs w:val="28"/>
     </w:rPr>
   </w:style>
+  <w:style w:type="paragraph" w:styleId="NormalWeb">
+    <w:name w:val="Normal (Web)"/>
+    <w:basedOn w:val="Normal"/>
+    <w:uiPriority w:val="99"/>
+    <w:semiHidden/>
+    <w:unhideWhenUsed/>
+    <w:rsid w:val="00CD1563"/>
+    <w:rPr>
+      <w:rFonts w:ascii="Times New Roman" w:hAnsi="Times New Roman" w:cs="Times New Roman"/>
+      <w:sz w:val="24"/>
+      <w:szCs w:val="24"/>
+    </w:rPr>
+  </w:style>
 </w:styles>
 </file>
 

</xml_diff>